<commit_message>
TCC: referência de Okabe, Brittes e Brito (2025) nas três versões
A obra citada como Okabe et al. (2025) entra na lista de referências
(manuscrito CND-25-1354 submetido ao Journal of Computational and
Nonlinear Dynamics) e a citação passa a nomear os três autores.

Co-Authored-By: Claude Opus 5.5 <noreply@anthropic.com>
Claude-Session: https://claude.ai/code/session_011EXBtMgMjcpkiJ44sLq9TW
</commit_message>
<xml_diff>
--- a/tcc/TCC_modelo_FT.docx
+++ b/tcc/TCC_modelo_FT.docx
@@ -3620,7 +3620,7 @@
         <w:t xml:space="preserve">O mapeamento da curva torque × ângulo gerada pelo mecanismo permite alinhar o perfil de suporte elástico à curva anatômica de carga do braço, otimizando a entrega de torque nas posições de maior exigência </w:t>
       </w:r>
       <w:r>
-        <w:t xml:space="preserve">(Ning et al., 2022; Okabe et al., 2025)</w:t>
+        <w:t xml:space="preserve">(Ning et al., 2022; Okabe; Brittes; Brito, 2025)</w:t>
       </w:r>
       <w:r>
         <w:t xml:space="preserve">. </w:t>
@@ -63718,6 +63718,24 @@
       </w:hyperlink>
       <w:r>
         <w:t xml:space="preserve">.</w:t>
+      </w:r>
+    </w:p>
+    <w:p>
+      <w:pPr>
+        <w:pStyle w:val="Referencia"/>
+      </w:pPr>
+      <w:r>
+        <w:t xml:space="preserve">Okabe, E. P.; Brittes, J. L. P.; Brito, P. L. A. Modeling and simulation of an upper limb exoskeleton. </w:t>
+      </w:r>
+      <w:r>
+        <w:rPr>
+          <w:b/>
+          <w:bCs/>
+        </w:rPr>
+        <w:t xml:space="preserve">Journal of Computational and Nonlinear Dynamics</w:t>
+      </w:r>
+      <w:r>
+        <w:t xml:space="preserve">, [S.l.], 2025. Manuscrito CND-25-1354, submetido para publicação.</w:t>
       </w:r>
     </w:p>
     <w:p>

</xml_diff>

<commit_message>
TCC: reescreve a seção 2.3, atualiza Okabe, acrescenta Zeiaee, data e resumo
- Seção 2.3: lista de Arakelian sem travessões, "frequentemente" no lugar
  de "quase sempre", EP 3 504 033 B1 num parágrafo próprio e as escalas
  descritas como no restante do texto (abscissa em graus nas duas
  patentes, ordenada sem unidade na US e sem valores na EP).
- Okabe, Brittes e Brito publicado: J. Comput. Nonlinear Dynam., v. 21,
  n. 7, art. 071006, jul. 2026; a citação da seção 2.4 passa a 2026.
- Zeiaee et al. (2017), ICORR, acrescentado à lista; as duas citações do
  capítulo 2 passam a ter referência.
- Data da defesa: 18/11/2026.
- Resumo e abstract redigidos a partir das conclusões, com palavras-chave;
  o gerador da versão Word lê os parágrafos do resumo.tex.

Co-Authored-By: Claude Opus 5.5 <noreply@anthropic.com>
Claude-Session: https://claude.ai/code/session_011EXBtMgMjcpkiJ44sLq9TW
</commit_message>
<xml_diff>
--- a/tcc/TCC_modelo_FT.docx
+++ b/tcc/TCC_modelo_FT.docx
@@ -25,7 +25,7 @@
                     <pic:cNvPicPr/>
                   </pic:nvPicPr>
                   <pic:blipFill>
-                    <a:blip r:embed="rId74"/>
+                    <a:blip r:embed="rId75"/>
                     <a:stretch>
                       <a:fillRect/>
                     </a:stretch>
@@ -229,7 +229,17 @@
         <w:jc w:val="both"/>
       </w:pPr>
       <w:r>
-        <w:t xml:space="preserve">Resumo a redigir (no máximo 500 palavras, em uma única página).</w:t>
+        <w:t xml:space="preserve">Exoesqueletos passivos de apoio ao braço são empregados no trabalho com os braços elevados, associado a distúrbios do ombro, e o auxílio que entregam depende apenas da geometria do mecanismo e da mola. As patentes que descrevem os modelos comerciais detalham o mecanismo, mas não informam massa, inércia nem rigidez. Este trabalho reconstrói, a partir da documentação de patente, dois mecanismos de arquitetura distinta e formula modelos estáticos do torque que eles entregam em função do ângulo de elevação, confrontando-o com o torque gravitacional do braço: o gerador de torque de mola, cabo e polia da US 9.889.554 B2 e o dispositivo da EP 3 504 033 B1, em que um elemento elástico atua diretamente sobre uma alavanca solidária ao braço. A geometria foi reconstruída em CAD, a cinemática foi resolvida em forma fechada, e cada etapa do cálculo, implementado em Python, foi conferida por verificações independentes, entre elas o princípio dos trabalhos virtuais, que mostrou, na US 9.889.554 B2, que a extensão da mola deve acompanhar o caminho completo do cabo. Com os parâmetros não publicados identificados por mínimos quadrados, o modelo do primeiro mecanismo reproduz a forma da curva publicada com coeficiente de determinação de 0,99839 e raiz do erro quadrático médio de 1,24% do maior valor extraído, e o pico do torque do cabo, a 97,5° de elevação, fica 8,05° acima do pico gravitacional, de 11,16 N·m a 89,4°. Como a ordenada da curva não tem unidade declarada, o modelo determina a forma do torque, mas não sua escala física. Na EP 3 504 033 B1, o espaçamento entre as três curvas de pré-tensão publicadas determina os comprimentos de referência do elástico, de 300,91 mm, 287,19 mm e 275,59 mm, sem depender da escala da ordenada nem da rigidez. A forma prevista com a geometria do CAD, contudo, não reproduz as curvas da patente, e a rigidez não é identificável pela figura; sob a hipótese de assistência de 40% do torque do peso em 90°, o pico do torque é de 4,354 N·m em 78,8°. Nos dois dispositivos, o pico de assistência fica afastado do pico gravitacional, acima dele no primeiro e abaixo no segundo. A comparação entre os dois fica, assim, respondida quanto aos ângulos e à forma dos perfis, mas não quanto à magnitude. As etapas dinâmicas, pela formulação de Lagrange e no MBDyn, dependem de um dado independente que fixe a escala do torque e não foram executadas.</w:t>
+      </w:r>
+    </w:p>
+    <w:p>
+      <w:pPr>
+        <w:pStyle w:val="PreTexto"/>
+        <w:spacing w:before="240"/>
+        <w:jc w:val="both"/>
+      </w:pPr>
+      <w:r>
+        <w:t xml:space="preserve">Palavras-chave: exoesqueleto passivo; compensação de gravidade; ombro; patentes; identificação de parâmetros.</w:t>
       </w:r>
     </w:p>
     <w:p>
@@ -261,7 +271,17 @@
         <w:jc w:val="both"/>
       </w:pPr>
       <w:r>
-        <w:t xml:space="preserve">Abstract to be written (at most 500 words, on a single page).</w:t>
+        <w:t xml:space="preserve">Passive arm-support exoskeletons are used in work with raised arms, which is associated with shoulder disorders, and the assistance they deliver depends only on the geometry of the mechanism and on the spring. The patents that describe the commercial models detail the mechanism but do not report mass, inertia or stiffness. This work reconstructs, from patent documentation, two mechanisms of different architecture and formulates static models of the torque they deliver as a function of the elevation angle, comparing it with the gravitational torque of the arm: the spring, cable and pulley torque generator of US 9,889,554 B2 and the device of EP 3 504 033 B1, in which an elastic element acts directly on a lever attached to the arm. The geometry was reconstructed in CAD, the kinematics was solved in closed form, and each step of the calculation, implemented in Python, was checked by independent verifications, among them the principle of virtual work, which showed, for US 9,889,554 B2, that the spring extension must follow the complete cable path. With the unpublished parameters identified by least squares, the model of the first mechanism reproduces the shape of the published curve with a coefficient of determination of 0.99839 and a root mean square error of 1.24% of the largest extracted value, and the peak of the cable torque, at 97.5° of elevation, lies 8.05° above the gravitational peak of 11.16 N·m at 89.4°. Since the ordinate of the curve has no declared unit, the model determines the shape of the torque but not its physical scale. For EP 3 504 033 B1, the spacing between the three published pretension curves determines the reference lengths of the elastic element, 300.91 mm, 287.19 mm and 275.59 mm, without depending on the ordinate scale or on the stiffness. The shape predicted with the CAD geometry, however, does not reproduce the patent curves, and the stiffness cannot be identified from the figure; under the assumption of assistance equal to 40% of the weight torque at 90°, the torque peak is 4.354 N·m at 78.8°. In both devices, the assistance peak is set apart from the gravitational peak, above it in the first and below it in the second. The comparison between the two is thus answered regarding the angles and the shape of the profiles, but not regarding magnitude. The dynamic steps, through the Lagrange formulation and in MBDyn, depend on independent data that fix the torque scale and were not carried out.</w:t>
+      </w:r>
+    </w:p>
+    <w:p>
+      <w:pPr>
+        <w:pStyle w:val="PreTexto"/>
+        <w:spacing w:before="240"/>
+        <w:jc w:val="both"/>
+      </w:pPr>
+      <w:r>
+        <w:t xml:space="preserve">Keywords: passive exoskeleton; gravity compensation; shoulder; patents; parameter identification.</w:t>
       </w:r>
     </w:p>
     <w:p>
@@ -3532,19 +3552,19 @@
         <w:pStyle w:val="SemRecuo"/>
       </w:pPr>
       <w:r>
-        <w:t xml:space="preserve">A compensação de gravidade constitui problema clássico da síntese de mecanismos. </w:t>
+        <w:t xml:space="preserve">A compensação de gravidade é problema clássico da síntese de mecanismos. </w:t>
       </w:r>
       <w:r>
         <w:t xml:space="preserve">Arakelian (2016)</w:t>
       </w:r>
       <w:r>
-        <w:t xml:space="preserve"> sistematiza as soluções em três grupos, definidos pela natureza da força compensadora — contrapesos, molas ou força ativa proveniente de atuador auxiliar —, e </w:t>
+        <w:t xml:space="preserve"> sistematiza as soluções em três grupos, conforme a natureza da força compensadora: contrapesos, molas ou força ativa de um atuador auxiliar. </w:t>
       </w:r>
       <w:r>
         <w:t xml:space="preserve">Nguyen (2026)</w:t>
       </w:r>
       <w:r>
-        <w:t xml:space="preserve"> atualiza o panorama das alternativas estritamente passivas e de seus limites de aplicação. Em exoesqueletos vestíveis, a inviabilidade do contrapeso impõe o predomínio da solução elástica, quase sempre associada a cabos, polias ou cames encarregados de moldar a curva de torque; nessa linha, </w:t>
+        <w:t xml:space="preserve"> atualiza o panorama das alternativas estritamente passivas e de seus limites de aplicação. Em exoesqueletos vestíveis, o contrapeso é inviável, e predomina a solução elástica, frequentemente associada a cabos, polias ou cames que moldam a curva de torque; nessa linha, </w:t>
       </w:r>
       <w:r>
         <w:t xml:space="preserve">Ning et al. (2022)</w:t>
@@ -3561,7 +3581,7 @@
         <w:t xml:space="preserve">(van Engelhoven; Kazerooni, 2018)</w:t>
       </w:r>
       <w:r>
-        <w:t xml:space="preserve"> descreve arranjo dessa natureza: um elo proximal, solidário a uma base fixada ao tronco, articula-se com um elo distal que acompanha o braço, e um gerador de força de tração, constituído por mola e cabo tensionado sobre uma polia, produz o torque de apoio. Abaixo de um ângulo de transição (</w:t>
+        <w:t xml:space="preserve"> descreve um arranjo desse tipo: um elo proximal, solidário a uma base fixada ao tronco, articula-se com um elo distal que acompanha o braço, e um gerador de força de tração, formado por mola e cabo tensionado sobre uma polia, produz o torque de apoio. Abaixo de um ângulo de transição (</w:t>
       </w:r>
       <w:r>
         <w:rPr>
@@ -3571,29 +3591,29 @@
         <w:t xml:space="preserve">toggle angle</w:t>
       </w:r>
       <w:r>
-        <w:t xml:space="preserve">), uma protuberância situada junto à junta restringe a mola, de modo que o torque decai a valor residual e o membro recupera liberdade de movimento. A patente EP 3 504 033 B1 </w:t>
-      </w:r>
-      <w:r>
-        <w:t xml:space="preserve">(Ottobock, 2023)</w:t>
-      </w:r>
-      <w:r>
-        <w:t xml:space="preserve">, por sua vez, endereça o mesmo problema por caminho construtivo distinto, transmitindo a força de um atuador passivo por meio de elemento rígido apoiado na pelve.</w:t>
+        <w:t xml:space="preserve">), uma protuberância junto à junta restringe o gerador de força, o torque cai a um valor residual e o braço recupera a liberdade de movimento.</w:t>
       </w:r>
     </w:p>
     <w:p>
       <w:r>
-        <w:t xml:space="preserve">Em ambos os documentos, contudo, as figuras exibem apenas a forma dos perfis de torque, desprovidas de escala nos eixos, o que inviabiliza o aproveitamento direto dos dados publicados e motiva a reconstrução geométrica adotada neste trabalho.</w:t>
+        <w:t xml:space="preserve">A patente EP 3 504 033 B1 </w:t>
+      </w:r>
+      <w:r>
+        <w:t xml:space="preserve">(Ottobock, 2023)</w:t>
+      </w:r>
+      <w:r>
+        <w:t xml:space="preserve"> trata o mesmo problema por outro caminho construtivo: a força de um atuador passivo é transmitida por um elemento rígido apoiado na pelve, e o elemento elástico atua diretamente sobre uma alavanca solidária ao braço, sem o arranjo de cabo e polia. A faixa sem torque com o braço baixado também não depende de uma protuberância: a partir de um ângulo ajustável, o elástico passa a se apoiar num elemento de encosto junto à articulação; com esse elemento sobre o eixo de rotação, as forças dos dois trechos do elástico passam pelo eixo e não produzem torque, embora o elástico continue tracionado </w:t>
+      </w:r>
+      <w:r>
+        <w:t xml:space="preserve">(Ottobock, 2023)</w:t>
+      </w:r>
+      <w:r>
+        <w:t xml:space="preserve">.</w:t>
       </w:r>
     </w:p>
     <w:p>
       <w:r>
-        <w:t xml:space="preserve">Na EP 3 504 033 B1, a faixa sem torque com o braço baixado não depende de um batente. O elemento elástico passa a encostar, a partir de um ângulo ajustável, num elemento de encosto situado junto à articulação; com esse elemento sobre o eixo de rotação, as forças dos dois trechos do elástico passam pelo eixo e não produzem torque, embora o elástico continue tracionado </w:t>
-      </w:r>
-      <w:r>
-        <w:t xml:space="preserve">(Ottobock, 2023)</w:t>
-      </w:r>
-      <w:r>
-        <w:t xml:space="preserve">. Nessa patente, diferentemente do que se disse acima para os dois documentos, a abscissa das curvas publicadas tem escala em graus; só a ordenada é desprovida de escala.</w:t>
+        <w:t xml:space="preserve">Nenhum dos dois documentos, contudo, permite quantificar o torque: as curvas publicadas têm a abscissa em graus, mas a ordenada não tem unidade declarada na US 9.889.554 B2 e não tem sequer valores na EP 3 504 033 B1. Isso inviabiliza o aproveitamento direto dos dados publicados e motiva a reconstrução geométrica adotada neste trabalho.</w:t>
       </w:r>
     </w:p>
     <w:p>
@@ -3620,7 +3640,7 @@
         <w:t xml:space="preserve">O mapeamento da curva torque × ângulo gerada pelo mecanismo permite alinhar o perfil de suporte elástico à curva anatômica de carga do braço, otimizando a entrega de torque nas posições de maior exigência </w:t>
       </w:r>
       <w:r>
-        <w:t xml:space="preserve">(Okabe; Brittes; Brito, 2025)</w:t>
+        <w:t xml:space="preserve">(Okabe; Brittes; Brito, 2026)</w:t>
       </w:r>
       <w:r>
         <w:t xml:space="preserve">. </w:t>
@@ -63735,7 +63755,7 @@
         <w:t xml:space="preserve">Journal of Computational and Nonlinear Dynamics</w:t>
       </w:r>
       <w:r>
-        <w:t xml:space="preserve">, [S.l.], 2025. Manuscrito CND-25-1354, submetido para publicação.</w:t>
+        <w:t xml:space="preserve">, [S.l.], v. 21, n. 7, art. 071006, jul. 2026.</w:t>
       </w:r>
     </w:p>
     <w:p>
@@ -64177,9 +64197,40 @@
         <w:t xml:space="preserve">.</w:t>
       </w:r>
     </w:p>
+    <w:p>
+      <w:pPr>
+        <w:pStyle w:val="Referencia"/>
+      </w:pPr>
+      <w:r>
+        <w:t xml:space="preserve">Zeiaee, A. et al. Design and kinematic analysis of a novel upper limb exoskeleton for rehabilitation of stroke patients. In: INTERNATIONAL CONFERENCE ON REHABILITATION ROBOTICS (ICORR), 2017, Londres. </w:t>
+      </w:r>
+      <w:r>
+        <w:rPr>
+          <w:b/>
+          <w:bCs/>
+        </w:rPr>
+        <w:t xml:space="preserve">Proceedings</w:t>
+      </w:r>
+      <w:r>
+        <w:t xml:space="preserve"> [...]. [S.l.]: IEEE, 2017. p. 759-764. DOI: </w:t>
+      </w:r>
+      <w:hyperlink r:id="rId74" w:history="1">
+        <w:r>
+          <w:rPr>
+            <w:rFonts w:ascii="Linux Libertine Mono O" w:hAnsi="Linux Libertine Mono O" w:cs="Linux Libertine Mono O"/>
+            <w:sz w:val="21"/>
+            <w:szCs w:val="21"/>
+          </w:rPr>
+          <w:t xml:space="preserve">10.1109/ICORR.2017.8009339</w:t>
+        </w:r>
+      </w:hyperlink>
+      <w:r>
+        <w:t xml:space="preserve">.</w:t>
+      </w:r>
+    </w:p>
     <w:sectPr>
-      <w:headerReference w:type="default" r:id="rId75"/>
-      <w:headerReference w:type="first" r:id="rId76"/>
+      <w:headerReference w:type="default" r:id="rId76"/>
+      <w:headerReference w:type="first" r:id="rId77"/>
       <w:pgSz w:w="11906" w:h="16838"/>
       <w:pgMar w:top="1583" w:right="1134" w:bottom="1134" w:left="1701" w:header="892" w:footer="567" w:gutter="0"/>
       <w:cols w:space="708"/>

</xml_diff>

<commit_message>
TCC: retira as frases de Ning et al. e confirma a FCA
- Saem a frase de Ning et al. (2023) da seção 2.2 e a de Ning et al.
  (2022) da seção 2.3; sem os artigos, não havia como conferir o que lhes
  era atribuído. As duas referências saem da lista (47 entradas).
- gerar_tcc_fundido.py ganha a lista REMOVIDOS, para blocos do original
  retirados; verificar_fusao.py confere que eles não aparecem no fundido
  e que seus autores não são mais citados.
- Unidade (FCA) e banca (FCA/UNICAMP) confirmadas: saem as marcas
  COMPLETAR do tese.tex. Sem ficha catalográfica.

Co-Authored-By: Claude Opus 5.5 <noreply@anthropic.com>
Claude-Session: https://claude.ai/code/session_011EXBtMgMjcpkiJ44sLq9TW
</commit_message>
<xml_diff>
--- a/tcc/TCC_modelo_FT.docx
+++ b/tcc/TCC_modelo_FT.docx
@@ -25,7 +25,7 @@
                     <pic:cNvPicPr/>
                   </pic:nvPicPr>
                   <pic:blipFill>
-                    <a:blip r:embed="rId75"/>
+                    <a:blip r:embed="rId73"/>
                     <a:stretch>
                       <a:fillRect/>
                     </a:stretch>
@@ -1464,7 +1464,7 @@
           <w:tab/>
         </w:r>
         <w:r>
-          <w:t xml:space="preserve">16</w:t>
+          <w:t xml:space="preserve">15</w:t>
         </w:r>
       </w:hyperlink>
     </w:p>
@@ -1486,7 +1486,7 @@
           <w:tab/>
         </w:r>
         <w:r>
-          <w:t xml:space="preserve">17</w:t>
+          <w:t xml:space="preserve">16</w:t>
         </w:r>
       </w:hyperlink>
     </w:p>
@@ -1552,7 +1552,7 @@
           <w:tab/>
         </w:r>
         <w:r>
-          <w:t xml:space="preserve">19</w:t>
+          <w:t xml:space="preserve">18</w:t>
         </w:r>
       </w:hyperlink>
     </w:p>
@@ -1574,7 +1574,7 @@
           <w:tab/>
         </w:r>
         <w:r>
-          <w:t xml:space="preserve">20</w:t>
+          <w:t xml:space="preserve">19</w:t>
         </w:r>
       </w:hyperlink>
     </w:p>
@@ -1640,7 +1640,7 @@
           <w:tab/>
         </w:r>
         <w:r>
-          <w:t xml:space="preserve">22</w:t>
+          <w:t xml:space="preserve">21</w:t>
         </w:r>
       </w:hyperlink>
     </w:p>
@@ -3510,13 +3510,7 @@
     </w:p>
     <w:p>
       <w:r>
-        <w:t xml:space="preserve">Entre os passivos destinados ao levantamento de cargas, </w:t>
-      </w:r>
-      <w:r>
-        <w:t xml:space="preserve">Ning et al. (2023)</w:t>
-      </w:r>
-      <w:r>
-        <w:t xml:space="preserve"> organizam a estrutura em módulos de braço, ombro e costas e dimensionam o conjunto a partir da tração da mola. Os efeitos documentados pela literatura experimental apresentam direção consistente, porém magnitude variável: a meta-análise de </w:t>
+        <w:t xml:space="preserve">Os efeitos documentados pela literatura experimental apresentam direção consistente, porém magnitude variável: a meta-análise de </w:t>
       </w:r>
       <w:r>
         <w:t xml:space="preserve">Bär et al. (2021)</w:t>
@@ -3564,13 +3558,7 @@
         <w:t xml:space="preserve">Nguyen (2026)</w:t>
       </w:r>
       <w:r>
-        <w:t xml:space="preserve"> atualiza o panorama das alternativas estritamente passivas e de seus limites de aplicação. Em exoesqueletos vestíveis, o contrapeso é inviável, e predomina a solução elástica, frequentemente associada a cabos, polias ou cames que moldam a curva de torque; nessa linha, </w:t>
-      </w:r>
-      <w:r>
-        <w:t xml:space="preserve">Ning et al. (2022)</w:t>
-      </w:r>
-      <w:r>
-        <w:t xml:space="preserve"> projetam o perfil da came a partir do módulo de armazenamento de energia da mola e validam o resultado por eletromiografia.</w:t>
+        <w:t xml:space="preserve"> atualiza o panorama das alternativas estritamente passivas e de seus limites de aplicação. Em exoesqueletos vestíveis, o contrapeso é inviável, e predomina a solução elástica, frequentemente associada a cabos, polias ou cames que moldam a curva de torque.</w:t>
       </w:r>
     </w:p>
     <w:p>
@@ -63652,68 +63640,6 @@
         <w:pStyle w:val="Referencia"/>
       </w:pPr>
       <w:r>
-        <w:t xml:space="preserve">Ning, Y. et al. Design and analysis of upper limb passive exoskeleton robot for lift assist. </w:t>
-      </w:r>
-      <w:r>
-        <w:rPr>
-          <w:b/>
-          <w:bCs/>
-        </w:rPr>
-        <w:t xml:space="preserve">Journal of Physics: Conference Series</w:t>
-      </w:r>
-      <w:r>
-        <w:t xml:space="preserve">, [S.l.], v. 2410, art. 012020, 2022. DOI: </w:t>
-      </w:r>
-      <w:hyperlink r:id="rId58" w:history="1">
-        <w:r>
-          <w:rPr>
-            <w:rFonts w:ascii="Linux Libertine Mono O" w:hAnsi="Linux Libertine Mono O" w:cs="Linux Libertine Mono O"/>
-            <w:sz w:val="21"/>
-            <w:szCs w:val="21"/>
-          </w:rPr>
-          <w:t xml:space="preserve">10.​1088/​1742-​6596/​2410/​1/​012020</w:t>
-        </w:r>
-      </w:hyperlink>
-      <w:r>
-        <w:t xml:space="preserve">.</w:t>
-      </w:r>
-    </w:p>
-    <w:p>
-      <w:pPr>
-        <w:pStyle w:val="Referencia"/>
-      </w:pPr>
-      <w:r>
-        <w:t xml:space="preserve">Ning, Y. et al. Structure design and analysis of upper limb wearable passive power-assisted exoskeleton robot. </w:t>
-      </w:r>
-      <w:r>
-        <w:rPr>
-          <w:b/>
-          <w:bCs/>
-        </w:rPr>
-        <w:t xml:space="preserve">Journal of Physics: Conference Series</w:t>
-      </w:r>
-      <w:r>
-        <w:t xml:space="preserve">, [S.l.], v. 2489, art. 012008, 2023. DOI: </w:t>
-      </w:r>
-      <w:hyperlink r:id="rId59" w:history="1">
-        <w:r>
-          <w:rPr>
-            <w:rFonts w:ascii="Linux Libertine Mono O" w:hAnsi="Linux Libertine Mono O" w:cs="Linux Libertine Mono O"/>
-            <w:sz w:val="21"/>
-            <w:szCs w:val="21"/>
-          </w:rPr>
-          <w:t xml:space="preserve">10.​1088/​1742-​6596/​2489/​1/​012008</w:t>
-        </w:r>
-      </w:hyperlink>
-      <w:r>
-        <w:t xml:space="preserve">.</w:t>
-      </w:r>
-    </w:p>
-    <w:p>
-      <w:pPr>
-        <w:pStyle w:val="Referencia"/>
-      </w:pPr>
-      <w:r>
         <w:t xml:space="preserve">Obukhov, A. et al. Development of a system for recognising and classifying motor activity to control an upper-limb exoskeleton. </w:t>
       </w:r>
       <w:r>
@@ -63726,7 +63652,7 @@
       <w:r>
         <w:t xml:space="preserve">, [S.l.], v. 8, n. 4, art. 114, 2025. DOI: </w:t>
       </w:r>
-      <w:hyperlink r:id="rId60" w:history="1">
+      <w:hyperlink r:id="rId58" w:history="1">
         <w:r>
           <w:rPr>
             <w:rFonts w:ascii="Linux Libertine Mono O" w:hAnsi="Linux Libertine Mono O" w:cs="Linux Libertine Mono O"/>
@@ -63793,7 +63719,7 @@
       <w:r>
         <w:t xml:space="preserve">, [S.l.], v. 10, n. 1, art. 22, 2022. DOI: </w:t>
       </w:r>
-      <w:hyperlink r:id="rId61" w:history="1">
+      <w:hyperlink r:id="rId59" w:history="1">
         <w:r>
           <w:rPr>
             <w:rFonts w:ascii="Linux Libertine Mono O" w:hAnsi="Linux Libertine Mono O" w:cs="Linux Libertine Mono O"/>
@@ -63824,7 +63750,7 @@
       <w:r>
         <w:t xml:space="preserve">, [S.l.], v. 12, n. 4, p. 408-417, ago. 2007. DOI: </w:t>
       </w:r>
-      <w:hyperlink r:id="rId62" w:history="1">
+      <w:hyperlink r:id="rId60" w:history="1">
         <w:r>
           <w:rPr>
             <w:rFonts w:ascii="Linux Libertine Mono O" w:hAnsi="Linux Libertine Mono O" w:cs="Linux Libertine Mono O"/>
@@ -63855,7 +63781,7 @@
       <w:r>
         <w:t xml:space="preserve">, [S.l.], v. 33, n. 1, p. 19-39, 2015. DOI: </w:t>
       </w:r>
-      <w:hyperlink r:id="rId63" w:history="1">
+      <w:hyperlink r:id="rId61" w:history="1">
         <w:r>
           <w:rPr>
             <w:rFonts w:ascii="Linux Libertine Mono O" w:hAnsi="Linux Libertine Mono O" w:cs="Linux Libertine Mono O"/>
@@ -63886,7 +63812,7 @@
       <w:r>
         <w:t xml:space="preserve">, [S.l.], v. 5, n. 3, p. 516-527, ago. 2023. DOI: </w:t>
       </w:r>
-      <w:hyperlink r:id="rId64" w:history="1">
+      <w:hyperlink r:id="rId62" w:history="1">
         <w:r>
           <w:rPr>
             <w:rFonts w:ascii="Linux Libertine Mono O" w:hAnsi="Linux Libertine Mono O" w:cs="Linux Libertine Mono O"/>
@@ -63917,7 +63843,7 @@
       <w:r>
         <w:t xml:space="preserve">, [S.l.], v. 17, n. 4, art. 1243, 2020. DOI: </w:t>
       </w:r>
-      <w:hyperlink r:id="rId65" w:history="1">
+      <w:hyperlink r:id="rId63" w:history="1">
         <w:r>
           <w:rPr>
             <w:rFonts w:ascii="Linux Libertine Mono O" w:hAnsi="Linux Libertine Mono O" w:cs="Linux Libertine Mono O"/>
@@ -63948,7 +63874,7 @@
       <w:r>
         <w:t xml:space="preserve">: systems and applications. [S.l.]: Academic Press, 2020. p. 1-22. DOI: </w:t>
       </w:r>
-      <w:hyperlink r:id="rId66" w:history="1">
+      <w:hyperlink r:id="rId64" w:history="1">
         <w:r>
           <w:rPr>
             <w:rFonts w:ascii="Linux Libertine Mono O" w:hAnsi="Linux Libertine Mono O" w:cs="Linux Libertine Mono O"/>
@@ -63979,7 +63905,7 @@
       <w:r>
         <w:t xml:space="preserve">, [S.l.], v. 11, p. 1255-1262, 2017. DOI: </w:t>
       </w:r>
-      <w:hyperlink r:id="rId67" w:history="1">
+      <w:hyperlink r:id="rId65" w:history="1">
         <w:r>
           <w:rPr>
             <w:rFonts w:ascii="Linux Libertine Mono O" w:hAnsi="Linux Libertine Mono O" w:cs="Linux Libertine Mono O"/>
@@ -64010,7 +63936,7 @@
       <w:r>
         <w:t xml:space="preserve">. [S.l.], [202-]. Disponível em: </w:t>
       </w:r>
-      <w:hyperlink r:id="rId68" w:history="1">
+      <w:hyperlink r:id="rId66" w:history="1">
         <w:r>
           <w:rPr>
             <w:rFonts w:ascii="Linux Libertine Mono O" w:hAnsi="Linux Libertine Mono O" w:cs="Linux Libertine Mono O"/>
@@ -64041,7 +63967,7 @@
       <w:r>
         <w:t xml:space="preserve">, [S.l.], v. 74, n. 10, p. 745-755, 2017. DOI: </w:t>
       </w:r>
-      <w:hyperlink r:id="rId69" w:history="1">
+      <w:hyperlink r:id="rId67" w:history="1">
         <w:r>
           <w:rPr>
             <w:rFonts w:ascii="Linux Libertine Mono O" w:hAnsi="Linux Libertine Mono O" w:cs="Linux Libertine Mono O"/>
@@ -64090,7 +64016,7 @@
       <w:r>
         <w:t xml:space="preserve">, [S.l.], v. 17, n. 3, p. 261-272, 2020. DOI: </w:t>
       </w:r>
-      <w:hyperlink r:id="rId70" w:history="1">
+      <w:hyperlink r:id="rId68" w:history="1">
         <w:r>
           <w:rPr>
             <w:rFonts w:ascii="Linux Libertine Mono O" w:hAnsi="Linux Libertine Mono O" w:cs="Linux Libertine Mono O"/>
@@ -64121,7 +64047,7 @@
       <w:r>
         <w:t xml:space="preserve">, [S.l.], v. 27, n. 6, p. 4269-4280, dez. 2022. DOI: </w:t>
       </w:r>
-      <w:hyperlink r:id="rId71" w:history="1">
+      <w:hyperlink r:id="rId69" w:history="1">
         <w:r>
           <w:rPr>
             <w:rFonts w:ascii="Linux Libertine Mono O" w:hAnsi="Linux Libertine Mono O" w:cs="Linux Libertine Mono O"/>
@@ -64152,7 +64078,7 @@
       <w:r>
         <w:t xml:space="preserve">, [S.l.], v. 230, n. 20, p. 3777-3790, 2016. DOI: </w:t>
       </w:r>
-      <w:hyperlink r:id="rId72" w:history="1">
+      <w:hyperlink r:id="rId70" w:history="1">
         <w:r>
           <w:rPr>
             <w:rFonts w:ascii="Linux Libertine Mono O" w:hAnsi="Linux Libertine Mono O" w:cs="Linux Libertine Mono O"/>
@@ -64183,7 +64109,7 @@
       <w:r>
         <w:t xml:space="preserve">, [S.l.], v. 10, n. 12, art. 1223, 2022. DOI: </w:t>
       </w:r>
-      <w:hyperlink r:id="rId73" w:history="1">
+      <w:hyperlink r:id="rId71" w:history="1">
         <w:r>
           <w:rPr>
             <w:rFonts w:ascii="Linux Libertine Mono O" w:hAnsi="Linux Libertine Mono O" w:cs="Linux Libertine Mono O"/>
@@ -64214,7 +64140,7 @@
       <w:r>
         <w:t xml:space="preserve"> [...]. [S.l.]: IEEE, 2017. p. 759-764. DOI: </w:t>
       </w:r>
-      <w:hyperlink r:id="rId74" w:history="1">
+      <w:hyperlink r:id="rId72" w:history="1">
         <w:r>
           <w:rPr>
             <w:rFonts w:ascii="Linux Libertine Mono O" w:hAnsi="Linux Libertine Mono O" w:cs="Linux Libertine Mono O"/>
@@ -64229,8 +64155,8 @@
       </w:r>
     </w:p>
     <w:sectPr>
-      <w:headerReference w:type="default" r:id="rId76"/>
-      <w:headerReference w:type="first" r:id="rId77"/>
+      <w:headerReference w:type="default" r:id="rId74"/>
+      <w:headerReference w:type="first" r:id="rId75"/>
       <w:pgSz w:w="11906" w:h="16838"/>
       <w:pgMar w:top="1583" w:right="1134" w:bottom="1134" w:left="1701" w:header="892" w:footer="567" w:gutter="0"/>
       <w:cols w:space="708"/>

</xml_diff>

<commit_message>
TCC: rascunho dos agradecimentos e folha de aprovação com a banca
- agradecimentos.tex: rascunho, com os trechos pessoais entre colchetes.
- \folhadeaprovacaoantecipada (preambulo.tex): mostra a folha de
  aprovação, com a banca e a data da defesa, na versão entregue à banca,
  mantendo na folha de rosto o aviso de versão anterior à defesa.
- Versão Word: lê agradecimentos.tex e gera a folha de aprovação quando o
  comando está no tese.tex; linhas da banca alinhadas à esquerda.
- verificar_docx_modelo.py: as páginas iniciais do PDF vão até a Lista de
  Figuras, e não mais até a quinta página.

Co-Authored-By: Claude Opus 5.5 <noreply@anthropic.com>
Claude-Session: https://claude.ai/code/session_011EXBtMgMjcpkiJ44sLq9TW
</commit_message>
<xml_diff>
--- a/tcc/TCC_modelo_FT.docx
+++ b/tcc/TCC_modelo_FT.docx
@@ -192,12 +192,193 @@
     <w:p>
       <w:pPr>
         <w:pageBreakBefore/>
-        <w:spacing w:line="290" w:lineRule="exact"/>
+        <w:spacing w:line="600" w:lineRule="exact"/>
+        <w:ind w:firstLine="0"/>
+        <w:jc w:val="center"/>
+      </w:pPr>
+      <w:r>
+        <w:rPr>
+          <w:b/>
+          <w:bCs/>
+          <w:sz w:val="41"/>
+          <w:szCs w:val="41"/>
+        </w:rPr>
+        <w:t xml:space="preserve">Folha de Aprovação</w:t>
+      </w:r>
+    </w:p>
+    <w:p>
+      <w:pPr>
+        <w:spacing w:before="1134" w:line="290" w:lineRule="exact"/>
+        <w:ind w:firstLine="0"/>
+        <w:jc w:val="center"/>
+      </w:pPr>
+      <w:r>
+        <w:t xml:space="preserve">PEDRO LUÍS DE ALMEIDA BRITO</w:t>
+      </w:r>
+    </w:p>
+    <w:p>
+      <w:pPr>
+        <w:spacing w:before="1134" w:line="290" w:lineRule="exact"/>
         <w:ind w:firstLine="0"/>
         <w:jc w:val="both"/>
       </w:pPr>
       <w:r>
-        <w:t xml:space="preserve">Na versão final, esta página será substituída por outra informando a composição da banca e que a ata de defesa está arquivada pela Universidade Estadual de Campinas.</w:t>
+        <w:t xml:space="preserve">Monografia apresentada ao Curso de Graduação em Engenharia de Manufatura, defendida na data de 18/11/2026.</w:t>
+      </w:r>
+    </w:p>
+    <w:p>
+      <w:pPr>
+        <w:spacing w:before="720" w:line="290" w:lineRule="exact"/>
+        <w:ind w:firstLine="0"/>
+        <w:jc w:val="left"/>
+      </w:pPr>
+      <w:r>
+        <w:t xml:space="preserve">Composição da Comissão Examinadora:</w:t>
+      </w:r>
+    </w:p>
+    <w:p>
+      <w:pPr>
+        <w:spacing w:before="720" w:line="290" w:lineRule="exact"/>
+        <w:ind w:firstLine="0"/>
+        <w:jc w:val="left"/>
+      </w:pPr>
+      <w:r>
+        <w:t xml:space="preserve">Prof. Dr. Eduardo Paiva Okabe</w:t>
+      </w:r>
+      <w:r>
+        <w:br/>
+      </w:r>
+      <w:r>
+        <w:t xml:space="preserve">Presidente da Comissão Julgadora</w:t>
+      </w:r>
+    </w:p>
+    <w:p>
+      <w:pPr>
+        <w:spacing w:before="720" w:line="290" w:lineRule="exact"/>
+        <w:ind w:firstLine="0"/>
+        <w:jc w:val="left"/>
+      </w:pPr>
+      <w:r>
+        <w:t xml:space="preserve">Prof. Dr. José Luiz Pereira Brittes</w:t>
+      </w:r>
+      <w:r>
+        <w:br/>
+      </w:r>
+      <w:r>
+        <w:t xml:space="preserve">FCA/UNICAMP</w:t>
+      </w:r>
+    </w:p>
+    <w:p>
+      <w:pPr>
+        <w:spacing w:before="720" w:line="290" w:lineRule="exact"/>
+        <w:ind w:firstLine="0"/>
+        <w:jc w:val="left"/>
+      </w:pPr>
+      <w:r>
+        <w:t xml:space="preserve">Prof. Dr. Felipe Wenzel da Silva Tuckmantel</w:t>
+      </w:r>
+      <w:r>
+        <w:br/>
+      </w:r>
+      <w:r>
+        <w:t xml:space="preserve">FCA/UNICAMP</w:t>
+      </w:r>
+    </w:p>
+    <w:p>
+      <w:pPr>
+        <w:keepNext/>
+        <w:pageBreakBefore/>
+        <w:spacing w:line="924" w:lineRule="exact"/>
+        <w:ind w:firstLine="0"/>
+      </w:pPr>
+      <w:r>
+        <w:rPr>
+          <w:sz w:val="2"/>
+          <w:szCs w:val="2"/>
+        </w:rPr>
+        <w:t xml:space="preserve"> </w:t>
+      </w:r>
+    </w:p>
+    <w:p>
+      <w:pPr>
+        <w:pStyle w:val="TituloPreTextual"/>
+      </w:pPr>
+      <w:r>
+        <w:t xml:space="preserve">Agradecimentos</w:t>
+      </w:r>
+    </w:p>
+    <w:p>
+      <w:pPr>
+        <w:pStyle w:val="PreTexto"/>
+        <w:jc w:val="both"/>
+      </w:pPr>
+      <w:r>
+        <w:t xml:space="preserve">Agradeço à minha família, em especial a [nomes], pelo apoio e pela paciência ao longo de toda a graduação.</w:t>
+      </w:r>
+    </w:p>
+    <w:p>
+      <w:pPr>
+        <w:pStyle w:val="PreTexto"/>
+        <w:spacing w:before="120"/>
+        <w:ind w:firstLine="360"/>
+        <w:jc w:val="both"/>
+      </w:pPr>
+      <w:r>
+        <w:t xml:space="preserve">Ao meu orientador, Prof. Dr. Eduardo Paiva Okabe, pela orientação, pela confiança e pela disponibilidade durante o desenvolvimento deste trabalho, e pela parceria no artigo </w:t>
+      </w:r>
+      <w:r>
+        <w:rPr>
+          <w:i/>
+          <w:iCs/>
+        </w:rPr>
+        <w:t xml:space="preserve">Modeling and simulation of an upper limb exoskeleton</w:t>
+      </w:r>
+      <w:r>
+        <w:t xml:space="preserve">.</w:t>
+      </w:r>
+    </w:p>
+    <w:p>
+      <w:pPr>
+        <w:pStyle w:val="PreTexto"/>
+        <w:spacing w:before="120"/>
+        <w:ind w:firstLine="360"/>
+        <w:jc w:val="both"/>
+      </w:pPr>
+      <w:r>
+        <w:t xml:space="preserve">Ao Prof. Dr. José Luiz Pereira Brittes, também coautor desse artigo, e ao Prof. Dr. Felipe Wenzel da Silva Tuckmantel, por aceitarem o convite para compor a banca examinadora.</w:t>
+      </w:r>
+    </w:p>
+    <w:p>
+      <w:pPr>
+        <w:pStyle w:val="PreTexto"/>
+        <w:spacing w:before="120"/>
+        <w:ind w:firstLine="360"/>
+        <w:jc w:val="both"/>
+      </w:pPr>
+      <w:r>
+        <w:t xml:space="preserve">Aos professores e funcionários da Faculdade de Ciências Aplicadas da UNICAMP, pela formação recebida no curso de Engenharia de Manufatura.</w:t>
+      </w:r>
+    </w:p>
+    <w:p>
+      <w:pPr>
+        <w:pStyle w:val="PreTexto"/>
+        <w:spacing w:before="120"/>
+        <w:ind w:firstLine="360"/>
+        <w:jc w:val="both"/>
+      </w:pPr>
+      <w:r>
+        <w:t xml:space="preserve">Aos colegas e amigos [nomes], pela convivência e pelo companheirismo ao longo do curso.</w:t>
+      </w:r>
+    </w:p>
+    <w:p>
+      <w:pPr>
+        <w:pStyle w:val="PreTexto"/>
+        <w:spacing w:before="120"/>
+        <w:ind w:firstLine="360"/>
+        <w:jc w:val="both"/>
+      </w:pPr>
+      <w:r>
+        <w:t xml:space="preserve">Às comunidades que desenvolvem e mantêm o Python e as bibliotecas científicas livres usadas neste trabalho.</w:t>
       </w:r>
     </w:p>
     <w:p>
@@ -331,7 +512,7 @@
           <w:tab/>
         </w:r>
         <w:r>
-          <w:t xml:space="preserve">27</w:t>
+          <w:t xml:space="preserve">28</w:t>
         </w:r>
       </w:hyperlink>
     </w:p>
@@ -368,7 +549,7 @@
           <w:tab/>
         </w:r>
         <w:r>
-          <w:t xml:space="preserve">41</w:t>
+          <w:t xml:space="preserve">42</w:t>
         </w:r>
       </w:hyperlink>
     </w:p>
@@ -387,7 +568,7 @@
           <w:tab/>
         </w:r>
         <w:r>
-          <w:t xml:space="preserve">44</w:t>
+          <w:t xml:space="preserve">45</w:t>
         </w:r>
       </w:hyperlink>
     </w:p>
@@ -415,7 +596,7 @@
           <w:tab/>
         </w:r>
         <w:r>
-          <w:t xml:space="preserve">55</w:t>
+          <w:t xml:space="preserve">56</w:t>
         </w:r>
       </w:hyperlink>
     </w:p>
@@ -443,7 +624,7 @@
           <w:tab/>
         </w:r>
         <w:r>
-          <w:t xml:space="preserve">59</w:t>
+          <w:t xml:space="preserve">60</w:t>
         </w:r>
       </w:hyperlink>
     </w:p>
@@ -462,7 +643,7 @@
           <w:tab/>
         </w:r>
         <w:r>
-          <w:t xml:space="preserve">59</w:t>
+          <w:t xml:space="preserve">60</w:t>
         </w:r>
       </w:hyperlink>
     </w:p>
@@ -490,7 +671,7 @@
           <w:tab/>
         </w:r>
         <w:r>
-          <w:t xml:space="preserve">62</w:t>
+          <w:t xml:space="preserve">63</w:t>
         </w:r>
       </w:hyperlink>
     </w:p>
@@ -527,7 +708,7 @@
           <w:tab/>
         </w:r>
         <w:r>
-          <w:t xml:space="preserve">71</w:t>
+          <w:t xml:space="preserve">72</w:t>
         </w:r>
       </w:hyperlink>
     </w:p>
@@ -546,7 +727,7 @@
           <w:tab/>
         </w:r>
         <w:r>
-          <w:t xml:space="preserve">75</w:t>
+          <w:t xml:space="preserve">76</w:t>
         </w:r>
       </w:hyperlink>
     </w:p>
@@ -590,7 +771,7 @@
           <w:tab/>
         </w:r>
         <w:r>
-          <w:t xml:space="preserve">79</w:t>
+          <w:t xml:space="preserve">80</w:t>
         </w:r>
       </w:hyperlink>
     </w:p>
@@ -609,7 +790,7 @@
           <w:tab/>
         </w:r>
         <w:r>
-          <w:t xml:space="preserve">80</w:t>
+          <w:t xml:space="preserve">81</w:t>
         </w:r>
       </w:hyperlink>
     </w:p>
@@ -637,7 +818,7 @@
           <w:tab/>
         </w:r>
         <w:r>
-          <w:t xml:space="preserve">81</w:t>
+          <w:t xml:space="preserve">82</w:t>
         </w:r>
       </w:hyperlink>
       <w:r>
@@ -691,7 +872,7 @@
           <w:tab/>
         </w:r>
         <w:r>
-          <w:t xml:space="preserve">26</w:t>
+          <w:t xml:space="preserve">27</w:t>
         </w:r>
       </w:hyperlink>
     </w:p>
@@ -710,7 +891,7 @@
           <w:tab/>
         </w:r>
         <w:r>
-          <w:t xml:space="preserve">35</w:t>
+          <w:t xml:space="preserve">36</w:t>
         </w:r>
       </w:hyperlink>
     </w:p>
@@ -729,7 +910,7 @@
           <w:tab/>
         </w:r>
         <w:r>
-          <w:t xml:space="preserve">39</w:t>
+          <w:t xml:space="preserve">40</w:t>
         </w:r>
       </w:hyperlink>
     </w:p>
@@ -748,7 +929,7 @@
           <w:tab/>
         </w:r>
         <w:r>
-          <w:t xml:space="preserve">51</w:t>
+          <w:t xml:space="preserve">52</w:t>
         </w:r>
       </w:hyperlink>
     </w:p>
@@ -767,7 +948,7 @@
           <w:tab/>
         </w:r>
         <w:r>
-          <w:t xml:space="preserve">51</w:t>
+          <w:t xml:space="preserve">52</w:t>
         </w:r>
       </w:hyperlink>
     </w:p>
@@ -786,7 +967,7 @@
           <w:tab/>
         </w:r>
         <w:r>
-          <w:t xml:space="preserve">52</w:t>
+          <w:t xml:space="preserve">53</w:t>
         </w:r>
       </w:hyperlink>
     </w:p>
@@ -805,7 +986,7 @@
           <w:tab/>
         </w:r>
         <w:r>
-          <w:t xml:space="preserve">53</w:t>
+          <w:t xml:space="preserve">54</w:t>
         </w:r>
       </w:hyperlink>
     </w:p>
@@ -824,7 +1005,7 @@
           <w:tab/>
         </w:r>
         <w:r>
-          <w:t xml:space="preserve">54</w:t>
+          <w:t xml:space="preserve">55</w:t>
         </w:r>
       </w:hyperlink>
     </w:p>
@@ -843,7 +1024,7 @@
           <w:tab/>
         </w:r>
         <w:r>
-          <w:t xml:space="preserve">56</w:t>
+          <w:t xml:space="preserve">57</w:t>
         </w:r>
       </w:hyperlink>
     </w:p>
@@ -862,7 +1043,7 @@
           <w:tab/>
         </w:r>
         <w:r>
-          <w:t xml:space="preserve">56</w:t>
+          <w:t xml:space="preserve">57</w:t>
         </w:r>
       </w:hyperlink>
     </w:p>
@@ -881,7 +1062,7 @@
           <w:tab/>
         </w:r>
         <w:r>
-          <w:t xml:space="preserve">57</w:t>
+          <w:t xml:space="preserve">58</w:t>
         </w:r>
       </w:hyperlink>
     </w:p>
@@ -900,7 +1081,7 @@
           <w:tab/>
         </w:r>
         <w:r>
-          <w:t xml:space="preserve">60</w:t>
+          <w:t xml:space="preserve">61</w:t>
         </w:r>
       </w:hyperlink>
     </w:p>
@@ -919,7 +1100,7 @@
           <w:tab/>
         </w:r>
         <w:r>
-          <w:t xml:space="preserve">61</w:t>
+          <w:t xml:space="preserve">62</w:t>
         </w:r>
       </w:hyperlink>
     </w:p>
@@ -938,7 +1119,7 @@
           <w:tab/>
         </w:r>
         <w:r>
-          <w:t xml:space="preserve">64</w:t>
+          <w:t xml:space="preserve">65</w:t>
         </w:r>
       </w:hyperlink>
     </w:p>
@@ -957,7 +1138,7 @@
           <w:tab/>
         </w:r>
         <w:r>
-          <w:t xml:space="preserve">66</w:t>
+          <w:t xml:space="preserve">67</w:t>
         </w:r>
       </w:hyperlink>
     </w:p>
@@ -976,7 +1157,7 @@
           <w:tab/>
         </w:r>
         <w:r>
-          <w:t xml:space="preserve">67</w:t>
+          <w:t xml:space="preserve">68</w:t>
         </w:r>
       </w:hyperlink>
     </w:p>
@@ -995,7 +1176,7 @@
           <w:tab/>
         </w:r>
         <w:r>
-          <w:t xml:space="preserve">69</w:t>
+          <w:t xml:space="preserve">70</w:t>
         </w:r>
       </w:hyperlink>
     </w:p>
@@ -1023,7 +1204,7 @@
           <w:tab/>
         </w:r>
         <w:r>
-          <w:t xml:space="preserve">70</w:t>
+          <w:t xml:space="preserve">71</w:t>
         </w:r>
       </w:hyperlink>
     </w:p>
@@ -1051,7 +1232,7 @@
           <w:tab/>
         </w:r>
         <w:r>
-          <w:t xml:space="preserve">73</w:t>
+          <w:t xml:space="preserve">74</w:t>
         </w:r>
       </w:hyperlink>
     </w:p>
@@ -1070,7 +1251,7 @@
           <w:tab/>
         </w:r>
         <w:r>
-          <w:t xml:space="preserve">74</w:t>
+          <w:t xml:space="preserve">75</w:t>
         </w:r>
       </w:hyperlink>
     </w:p>
@@ -1089,7 +1270,7 @@
           <w:tab/>
         </w:r>
         <w:r>
-          <w:t xml:space="preserve">76</w:t>
+          <w:t xml:space="preserve">77</w:t>
         </w:r>
       </w:hyperlink>
     </w:p>
@@ -1118,7 +1299,7 @@
           <w:tab/>
         </w:r>
         <w:r>
-          <w:t xml:space="preserve">77</w:t>
+          <w:t xml:space="preserve">78</w:t>
         </w:r>
       </w:hyperlink>
     </w:p>
@@ -1156,7 +1337,7 @@
           <w:tab/>
         </w:r>
         <w:r>
-          <w:t xml:space="preserve">78</w:t>
+          <w:t xml:space="preserve">79</w:t>
         </w:r>
       </w:hyperlink>
     </w:p>
@@ -1193,7 +1374,7 @@
           <w:tab/>
         </w:r>
         <w:r>
-          <w:t xml:space="preserve">80</w:t>
+          <w:t xml:space="preserve">81</w:t>
         </w:r>
       </w:hyperlink>
     </w:p>
@@ -1212,7 +1393,7 @@
           <w:tab/>
         </w:r>
         <w:r>
-          <w:t xml:space="preserve">82</w:t>
+          <w:t xml:space="preserve">83</w:t>
         </w:r>
       </w:hyperlink>
     </w:p>
@@ -1231,7 +1412,7 @@
           <w:tab/>
         </w:r>
         <w:r>
-          <w:t xml:space="preserve">84</w:t>
+          <w:t xml:space="preserve">85</w:t>
         </w:r>
       </w:hyperlink>
       <w:r>
@@ -1288,7 +1469,7 @@
           <w:tab/>
         </w:r>
         <w:r>
-          <w:t xml:space="preserve">10</w:t>
+          <w:t xml:space="preserve">11</w:t>
         </w:r>
       </w:hyperlink>
     </w:p>
@@ -1310,7 +1491,7 @@
           <w:tab/>
         </w:r>
         <w:r>
-          <w:t xml:space="preserve">11</w:t>
+          <w:t xml:space="preserve">12</w:t>
         </w:r>
       </w:hyperlink>
     </w:p>
@@ -1332,7 +1513,7 @@
           <w:tab/>
         </w:r>
         <w:r>
-          <w:t xml:space="preserve">11</w:t>
+          <w:t xml:space="preserve">12</w:t>
         </w:r>
       </w:hyperlink>
     </w:p>
@@ -1354,7 +1535,7 @@
           <w:tab/>
         </w:r>
         <w:r>
-          <w:t xml:space="preserve">11</w:t>
+          <w:t xml:space="preserve">12</w:t>
         </w:r>
       </w:hyperlink>
     </w:p>
@@ -1376,7 +1557,7 @@
           <w:tab/>
         </w:r>
         <w:r>
-          <w:t xml:space="preserve">12</w:t>
+          <w:t xml:space="preserve">13</w:t>
         </w:r>
       </w:hyperlink>
     </w:p>
@@ -1398,7 +1579,7 @@
           <w:tab/>
         </w:r>
         <w:r>
-          <w:t xml:space="preserve">14</w:t>
+          <w:t xml:space="preserve">15</w:t>
         </w:r>
       </w:hyperlink>
     </w:p>
@@ -1420,7 +1601,7 @@
           <w:tab/>
         </w:r>
         <w:r>
-          <w:t xml:space="preserve">14</w:t>
+          <w:t xml:space="preserve">15</w:t>
         </w:r>
       </w:hyperlink>
     </w:p>
@@ -1442,7 +1623,7 @@
           <w:tab/>
         </w:r>
         <w:r>
-          <w:t xml:space="preserve">14</w:t>
+          <w:t xml:space="preserve">15</w:t>
         </w:r>
       </w:hyperlink>
     </w:p>
@@ -1464,7 +1645,7 @@
           <w:tab/>
         </w:r>
         <w:r>
-          <w:t xml:space="preserve">15</w:t>
+          <w:t xml:space="preserve">16</w:t>
         </w:r>
       </w:hyperlink>
     </w:p>
@@ -1486,7 +1667,7 @@
           <w:tab/>
         </w:r>
         <w:r>
-          <w:t xml:space="preserve">16</w:t>
+          <w:t xml:space="preserve">17</w:t>
         </w:r>
       </w:hyperlink>
     </w:p>
@@ -1508,7 +1689,7 @@
           <w:tab/>
         </w:r>
         <w:r>
-          <w:t xml:space="preserve">17</w:t>
+          <w:t xml:space="preserve">18</w:t>
         </w:r>
       </w:hyperlink>
     </w:p>
@@ -1530,7 +1711,7 @@
           <w:tab/>
         </w:r>
         <w:r>
-          <w:t xml:space="preserve">18</w:t>
+          <w:t xml:space="preserve">19</w:t>
         </w:r>
       </w:hyperlink>
     </w:p>
@@ -1552,7 +1733,7 @@
           <w:tab/>
         </w:r>
         <w:r>
-          <w:t xml:space="preserve">18</w:t>
+          <w:t xml:space="preserve">19</w:t>
         </w:r>
       </w:hyperlink>
     </w:p>
@@ -1574,7 +1755,7 @@
           <w:tab/>
         </w:r>
         <w:r>
-          <w:t xml:space="preserve">19</w:t>
+          <w:t xml:space="preserve">20</w:t>
         </w:r>
       </w:hyperlink>
     </w:p>
@@ -1596,7 +1777,7 @@
           <w:tab/>
         </w:r>
         <w:r>
-          <w:t xml:space="preserve">20</w:t>
+          <w:t xml:space="preserve">21</w:t>
         </w:r>
       </w:hyperlink>
     </w:p>
@@ -1618,7 +1799,7 @@
           <w:tab/>
         </w:r>
         <w:r>
-          <w:t xml:space="preserve">21</w:t>
+          <w:t xml:space="preserve">22</w:t>
         </w:r>
       </w:hyperlink>
     </w:p>
@@ -1640,7 +1821,7 @@
           <w:tab/>
         </w:r>
         <w:r>
-          <w:t xml:space="preserve">21</w:t>
+          <w:t xml:space="preserve">22</w:t>
         </w:r>
       </w:hyperlink>
     </w:p>
@@ -1662,7 +1843,7 @@
           <w:tab/>
         </w:r>
         <w:r>
-          <w:t xml:space="preserve">23</w:t>
+          <w:t xml:space="preserve">24</w:t>
         </w:r>
       </w:hyperlink>
     </w:p>
@@ -1684,7 +1865,7 @@
           <w:tab/>
         </w:r>
         <w:r>
-          <w:t xml:space="preserve">24</w:t>
+          <w:t xml:space="preserve">25</w:t>
         </w:r>
       </w:hyperlink>
     </w:p>
@@ -1706,7 +1887,7 @@
           <w:tab/>
         </w:r>
         <w:r>
-          <w:t xml:space="preserve">24</w:t>
+          <w:t xml:space="preserve">25</w:t>
         </w:r>
       </w:hyperlink>
     </w:p>
@@ -1728,7 +1909,7 @@
           <w:tab/>
         </w:r>
         <w:r>
-          <w:t xml:space="preserve">24</w:t>
+          <w:t xml:space="preserve">25</w:t>
         </w:r>
       </w:hyperlink>
     </w:p>
@@ -1750,7 +1931,7 @@
           <w:tab/>
         </w:r>
         <w:r>
-          <w:t xml:space="preserve">25</w:t>
+          <w:t xml:space="preserve">26</w:t>
         </w:r>
       </w:hyperlink>
     </w:p>
@@ -1772,7 +1953,7 @@
           <w:tab/>
         </w:r>
         <w:r>
-          <w:t xml:space="preserve">26</w:t>
+          <w:t xml:space="preserve">27</w:t>
         </w:r>
       </w:hyperlink>
     </w:p>
@@ -1794,7 +1975,7 @@
           <w:tab/>
         </w:r>
         <w:r>
-          <w:t xml:space="preserve">27</w:t>
+          <w:t xml:space="preserve">28</w:t>
         </w:r>
       </w:hyperlink>
     </w:p>
@@ -1816,7 +1997,7 @@
           <w:tab/>
         </w:r>
         <w:r>
-          <w:t xml:space="preserve">28</w:t>
+          <w:t xml:space="preserve">29</w:t>
         </w:r>
       </w:hyperlink>
     </w:p>
@@ -1838,7 +2019,7 @@
           <w:tab/>
         </w:r>
         <w:r>
-          <w:t xml:space="preserve">28</w:t>
+          <w:t xml:space="preserve">29</w:t>
         </w:r>
       </w:hyperlink>
     </w:p>
@@ -1860,7 +2041,7 @@
           <w:tab/>
         </w:r>
         <w:r>
-          <w:t xml:space="preserve">30</w:t>
+          <w:t xml:space="preserve">31</w:t>
         </w:r>
       </w:hyperlink>
     </w:p>
@@ -1882,7 +2063,7 @@
           <w:tab/>
         </w:r>
         <w:r>
-          <w:t xml:space="preserve">31</w:t>
+          <w:t xml:space="preserve">32</w:t>
         </w:r>
       </w:hyperlink>
     </w:p>
@@ -1904,7 +2085,7 @@
           <w:tab/>
         </w:r>
         <w:r>
-          <w:t xml:space="preserve">32</w:t>
+          <w:t xml:space="preserve">33</w:t>
         </w:r>
       </w:hyperlink>
     </w:p>
@@ -1926,7 +2107,7 @@
           <w:tab/>
         </w:r>
         <w:r>
-          <w:t xml:space="preserve">32</w:t>
+          <w:t xml:space="preserve">33</w:t>
         </w:r>
       </w:hyperlink>
     </w:p>
@@ -1948,7 +2129,7 @@
           <w:tab/>
         </w:r>
         <w:r>
-          <w:t xml:space="preserve">33</w:t>
+          <w:t xml:space="preserve">34</w:t>
         </w:r>
       </w:hyperlink>
     </w:p>
@@ -1970,7 +2151,7 @@
           <w:tab/>
         </w:r>
         <w:r>
-          <w:t xml:space="preserve">34</w:t>
+          <w:t xml:space="preserve">35</w:t>
         </w:r>
       </w:hyperlink>
     </w:p>
@@ -1992,7 +2173,7 @@
           <w:tab/>
         </w:r>
         <w:r>
-          <w:t xml:space="preserve">34</w:t>
+          <w:t xml:space="preserve">35</w:t>
         </w:r>
       </w:hyperlink>
     </w:p>
@@ -2014,7 +2195,7 @@
           <w:tab/>
         </w:r>
         <w:r>
-          <w:t xml:space="preserve">35</w:t>
+          <w:t xml:space="preserve">36</w:t>
         </w:r>
       </w:hyperlink>
     </w:p>
@@ -2036,7 +2217,7 @@
           <w:tab/>
         </w:r>
         <w:r>
-          <w:t xml:space="preserve">36</w:t>
+          <w:t xml:space="preserve">37</w:t>
         </w:r>
       </w:hyperlink>
     </w:p>
@@ -2058,7 +2239,7 @@
           <w:tab/>
         </w:r>
         <w:r>
-          <w:t xml:space="preserve">37</w:t>
+          <w:t xml:space="preserve">38</w:t>
         </w:r>
       </w:hyperlink>
     </w:p>
@@ -2080,7 +2261,7 @@
           <w:tab/>
         </w:r>
         <w:r>
-          <w:t xml:space="preserve">38</w:t>
+          <w:t xml:space="preserve">39</w:t>
         </w:r>
       </w:hyperlink>
     </w:p>
@@ -2102,7 +2283,7 @@
           <w:tab/>
         </w:r>
         <w:r>
-          <w:t xml:space="preserve">38</w:t>
+          <w:t xml:space="preserve">39</w:t>
         </w:r>
       </w:hyperlink>
     </w:p>
@@ -2124,7 +2305,7 @@
           <w:tab/>
         </w:r>
         <w:r>
-          <w:t xml:space="preserve">40</w:t>
+          <w:t xml:space="preserve">41</w:t>
         </w:r>
       </w:hyperlink>
     </w:p>
@@ -2146,7 +2327,7 @@
           <w:tab/>
         </w:r>
         <w:r>
-          <w:t xml:space="preserve">41</w:t>
+          <w:t xml:space="preserve">42</w:t>
         </w:r>
       </w:hyperlink>
     </w:p>
@@ -2168,7 +2349,7 @@
           <w:tab/>
         </w:r>
         <w:r>
-          <w:t xml:space="preserve">43</w:t>
+          <w:t xml:space="preserve">44</w:t>
         </w:r>
       </w:hyperlink>
     </w:p>
@@ -2190,7 +2371,7 @@
           <w:tab/>
         </w:r>
         <w:r>
-          <w:t xml:space="preserve">43</w:t>
+          <w:t xml:space="preserve">44</w:t>
         </w:r>
       </w:hyperlink>
     </w:p>
@@ -2212,7 +2393,7 @@
           <w:tab/>
         </w:r>
         <w:r>
-          <w:t xml:space="preserve">44</w:t>
+          <w:t xml:space="preserve">45</w:t>
         </w:r>
       </w:hyperlink>
     </w:p>
@@ -2244,7 +2425,7 @@
           <w:tab/>
         </w:r>
         <w:r>
-          <w:t xml:space="preserve">47</w:t>
+          <w:t xml:space="preserve">48</w:t>
         </w:r>
       </w:hyperlink>
     </w:p>
@@ -2266,7 +2447,7 @@
           <w:tab/>
         </w:r>
         <w:r>
-          <w:t xml:space="preserve">48</w:t>
+          <w:t xml:space="preserve">49</w:t>
         </w:r>
       </w:hyperlink>
     </w:p>
@@ -2288,7 +2469,7 @@
           <w:tab/>
         </w:r>
         <w:r>
-          <w:t xml:space="preserve">48</w:t>
+          <w:t xml:space="preserve">49</w:t>
         </w:r>
       </w:hyperlink>
     </w:p>
@@ -2310,7 +2491,7 @@
           <w:tab/>
         </w:r>
         <w:r>
-          <w:t xml:space="preserve">49</w:t>
+          <w:t xml:space="preserve">50</w:t>
         </w:r>
       </w:hyperlink>
     </w:p>
@@ -2332,7 +2513,7 @@
           <w:tab/>
         </w:r>
         <w:r>
-          <w:t xml:space="preserve">50</w:t>
+          <w:t xml:space="preserve">51</w:t>
         </w:r>
       </w:hyperlink>
     </w:p>
@@ -2354,7 +2535,7 @@
           <w:tab/>
         </w:r>
         <w:r>
-          <w:t xml:space="preserve">50</w:t>
+          <w:t xml:space="preserve">51</w:t>
         </w:r>
       </w:hyperlink>
     </w:p>
@@ -2376,7 +2557,7 @@
           <w:tab/>
         </w:r>
         <w:r>
-          <w:t xml:space="preserve">50</w:t>
+          <w:t xml:space="preserve">51</w:t>
         </w:r>
       </w:hyperlink>
     </w:p>
@@ -2398,7 +2579,7 @@
           <w:tab/>
         </w:r>
         <w:r>
-          <w:t xml:space="preserve">52</w:t>
+          <w:t xml:space="preserve">53</w:t>
         </w:r>
       </w:hyperlink>
     </w:p>
@@ -2420,7 +2601,7 @@
           <w:tab/>
         </w:r>
         <w:r>
-          <w:t xml:space="preserve">53</w:t>
+          <w:t xml:space="preserve">54</w:t>
         </w:r>
       </w:hyperlink>
     </w:p>
@@ -2442,7 +2623,7 @@
           <w:tab/>
         </w:r>
         <w:r>
-          <w:t xml:space="preserve">54</w:t>
+          <w:t xml:space="preserve">55</w:t>
         </w:r>
       </w:hyperlink>
     </w:p>
@@ -2464,7 +2645,7 @@
           <w:tab/>
         </w:r>
         <w:r>
-          <w:t xml:space="preserve">55</w:t>
+          <w:t xml:space="preserve">56</w:t>
         </w:r>
       </w:hyperlink>
     </w:p>
@@ -2486,7 +2667,7 @@
           <w:tab/>
         </w:r>
         <w:r>
-          <w:t xml:space="preserve">57</w:t>
+          <w:t xml:space="preserve">58</w:t>
         </w:r>
       </w:hyperlink>
     </w:p>
@@ -2508,7 +2689,7 @@
           <w:tab/>
         </w:r>
         <w:r>
-          <w:t xml:space="preserve">58</w:t>
+          <w:t xml:space="preserve">59</w:t>
         </w:r>
       </w:hyperlink>
     </w:p>
@@ -2530,7 +2711,7 @@
           <w:tab/>
         </w:r>
         <w:r>
-          <w:t xml:space="preserve">61</w:t>
+          <w:t xml:space="preserve">62</w:t>
         </w:r>
       </w:hyperlink>
     </w:p>
@@ -2552,7 +2733,7 @@
           <w:tab/>
         </w:r>
         <w:r>
-          <w:t xml:space="preserve">63</w:t>
+          <w:t xml:space="preserve">64</w:t>
         </w:r>
       </w:hyperlink>
     </w:p>
@@ -2574,7 +2755,7 @@
           <w:tab/>
         </w:r>
         <w:r>
-          <w:t xml:space="preserve">64</w:t>
+          <w:t xml:space="preserve">65</w:t>
         </w:r>
       </w:hyperlink>
     </w:p>
@@ -2596,7 +2777,7 @@
           <w:tab/>
         </w:r>
         <w:r>
-          <w:t xml:space="preserve">64</w:t>
+          <w:t xml:space="preserve">65</w:t>
         </w:r>
       </w:hyperlink>
     </w:p>
@@ -2618,7 +2799,7 @@
           <w:tab/>
         </w:r>
         <w:r>
-          <w:t xml:space="preserve">66</w:t>
+          <w:t xml:space="preserve">67</w:t>
         </w:r>
       </w:hyperlink>
     </w:p>
@@ -2640,7 +2821,7 @@
           <w:tab/>
         </w:r>
         <w:r>
-          <w:t xml:space="preserve">68</w:t>
+          <w:t xml:space="preserve">69</w:t>
         </w:r>
       </w:hyperlink>
     </w:p>
@@ -2671,7 +2852,7 @@
           <w:tab/>
         </w:r>
         <w:r>
-          <w:t xml:space="preserve">69</w:t>
+          <w:t xml:space="preserve">70</w:t>
         </w:r>
       </w:hyperlink>
     </w:p>
@@ -2693,7 +2874,7 @@
           <w:tab/>
         </w:r>
         <w:r>
-          <w:t xml:space="preserve">72</w:t>
+          <w:t xml:space="preserve">73</w:t>
         </w:r>
       </w:hyperlink>
     </w:p>
@@ -2715,7 +2896,7 @@
           <w:tab/>
         </w:r>
         <w:r>
-          <w:t xml:space="preserve">75</w:t>
+          <w:t xml:space="preserve">76</w:t>
         </w:r>
       </w:hyperlink>
     </w:p>
@@ -2737,7 +2918,7 @@
           <w:tab/>
         </w:r>
         <w:r>
-          <w:t xml:space="preserve">76</w:t>
+          <w:t xml:space="preserve">77</w:t>
         </w:r>
       </w:hyperlink>
     </w:p>
@@ -2769,7 +2950,7 @@
           <w:tab/>
         </w:r>
         <w:r>
-          <w:t xml:space="preserve">77</w:t>
+          <w:t xml:space="preserve">78</w:t>
         </w:r>
       </w:hyperlink>
     </w:p>
@@ -2791,7 +2972,7 @@
           <w:tab/>
         </w:r>
         <w:r>
-          <w:t xml:space="preserve">79</w:t>
+          <w:t xml:space="preserve">80</w:t>
         </w:r>
       </w:hyperlink>
     </w:p>
@@ -2813,7 +2994,7 @@
           <w:tab/>
         </w:r>
         <w:r>
-          <w:t xml:space="preserve">81</w:t>
+          <w:t xml:space="preserve">82</w:t>
         </w:r>
       </w:hyperlink>
     </w:p>
@@ -2835,7 +3016,7 @@
           <w:tab/>
         </w:r>
         <w:r>
-          <w:t xml:space="preserve">83</w:t>
+          <w:t xml:space="preserve">84</w:t>
         </w:r>
       </w:hyperlink>
     </w:p>
@@ -2857,7 +3038,7 @@
           <w:tab/>
         </w:r>
         <w:r>
-          <w:t xml:space="preserve">86</w:t>
+          <w:t xml:space="preserve">87</w:t>
         </w:r>
       </w:hyperlink>
     </w:p>
@@ -2879,7 +3060,7 @@
           <w:tab/>
         </w:r>
         <w:r>
-          <w:t xml:space="preserve">86</w:t>
+          <w:t xml:space="preserve">87</w:t>
         </w:r>
       </w:hyperlink>
     </w:p>
@@ -2901,7 +3082,7 @@
           <w:tab/>
         </w:r>
         <w:r>
-          <w:t xml:space="preserve">87</w:t>
+          <w:t xml:space="preserve">88</w:t>
         </w:r>
       </w:hyperlink>
     </w:p>
@@ -2917,7 +3098,7 @@
           <w:tab/>
         </w:r>
         <w:r>
-          <w:t xml:space="preserve">90</w:t>
+          <w:t xml:space="preserve">91</w:t>
         </w:r>
       </w:hyperlink>
       <w:r>

</xml_diff>

<commit_message>
TCC: seções da parte 3B pareadas com as da 3A
A parte 3B passa a ter 13 seções, com a mesma numeração da 3A (3B.k
corresponde a 3A.k):
- fontes e arquivos vão para a introdução da parte, sem seção própria;
- a arquitetura descrita na patente abre a 3B.1, de reconstrução em CAD;
- a cinemática se divide em 3B.4 (fechamento do circuito), 3B.5 (ponto de
  contato e troca de regime) e 3B.7 (faixa sem torque, par do ponto morto);
- 3B.6 passa a "Comprimento do elástico, lei da mola e torque";
- dados da patente e identificação ficam juntos na 3B.9.

Os verificadores aceitam título cujo número o pdftotext separa do texto
(número extraído junto dos números de equação do bloco anterior).

Co-Authored-By: Claude Opus 5.5 <noreply@anthropic.com>
Claude-Session: https://claude.ai/code/session_011EXBtMgMjcpkiJ44sLq9TW
</commit_message>
<xml_diff>
--- a/tcc/TCC_modelo_FT.docx
+++ b/tcc/TCC_modelo_FT.docx
@@ -520,7 +520,7 @@
       <w:pPr>
         <w:pStyle w:val="ndicedeilustraes"/>
       </w:pPr>
-      <w:hyperlink w:anchor="_Toc0044" w:history="1">
+      <w:hyperlink w:anchor="_Toc0043" w:history="1">
         <w:r>
           <w:t xml:space="preserve">Figura 2: </w:t>
         </w:r>
@@ -576,7 +576,7 @@
       <w:pPr>
         <w:pStyle w:val="ndicedeilustraes"/>
       </w:pPr>
-      <w:hyperlink w:anchor="_Toc0066" w:history="1">
+      <w:hyperlink w:anchor="_Toc0065" w:history="1">
         <w:r>
           <w:t xml:space="preserve">Figura 4: </w:t>
         </w:r>
@@ -604,7 +604,7 @@
       <w:pPr>
         <w:pStyle w:val="ndicedeilustraes"/>
       </w:pPr>
-      <w:hyperlink w:anchor="_Toc0072" w:history="1">
+      <w:hyperlink w:anchor="_Toc0071" w:history="1">
         <w:r>
           <w:t xml:space="preserve">Figura 5: </w:t>
         </w:r>
@@ -632,7 +632,7 @@
       <w:pPr>
         <w:pStyle w:val="ndicedeilustraes"/>
       </w:pPr>
-      <w:hyperlink w:anchor="_Toc0073" w:history="1">
+      <w:hyperlink w:anchor="_Toc0072" w:history="1">
         <w:r>
           <w:t xml:space="preserve">Figura 6: </w:t>
         </w:r>
@@ -651,7 +651,7 @@
       <w:pPr>
         <w:pStyle w:val="ndicedeilustraes"/>
       </w:pPr>
-      <w:hyperlink w:anchor="_Toc0077" w:history="1">
+      <w:hyperlink w:anchor="_Toc0076" w:history="1">
         <w:r>
           <w:t xml:space="preserve">Figura 7: </w:t>
         </w:r>
@@ -679,7 +679,7 @@
       <w:pPr>
         <w:pStyle w:val="ndicedeilustraes"/>
       </w:pPr>
-      <w:hyperlink w:anchor="_Toc0089" w:history="1">
+      <w:hyperlink w:anchor="_Toc0088" w:history="1">
         <w:r>
           <w:t xml:space="preserve">Figura 8: </w:t>
         </w:r>
@@ -716,7 +716,7 @@
       <w:pPr>
         <w:pStyle w:val="ndicedeilustraes"/>
       </w:pPr>
-      <w:hyperlink w:anchor="_Toc0093" w:history="1">
+      <w:hyperlink w:anchor="_Toc0092" w:history="1">
         <w:r>
           <w:t xml:space="preserve">Figura 9: </w:t>
         </w:r>
@@ -735,7 +735,7 @@
       <w:pPr>
         <w:pStyle w:val="ndicedeilustraes"/>
       </w:pPr>
-      <w:hyperlink w:anchor="_Toc0100" w:history="1">
+      <w:hyperlink w:anchor="_Toc0099" w:history="1">
         <w:r>
           <w:t xml:space="preserve">Figura 10: </w:t>
         </w:r>
@@ -779,7 +779,7 @@
       <w:pPr>
         <w:pStyle w:val="ndicedeilustraes"/>
       </w:pPr>
-      <w:hyperlink w:anchor="_Toc0102" w:history="1">
+      <w:hyperlink w:anchor="_Toc0101" w:history="1">
         <w:r>
           <w:t xml:space="preserve">Figura 11: </w:t>
         </w:r>
@@ -798,7 +798,7 @@
       <w:pPr>
         <w:pStyle w:val="ndicedeilustraes"/>
       </w:pPr>
-      <w:hyperlink w:anchor="_Toc0104" w:history="1">
+      <w:hyperlink w:anchor="_Toc0103" w:history="1">
         <w:r>
           <w:t xml:space="preserve">Figura 12: </w:t>
         </w:r>
@@ -880,7 +880,7 @@
       <w:pPr>
         <w:pStyle w:val="ndicedeilustraes"/>
       </w:pPr>
-      <w:hyperlink w:anchor="_Toc0037" w:history="1">
+      <w:hyperlink w:anchor="_Toc0036" w:history="1">
         <w:r>
           <w:t xml:space="preserve">Tabela 2: </w:t>
         </w:r>
@@ -899,7 +899,7 @@
       <w:pPr>
         <w:pStyle w:val="ndicedeilustraes"/>
       </w:pPr>
-      <w:hyperlink w:anchor="_Toc0042" w:history="1">
+      <w:hyperlink w:anchor="_Toc0040" w:history="1">
         <w:r>
           <w:t xml:space="preserve">Tabela 3: </w:t>
         </w:r>
@@ -918,7 +918,7 @@
       <w:pPr>
         <w:pStyle w:val="ndicedeilustraes"/>
       </w:pPr>
-      <w:hyperlink w:anchor="_Toc0057" w:history="1">
+      <w:hyperlink w:anchor="_Toc0056" w:history="1">
         <w:r>
           <w:t xml:space="preserve">Tabela 4: </w:t>
         </w:r>
@@ -937,7 +937,7 @@
       <w:pPr>
         <w:pStyle w:val="ndicedeilustraes"/>
       </w:pPr>
-      <w:hyperlink w:anchor="_Toc0058" w:history="1">
+      <w:hyperlink w:anchor="_Toc0057" w:history="1">
         <w:r>
           <w:t xml:space="preserve">Tabela 5: </w:t>
         </w:r>
@@ -956,7 +956,7 @@
       <w:pPr>
         <w:pStyle w:val="ndicedeilustraes"/>
       </w:pPr>
-      <w:hyperlink w:anchor="_Toc0060" w:history="1">
+      <w:hyperlink w:anchor="_Toc0059" w:history="1">
         <w:r>
           <w:t xml:space="preserve">Tabela 6: </w:t>
         </w:r>
@@ -975,7 +975,7 @@
       <w:pPr>
         <w:pStyle w:val="ndicedeilustraes"/>
       </w:pPr>
-      <w:hyperlink w:anchor="_Toc0062" w:history="1">
+      <w:hyperlink w:anchor="_Toc0061" w:history="1">
         <w:r>
           <w:t xml:space="preserve">Tabela 7: </w:t>
         </w:r>
@@ -994,7 +994,7 @@
       <w:pPr>
         <w:pStyle w:val="ndicedeilustraes"/>
       </w:pPr>
-      <w:hyperlink w:anchor="_Toc0064" w:history="1">
+      <w:hyperlink w:anchor="_Toc0063" w:history="1">
         <w:r>
           <w:t xml:space="preserve">Tabela 8: </w:t>
         </w:r>
@@ -1013,7 +1013,7 @@
       <w:pPr>
         <w:pStyle w:val="ndicedeilustraes"/>
       </w:pPr>
-      <w:hyperlink w:anchor="_Toc0067" w:history="1">
+      <w:hyperlink w:anchor="_Toc0066" w:history="1">
         <w:r>
           <w:t xml:space="preserve">Tabela 9: </w:t>
         </w:r>
@@ -1032,7 +1032,7 @@
       <w:pPr>
         <w:pStyle w:val="ndicedeilustraes"/>
       </w:pPr>
-      <w:hyperlink w:anchor="_Toc0068" w:history="1">
+      <w:hyperlink w:anchor="_Toc0067" w:history="1">
         <w:r>
           <w:t xml:space="preserve">Tabela 10: </w:t>
         </w:r>
@@ -1051,7 +1051,7 @@
       <w:pPr>
         <w:pStyle w:val="ndicedeilustraes"/>
       </w:pPr>
-      <w:hyperlink w:anchor="_Toc0070" w:history="1">
+      <w:hyperlink w:anchor="_Toc0069" w:history="1">
         <w:r>
           <w:t xml:space="preserve">Tabela 11: </w:t>
         </w:r>
@@ -1070,7 +1070,7 @@
       <w:pPr>
         <w:pStyle w:val="ndicedeilustraes"/>
       </w:pPr>
-      <w:hyperlink w:anchor="_Toc0074" w:history="1">
+      <w:hyperlink w:anchor="_Toc0073" w:history="1">
         <w:r>
           <w:t xml:space="preserve">Tabela 12: </w:t>
         </w:r>
@@ -1089,7 +1089,7 @@
       <w:pPr>
         <w:pStyle w:val="ndicedeilustraes"/>
       </w:pPr>
-      <w:hyperlink w:anchor="_Toc0075" w:history="1">
+      <w:hyperlink w:anchor="_Toc0074" w:history="1">
         <w:r>
           <w:t xml:space="preserve">Tabela 13: </w:t>
         </w:r>
@@ -1108,7 +1108,7 @@
       <w:pPr>
         <w:pStyle w:val="ndicedeilustraes"/>
       </w:pPr>
-      <w:hyperlink w:anchor="_Toc0081" w:history="1">
+      <w:hyperlink w:anchor="_Toc0080" w:history="1">
         <w:r>
           <w:t xml:space="preserve">Tabela 14: </w:t>
         </w:r>
@@ -1127,7 +1127,7 @@
       <w:pPr>
         <w:pStyle w:val="ndicedeilustraes"/>
       </w:pPr>
-      <w:hyperlink w:anchor="_Toc0082" w:history="1">
+      <w:hyperlink w:anchor="_Toc0081" w:history="1">
         <w:r>
           <w:t xml:space="preserve">Tabela 15: </w:t>
         </w:r>
@@ -1146,7 +1146,7 @@
       <w:pPr>
         <w:pStyle w:val="ndicedeilustraes"/>
       </w:pPr>
-      <w:hyperlink w:anchor="_Toc0084" w:history="1">
+      <w:hyperlink w:anchor="_Toc0083" w:history="1">
         <w:r>
           <w:t xml:space="preserve">Tabela 16: </w:t>
         </w:r>
@@ -1165,7 +1165,7 @@
       <w:pPr>
         <w:pStyle w:val="ndicedeilustraes"/>
       </w:pPr>
-      <w:hyperlink w:anchor="_Toc0086" w:history="1">
+      <w:hyperlink w:anchor="_Toc0085" w:history="1">
         <w:r>
           <w:t xml:space="preserve">Tabela 17: </w:t>
         </w:r>
@@ -1184,7 +1184,7 @@
       <w:pPr>
         <w:pStyle w:val="ndicedeilustraes"/>
       </w:pPr>
-      <w:hyperlink w:anchor="_Toc0088" w:history="1">
+      <w:hyperlink w:anchor="_Toc0087" w:history="1">
         <w:r>
           <w:t xml:space="preserve">Tabela 18: </w:t>
         </w:r>
@@ -1212,7 +1212,7 @@
       <w:pPr>
         <w:pStyle w:val="ndicedeilustraes"/>
       </w:pPr>
-      <w:hyperlink w:anchor="_Toc0091" w:history="1">
+      <w:hyperlink w:anchor="_Toc0090" w:history="1">
         <w:r>
           <w:t xml:space="preserve">Tabela 19: </w:t>
         </w:r>
@@ -1240,7 +1240,7 @@
       <w:pPr>
         <w:pStyle w:val="ndicedeilustraes"/>
       </w:pPr>
-      <w:hyperlink w:anchor="_Toc0092" w:history="1">
+      <w:hyperlink w:anchor="_Toc0091" w:history="1">
         <w:r>
           <w:t xml:space="preserve">Tabela 20: </w:t>
         </w:r>
@@ -1259,7 +1259,7 @@
       <w:pPr>
         <w:pStyle w:val="ndicedeilustraes"/>
       </w:pPr>
-      <w:hyperlink w:anchor="_Toc0095" w:history="1">
+      <w:hyperlink w:anchor="_Toc0094" w:history="1">
         <w:r>
           <w:t xml:space="preserve">Tabela 21: </w:t>
         </w:r>
@@ -1278,7 +1278,7 @@
       <w:pPr>
         <w:pStyle w:val="ndicedeilustraes"/>
       </w:pPr>
-      <w:hyperlink w:anchor="_Toc0097" w:history="1">
+      <w:hyperlink w:anchor="_Toc0096" w:history="1">
         <w:r>
           <w:t xml:space="preserve">Tabela 22: </w:t>
         </w:r>
@@ -1307,7 +1307,7 @@
       <w:pPr>
         <w:pStyle w:val="ndicedeilustraes"/>
       </w:pPr>
-      <w:hyperlink w:anchor="_Toc0099" w:history="1">
+      <w:hyperlink w:anchor="_Toc0098" w:history="1">
         <w:r>
           <w:t xml:space="preserve">Tabela 23: </w:t>
         </w:r>
@@ -1345,7 +1345,7 @@
       <w:pPr>
         <w:pStyle w:val="ndicedeilustraes"/>
       </w:pPr>
-      <w:hyperlink w:anchor="_Toc0103" w:history="1">
+      <w:hyperlink w:anchor="_Toc0102" w:history="1">
         <w:r>
           <w:t xml:space="preserve">Tabela 24: </w:t>
         </w:r>
@@ -1382,7 +1382,7 @@
       <w:pPr>
         <w:pStyle w:val="ndicedeilustraes"/>
       </w:pPr>
-      <w:hyperlink w:anchor="_Toc0106" w:history="1">
+      <w:hyperlink w:anchor="_Toc0105" w:history="1">
         <w:r>
           <w:t xml:space="preserve">Tabela 25: </w:t>
         </w:r>
@@ -1401,7 +1401,7 @@
       <w:pPr>
         <w:pStyle w:val="ndicedeilustraes"/>
       </w:pPr>
-      <w:hyperlink w:anchor="_Toc0108" w:history="1">
+      <w:hyperlink w:anchor="_Toc0107" w:history="1">
         <w:r>
           <w:t xml:space="preserve">Tabela 26: </w:t>
         </w:r>
@@ -2181,7 +2181,7 @@
       <w:pPr>
         <w:pStyle w:val="Sumrio3"/>
       </w:pPr>
-      <w:hyperlink w:anchor="_Toc0036" w:history="1">
+      <w:hyperlink w:anchor="_Toc0037" w:history="1">
         <w:r>
           <w:t xml:space="preserve">3B.1</w:t>
         </w:r>
@@ -2189,13 +2189,13 @@
           <w:tab/>
         </w:r>
         <w:r>
-          <w:t xml:space="preserve">Fontes e arquivos utilizados</w:t>
+          <w:t xml:space="preserve">Reconstrução geométrica em CAD</w:t>
         </w:r>
         <w:r>
           <w:tab/>
         </w:r>
         <w:r>
-          <w:t xml:space="preserve">36</w:t>
+          <w:t xml:space="preserve">37</w:t>
         </w:r>
       </w:hyperlink>
     </w:p>
@@ -2211,29 +2211,7 @@
           <w:tab/>
         </w:r>
         <w:r>
-          <w:t xml:space="preserve">Arquitetura descrita na patente</w:t>
-        </w:r>
-        <w:r>
-          <w:tab/>
-        </w:r>
-        <w:r>
-          <w:t xml:space="preserve">37</w:t>
-        </w:r>
-      </w:hyperlink>
-    </w:p>
-    <w:p>
-      <w:pPr>
-        <w:pStyle w:val="Sumrio3"/>
-      </w:pPr>
-      <w:hyperlink w:anchor="_Toc0039" w:history="1">
-        <w:r>
-          <w:t xml:space="preserve">3B.3</w:t>
-        </w:r>
-        <w:r>
-          <w:tab/>
-        </w:r>
-        <w:r>
-          <w:t xml:space="preserve">Reconstrução geométrica em CAD</w:t>
+          <w:t xml:space="preserve">Parâmetros inerciais do membro e transporte ao eixo da articulação 20</w:t>
         </w:r>
         <w:r>
           <w:tab/>
@@ -2247,31 +2225,9 @@
       <w:pPr>
         <w:pStyle w:val="Sumrio3"/>
       </w:pPr>
-      <w:hyperlink w:anchor="_Toc0040" w:history="1">
+      <w:hyperlink w:anchor="_Toc0039" w:history="1">
         <w:r>
-          <w:t xml:space="preserve">3B.4</w:t>
-        </w:r>
-        <w:r>
-          <w:tab/>
-        </w:r>
-        <w:r>
-          <w:t xml:space="preserve">Parâmetros inerciais do membro e transporte ao eixo da articulação 20</w:t>
-        </w:r>
-        <w:r>
-          <w:tab/>
-        </w:r>
-        <w:r>
-          <w:t xml:space="preserve">39</w:t>
-        </w:r>
-      </w:hyperlink>
-    </w:p>
-    <w:p>
-      <w:pPr>
-        <w:pStyle w:val="Sumrio3"/>
-      </w:pPr>
-      <w:hyperlink w:anchor="_Toc0041" w:history="1">
-        <w:r>
-          <w:t xml:space="preserve">3B.5</w:t>
+          <w:t xml:space="preserve">3B.3</w:t>
         </w:r>
         <w:r>
           <w:tab/>
@@ -2291,7 +2247,51 @@
       <w:pPr>
         <w:pStyle w:val="Sumrio3"/>
       </w:pPr>
-      <w:hyperlink w:anchor="_Toc0043" w:history="1">
+      <w:hyperlink w:anchor="_Toc0041" w:history="1">
+        <w:r>
+          <w:t xml:space="preserve">3B.4</w:t>
+        </w:r>
+        <w:r>
+          <w:tab/>
+        </w:r>
+        <w:r>
+          <w:t xml:space="preserve">Equação de fechamento do circuito vetorial</w:t>
+        </w:r>
+        <w:r>
+          <w:tab/>
+        </w:r>
+        <w:r>
+          <w:t xml:space="preserve">41</w:t>
+        </w:r>
+      </w:hyperlink>
+    </w:p>
+    <w:p>
+      <w:pPr>
+        <w:pStyle w:val="Sumrio3"/>
+      </w:pPr>
+      <w:hyperlink w:anchor="_Toc0042" w:history="1">
+        <w:r>
+          <w:t xml:space="preserve">3B.5</w:t>
+        </w:r>
+        <w:r>
+          <w:tab/>
+        </w:r>
+        <w:r>
+          <w:t xml:space="preserve">Ponto de contato e troca de regime</w:t>
+        </w:r>
+        <w:r>
+          <w:tab/>
+        </w:r>
+        <w:r>
+          <w:t xml:space="preserve">41</w:t>
+        </w:r>
+      </w:hyperlink>
+    </w:p>
+    <w:p>
+      <w:pPr>
+        <w:pStyle w:val="Sumrio3"/>
+      </w:pPr>
+      <w:hyperlink w:anchor="_Toc0044" w:history="1">
         <w:r>
           <w:t xml:space="preserve">3B.6</w:t>
         </w:r>
@@ -2299,13 +2299,13 @@
           <w:tab/>
         </w:r>
         <w:r>
-          <w:t xml:space="preserve">Cinemática: equações de circuito e troca de regime</w:t>
+          <w:t xml:space="preserve">Comprimento do elástico, lei da mola e torque</w:t>
         </w:r>
         <w:r>
           <w:tab/>
         </w:r>
         <w:r>
-          <w:t xml:space="preserve">41</w:t>
+          <w:t xml:space="preserve">42</w:t>
         </w:r>
       </w:hyperlink>
     </w:p>
@@ -2321,13 +2321,13 @@
           <w:tab/>
         </w:r>
         <w:r>
-          <w:t xml:space="preserve">Força elástica e torque</w:t>
+          <w:t xml:space="preserve">Faixa sem torque com o braço baixado</w:t>
         </w:r>
         <w:r>
           <w:tab/>
         </w:r>
         <w:r>
-          <w:t xml:space="preserve">42</w:t>
+          <w:t xml:space="preserve">43</w:t>
         </w:r>
       </w:hyperlink>
     </w:p>
@@ -2365,7 +2365,7 @@
           <w:tab/>
         </w:r>
         <w:r>
-          <w:t xml:space="preserve">Dados da patente</w:t>
+          <w:t xml:space="preserve">Dados da patente e identificação dos parâmetros</w:t>
         </w:r>
         <w:r>
           <w:tab/>
@@ -2382,28 +2382,6 @@
       <w:hyperlink w:anchor="_Toc0049" w:history="1">
         <w:r>
           <w:t xml:space="preserve">3B.10</w:t>
-        </w:r>
-        <w:r>
-          <w:tab/>
-        </w:r>
-        <w:r>
-          <w:t xml:space="preserve">Identificação dos parâmetros a partir da Figura 16 da patente</w:t>
-        </w:r>
-        <w:r>
-          <w:tab/>
-        </w:r>
-        <w:r>
-          <w:t xml:space="preserve">45</w:t>
-        </w:r>
-      </w:hyperlink>
-    </w:p>
-    <w:p>
-      <w:pPr>
-        <w:pStyle w:val="Sumrio3"/>
-      </w:pPr>
-      <w:hyperlink w:anchor="_Toc0050" w:history="1">
-        <w:r>
-          <w:t xml:space="preserve">3B.11</w:t>
         </w:r>
         <w:r>
           <w:tab/>
@@ -2433,9 +2411,9 @@
       <w:pPr>
         <w:pStyle w:val="Sumrio3"/>
       </w:pPr>
-      <w:hyperlink w:anchor="_Toc0051" w:history="1">
+      <w:hyperlink w:anchor="_Toc0050" w:history="1">
         <w:r>
-          <w:t xml:space="preserve">3B.12</w:t>
+          <w:t xml:space="preserve">3B.11</w:t>
         </w:r>
         <w:r>
           <w:tab/>
@@ -2455,9 +2433,9 @@
       <w:pPr>
         <w:pStyle w:val="Sumrio3"/>
       </w:pPr>
-      <w:hyperlink w:anchor="_Toc0052" w:history="1">
+      <w:hyperlink w:anchor="_Toc0051" w:history="1">
         <w:r>
-          <w:t xml:space="preserve">3B.13</w:t>
+          <w:t xml:space="preserve">3B.12</w:t>
         </w:r>
         <w:r>
           <w:tab/>
@@ -2477,9 +2455,9 @@
       <w:pPr>
         <w:pStyle w:val="Sumrio3"/>
       </w:pPr>
-      <w:hyperlink w:anchor="_Toc0053" w:history="1">
+      <w:hyperlink w:anchor="_Toc0052" w:history="1">
         <w:r>
-          <w:t xml:space="preserve">3B.14</w:t>
+          <w:t xml:space="preserve">3B.13</w:t>
         </w:r>
         <w:r>
           <w:tab/>
@@ -2499,7 +2477,7 @@
       <w:pPr>
         <w:pStyle w:val="Sumrio1"/>
       </w:pPr>
-      <w:hyperlink w:anchor="_Toc0054" w:history="1">
+      <w:hyperlink w:anchor="_Toc0053" w:history="1">
         <w:r>
           <w:t xml:space="preserve">4</w:t>
         </w:r>
@@ -2521,7 +2499,7 @@
       <w:pPr>
         <w:pStyle w:val="Sumrio2"/>
       </w:pPr>
-      <w:hyperlink w:anchor="_Toc0055" w:history="1">
+      <w:hyperlink w:anchor="_Toc0054" w:history="1">
         <w:r>
           <w:t xml:space="preserve">4A</w:t>
         </w:r>
@@ -2543,7 +2521,7 @@
       <w:pPr>
         <w:pStyle w:val="Sumrio3"/>
       </w:pPr>
-      <w:hyperlink w:anchor="_Toc0056" w:history="1">
+      <w:hyperlink w:anchor="_Toc0055" w:history="1">
         <w:r>
           <w:t xml:space="preserve">4A.1</w:t>
         </w:r>
@@ -2565,7 +2543,7 @@
       <w:pPr>
         <w:pStyle w:val="Sumrio3"/>
       </w:pPr>
-      <w:hyperlink w:anchor="_Toc0059" w:history="1">
+      <w:hyperlink w:anchor="_Toc0058" w:history="1">
         <w:r>
           <w:t xml:space="preserve">4A.2</w:t>
         </w:r>
@@ -2587,7 +2565,7 @@
       <w:pPr>
         <w:pStyle w:val="Sumrio3"/>
       </w:pPr>
-      <w:hyperlink w:anchor="_Toc0061" w:history="1">
+      <w:hyperlink w:anchor="_Toc0060" w:history="1">
         <w:r>
           <w:t xml:space="preserve">4A.3</w:t>
         </w:r>
@@ -2609,7 +2587,7 @@
       <w:pPr>
         <w:pStyle w:val="Sumrio3"/>
       </w:pPr>
-      <w:hyperlink w:anchor="_Toc0063" w:history="1">
+      <w:hyperlink w:anchor="_Toc0062" w:history="1">
         <w:r>
           <w:t xml:space="preserve">4A.4</w:t>
         </w:r>
@@ -2631,7 +2609,7 @@
       <w:pPr>
         <w:pStyle w:val="Sumrio3"/>
       </w:pPr>
-      <w:hyperlink w:anchor="_Toc0065" w:history="1">
+      <w:hyperlink w:anchor="_Toc0064" w:history="1">
         <w:r>
           <w:t xml:space="preserve">4A.5</w:t>
         </w:r>
@@ -2653,7 +2631,7 @@
       <w:pPr>
         <w:pStyle w:val="Sumrio3"/>
       </w:pPr>
-      <w:hyperlink w:anchor="_Toc0069" w:history="1">
+      <w:hyperlink w:anchor="_Toc0068" w:history="1">
         <w:r>
           <w:t xml:space="preserve">4A.6</w:t>
         </w:r>
@@ -2675,7 +2653,7 @@
       <w:pPr>
         <w:pStyle w:val="Sumrio3"/>
       </w:pPr>
-      <w:hyperlink w:anchor="_Toc0071" w:history="1">
+      <w:hyperlink w:anchor="_Toc0070" w:history="1">
         <w:r>
           <w:t xml:space="preserve">4A.7</w:t>
         </w:r>
@@ -2697,7 +2675,7 @@
       <w:pPr>
         <w:pStyle w:val="Sumrio3"/>
       </w:pPr>
-      <w:hyperlink w:anchor="_Toc0076" w:history="1">
+      <w:hyperlink w:anchor="_Toc0075" w:history="1">
         <w:r>
           <w:t xml:space="preserve">4A.8</w:t>
         </w:r>
@@ -2719,7 +2697,7 @@
       <w:pPr>
         <w:pStyle w:val="Sumrio3"/>
       </w:pPr>
-      <w:hyperlink w:anchor="_Toc0078" w:history="1">
+      <w:hyperlink w:anchor="_Toc0077" w:history="1">
         <w:r>
           <w:t xml:space="preserve">4A.9</w:t>
         </w:r>
@@ -2741,7 +2719,7 @@
       <w:pPr>
         <w:pStyle w:val="Sumrio2"/>
       </w:pPr>
-      <w:hyperlink w:anchor="_Toc0079" w:history="1">
+      <w:hyperlink w:anchor="_Toc0078" w:history="1">
         <w:r>
           <w:t xml:space="preserve">4B</w:t>
         </w:r>
@@ -2763,7 +2741,7 @@
       <w:pPr>
         <w:pStyle w:val="Sumrio3"/>
       </w:pPr>
-      <w:hyperlink w:anchor="_Toc0080" w:history="1">
+      <w:hyperlink w:anchor="_Toc0079" w:history="1">
         <w:r>
           <w:t xml:space="preserve">4B.1</w:t>
         </w:r>
@@ -2785,7 +2763,7 @@
       <w:pPr>
         <w:pStyle w:val="Sumrio3"/>
       </w:pPr>
-      <w:hyperlink w:anchor="_Toc0083" w:history="1">
+      <w:hyperlink w:anchor="_Toc0082" w:history="1">
         <w:r>
           <w:t xml:space="preserve">4B.2</w:t>
         </w:r>
@@ -2807,7 +2785,7 @@
       <w:pPr>
         <w:pStyle w:val="Sumrio3"/>
       </w:pPr>
-      <w:hyperlink w:anchor="_Toc0085" w:history="1">
+      <w:hyperlink w:anchor="_Toc0084" w:history="1">
         <w:r>
           <w:t xml:space="preserve">4B.3</w:t>
         </w:r>
@@ -2829,7 +2807,7 @@
       <w:pPr>
         <w:pStyle w:val="Sumrio3"/>
       </w:pPr>
-      <w:hyperlink w:anchor="_Toc0087" w:history="1">
+      <w:hyperlink w:anchor="_Toc0086" w:history="1">
         <w:r>
           <w:t xml:space="preserve">4B.4</w:t>
         </w:r>
@@ -2860,7 +2838,7 @@
       <w:pPr>
         <w:pStyle w:val="Sumrio3"/>
       </w:pPr>
-      <w:hyperlink w:anchor="_Toc0090" w:history="1">
+      <w:hyperlink w:anchor="_Toc0089" w:history="1">
         <w:r>
           <w:t xml:space="preserve">4B.5</w:t>
         </w:r>
@@ -2882,7 +2860,7 @@
       <w:pPr>
         <w:pStyle w:val="Sumrio3"/>
       </w:pPr>
-      <w:hyperlink w:anchor="_Toc0094" w:history="1">
+      <w:hyperlink w:anchor="_Toc0093" w:history="1">
         <w:r>
           <w:t xml:space="preserve">4B.6</w:t>
         </w:r>
@@ -2904,7 +2882,7 @@
       <w:pPr>
         <w:pStyle w:val="Sumrio3"/>
       </w:pPr>
-      <w:hyperlink w:anchor="_Toc0096" w:history="1">
+      <w:hyperlink w:anchor="_Toc0095" w:history="1">
         <w:r>
           <w:t xml:space="preserve">4B.7</w:t>
         </w:r>
@@ -2926,7 +2904,7 @@
       <w:pPr>
         <w:pStyle w:val="Sumrio3"/>
       </w:pPr>
-      <w:hyperlink w:anchor="_Toc0098" w:history="1">
+      <w:hyperlink w:anchor="_Toc0097" w:history="1">
         <w:r>
           <w:t xml:space="preserve">4B.8</w:t>
         </w:r>
@@ -2958,7 +2936,7 @@
       <w:pPr>
         <w:pStyle w:val="Sumrio3"/>
       </w:pPr>
-      <w:hyperlink w:anchor="_Toc0101" w:history="1">
+      <w:hyperlink w:anchor="_Toc0100" w:history="1">
         <w:r>
           <w:t xml:space="preserve">4B.9</w:t>
         </w:r>
@@ -2980,7 +2958,7 @@
       <w:pPr>
         <w:pStyle w:val="Sumrio3"/>
       </w:pPr>
-      <w:hyperlink w:anchor="_Toc0105" w:history="1">
+      <w:hyperlink w:anchor="_Toc0104" w:history="1">
         <w:r>
           <w:t xml:space="preserve">4B.10</w:t>
         </w:r>
@@ -3002,7 +2980,7 @@
       <w:pPr>
         <w:pStyle w:val="Sumrio3"/>
       </w:pPr>
-      <w:hyperlink w:anchor="_Toc0107" w:history="1">
+      <w:hyperlink w:anchor="_Toc0106" w:history="1">
         <w:r>
           <w:t xml:space="preserve">4B.11</w:t>
         </w:r>
@@ -3024,7 +3002,7 @@
       <w:pPr>
         <w:pStyle w:val="Sumrio1"/>
       </w:pPr>
-      <w:hyperlink w:anchor="_Toc0109" w:history="1">
+      <w:hyperlink w:anchor="_Toc0108" w:history="1">
         <w:r>
           <w:t xml:space="preserve">5</w:t>
         </w:r>
@@ -3046,7 +3024,7 @@
       <w:pPr>
         <w:pStyle w:val="Sumrio2"/>
       </w:pPr>
-      <w:hyperlink w:anchor="_Toc0110" w:history="1">
+      <w:hyperlink w:anchor="_Toc0109" w:history="1">
         <w:r>
           <w:t xml:space="preserve">5A</w:t>
         </w:r>
@@ -3068,7 +3046,7 @@
       <w:pPr>
         <w:pStyle w:val="Sumrio2"/>
       </w:pPr>
-      <w:hyperlink w:anchor="_Toc0111" w:history="1">
+      <w:hyperlink w:anchor="_Toc0110" w:history="1">
         <w:r>
           <w:t xml:space="preserve">5B</w:t>
         </w:r>
@@ -3090,7 +3068,7 @@
       <w:pPr>
         <w:pStyle w:val="Sumrio1"/>
       </w:pPr>
-      <w:hyperlink w:anchor="_Toc0112" w:history="1">
+      <w:hyperlink w:anchor="_Toc0111" w:history="1">
         <w:r>
           <w:t xml:space="preserve">Referências</w:t>
         </w:r>
@@ -4208,7 +4186,7 @@
     </w:p>
     <w:p>
       <w:r>
-        <w:t xml:space="preserve">Quando uma mesma figura reúne curvas do mesmo dispositivo que diferem por um único parâmetro, as razões entre elas eliminam os fatores comuns. Na EP 3 504 033 B1, três curvas foram obtidas com o mesmo atuador e pré-tensões diferentes; admitindo-se que a rigidez, a escala da ordenada, o braço de momento e o torque do peso sejam comuns às três, a razão entre duas curvas depende apenas do comprimento do elástico e das pré-tensões. Essa propriedade permite identificar o comprimento de referência do elástico sem conhecer a escala da ordenada e é a base do procedimento da seção 3B.10.</w:t>
+        <w:t xml:space="preserve">Quando uma mesma figura reúne curvas do mesmo dispositivo que diferem por um único parâmetro, as razões entre elas eliminam os fatores comuns. Na EP 3 504 033 B1, três curvas foram obtidas com o mesmo atuador e pré-tensões diferentes; admitindo-se que a rigidez, a escala da ordenada, o braço de momento e o torque do peso sejam comuns às três, a razão entre duas curvas depende apenas do comprimento do elástico e das pré-tensões. Essa propriedade permite identificar o comprimento de referência do elástico sem conhecer a escala da ordenada e é a base do procedimento da seção 3B.9.</w:t>
       </w:r>
     </w:p>
     <w:p>
@@ -4308,7 +4286,7 @@
     </w:p>
     <w:p>
       <w:r>
-        <w:t xml:space="preserve">A cadeia de cálculo do dispositivo da EP 3 504 033 B1, descrita nas seções 3B.5 a 3B.8, está implementada no arquivo torque_model_ottobock.py, e os números e as figuras da seção 4B são produzidos pelo script tcc_resultados_ottobock.py, que grava os valores citados em results/ottobock_tcc_numeros.json e as figuras em results/, na mesma organização usada por torque_model.py e tcc_resultados.py na seção 4A. O script de resultados não altera parâmetro algum do modelo; as únicas identificações são as descritas na seção 3B.10.</w:t>
+        <w:t xml:space="preserve">A cadeia de cálculo do dispositivo da EP 3 504 033 B1, descrita nas seções 3B.3 a 3B.8, está implementada no arquivo torque_model_ottobock.py, e os números e as figuras da seção 4B são produzidos pelo script tcc_resultados_ottobock.py, que grava os valores citados em results/ottobock_tcc_numeros.json e as figuras em results/, na mesma organização usada por torque_model.py e tcc_resultados.py na seção 4A. O script de resultados não altera parâmetro algum do modelo; as únicas identificações são as descritas na seção 3B.9.</w:t>
       </w:r>
     </w:p>
     <w:p>
@@ -13557,13 +13535,13 @@
         <w:pStyle w:val="SemRecuo"/>
       </w:pPr>
       <w:r>
-        <w:t xml:space="preserve">As seções 3B.1 a 3B.14 aplicam à EP 3 504 033 B1 </w:t>
+        <w:t xml:space="preserve">As seções 3B.1 a 3B.13 aplicam à EP 3 504 033 B1 </w:t>
       </w:r>
       <w:r>
         <w:t xml:space="preserve">(Ottobock, 2023)</w:t>
       </w:r>
       <w:r>
-        <w:t xml:space="preserve"> o procedimento das seções 3A.1 a 3A.13, que foi executado para o gerador de torque da US 9.889.554 B2. Quando uma etapa não se aplica ao mecanismo da Ottobock ou não pôde ser concluída com os dados disponíveis, a própria seção registra o motivo.</w:t>
+        <w:t xml:space="preserve"> o procedimento das seções 3A.1 a 3A.13, que foi executado para o gerador de torque da US 9.889.554 B2, com a mesma numeração: a seção 3B.k corresponde à seção 3A.k. Quando uma etapa não se aplica ao mecanismo da Ottobock ou não pôde ser concluída com os dados disponíveis, a própria seção registra o motivo.</w:t>
       </w:r>
     </w:p>
     <w:p>
@@ -13572,25 +13550,6 @@
       </w:r>
     </w:p>
     <w:p>
-      <w:pPr>
-        <w:pStyle w:val="Ttulo3"/>
-      </w:pPr>
-      <w:bookmarkStart w:id="36" w:name="_Toc0036"/>
-      <w:r>
-        <w:t xml:space="preserve">3B.1</w:t>
-      </w:r>
-      <w:r>
-        <w:tab/>
-      </w:r>
-      <w:r>
-        <w:t xml:space="preserve">Fontes e arquivos utilizados</w:t>
-      </w:r>
-      <w:bookmarkEnd w:id="36"/>
-    </w:p>
-    <w:p>
-      <w:pPr>
-        <w:pStyle w:val="SemRecuo"/>
-      </w:pPr>
       <w:r>
         <w:t xml:space="preserve">A análise usou os documentos e arquivos da Tabela 2. A patente foi lida no documento B1 completo, de 44 páginas, com a descrição, os parágrafos [0001] a [0105], as reivindicações em alemão, inglês e francês e as 29 figuras, que ocupam as páginas 22 a 43 como imagens bitonais de 300 ppp. Os dados bibliográficos conferem com a referência listada: pedido europeu 18729947.4, depositado em 6 jun. 2018 (PCT/EP2018/064910, publicado como WO 2018/224555), prioridade alemã DE 10 2017 112 436, de 6 jun. 2017, e menção da concessão publicada em 29 mar. 2023.</w:t>
       </w:r>
@@ -13601,7 +13560,7 @@
         <w:spacing w:after="258"/>
         <w:jc w:val="center"/>
       </w:pPr>
-      <w:bookmarkStart w:id="37" w:name="_Toc0037"/>
+      <w:bookmarkStart w:id="36" w:name="_Toc0036"/>
       <w:r>
         <w:t xml:space="preserve">Tabela </w:t>
       </w:r>
@@ -13626,7 +13585,7 @@
       <w:r>
         <w:t xml:space="preserve">Fontes e arquivos utilizados na análise da EP 3 504 033 B1</w:t>
       </w:r>
-      <w:bookmarkEnd w:id="37"/>
+      <w:bookmarkEnd w:id="36"/>
     </w:p>
     <w:tbl>
       <w:tblPr>
@@ -14341,24 +14300,24 @@
       <w:pPr>
         <w:pStyle w:val="Ttulo3"/>
       </w:pPr>
-      <w:bookmarkStart w:id="38" w:name="_Toc0038"/>
-      <w:r>
-        <w:t xml:space="preserve">3B.2</w:t>
+      <w:bookmarkStart w:id="37" w:name="_Toc0037"/>
+      <w:r>
+        <w:t xml:space="preserve">3B.1</w:t>
       </w:r>
       <w:r>
         <w:tab/>
       </w:r>
       <w:r>
-        <w:t xml:space="preserve">Arquitetura descrita na patente</w:t>
-      </w:r>
-      <w:bookmarkEnd w:id="38"/>
+        <w:t xml:space="preserve">Reconstrução geométrica em CAD</w:t>
+      </w:r>
+      <w:bookmarkEnd w:id="37"/>
     </w:p>
     <w:p>
       <w:pPr>
         <w:pStyle w:val="SemRecuo"/>
       </w:pPr>
       <w:r>
-        <w:t xml:space="preserve">A EP 3 504 033 B1 descreve um dispositivo de apoio de pelo menos um braço do usuário. O elemento de apoio do braço (6), formado por um elemento distanciador (8) e uma concha (10) e fixado ao braço por uma braçadeira (12), liga-se por uma articulação (20) à extremidade superior de um elemento de transmissão de força (18), uma barra telescópica no exemplo da Figura 1 da patente [0078], [0079]. A extremidade inferior da barra apoia-se, por uma articulação esférica (22), num elemento de contra-apoio (16) em forma de cinto pélvico, de modo que a reação à força de apoio é levada à pelve [0021], [0022], [0079]. Com o dispositivo vestido, a articulação 20 fica aproximadamente na altura da articulação do ombro [0021], [0073].</w:t>
+        <w:t xml:space="preserve">A reconstrução parte da arquitetura descrita na patente. A EP 3 504 033 B1 descreve um dispositivo de apoio de pelo menos um braço do usuário. O elemento de apoio do braço (6), formado por um elemento distanciador (8) e uma concha (10) e fixado ao braço por uma braçadeira (12), liga-se por uma articulação (20) à extremidade superior de um elemento de transmissão de força (18), uma barra telescópica no exemplo da Figura 1 da patente [0078], [0079]. A extremidade inferior da barra apoia-se, por uma articulação esférica (22), num elemento de contra-apoio (16) em forma de cinto pélvico, de modo que a reação à força de apoio é levada à pelve [0021], [0022], [0079]. Com o dispositivo vestido, a articulação 20 fica aproximadamente na altura da articulação do ombro [0021], [0073].</w:t>
       </w:r>
     </w:p>
     <w:p>
@@ -14378,12 +14337,74 @@
     </w:p>
     <w:p>
       <w:r>
-        <w:t xml:space="preserve">Essas informações confirmam o que as seções 2.3 e 2.7 dizem do mecanismo: a força é transmitida por um elemento rígido apoiado na pelve, e o elemento elástico atua sobre um braço de alavanca ajustável. O nome comercial do produto não aparece na patente, de modo que a associação com o Paexo, feita na seção 2.7, não pode ser conferida no documento. A configuração analisada não tem cabo, polia nem tambor: o elástico liga diretamente a barra à alavanca, e a faixa sem torque resulta do contato com o elemento 78. Por isso, as relações de tangência, de caminho do cabo e de ponto morto das seções 3A.4 a 3A.7 não se aplicam e são substituídas pelas das seções 3B.6 e 3B.7.</w:t>
+        <w:t xml:space="preserve">Essas informações confirmam o que as seções 2.3 e 2.7 dizem do mecanismo: a força é transmitida por um elemento rígido apoiado na pelve, e o elemento elástico atua sobre um braço de alavanca ajustável. O nome comercial do produto não aparece na patente, de modo que a associação com o Paexo, feita na seção 2.7, não pode ser conferida no documento. A configuração analisada não tem cabo, polia nem tambor: o elástico liga diretamente a barra à alavanca, e a faixa sem torque resulta do contato com o elemento 78. Por isso, as relações de tangência, de caminho do cabo e de ponto morto das seções 3A.4 a 3A.7 não se aplicam e são substituídas pelas das seções 3B.4 a 3B.7, de mesma numeração.</w:t>
       </w:r>
     </w:p>
     <w:p>
       <w:r>
         <w:t xml:space="preserve">O dispositivo admite abdução, adução e movimentos do tronco (reivindicação 1; [0016] a [0019]). O modelo é plano, restrito ao plano sagital, e representa somente a anteversão, que é o movimento das Figuras 16 e 17 da patente [0092].</w:t>
+      </w:r>
+    </w:p>
+    <w:p>
+      <w:r>
+        <w:t xml:space="preserve">O circuito do mecanismo foi fechado no modelo em CAD do Autodesk Fusion, e as grandezas medidas nesse modelo, com as derivadas delas, estão na Tabela 14 (seção 4B.1). Para o gerador da US 9.889.554 B2, a seção 4A.1 registra o fator de escala de 0,870 e o critério que o fixou. Para a Ottobock, o arquivo do modelo e o critério de escala não constam do repositório, e as medições não têm, por isso, conferência independente. A planilha de composição inercial identifica o modelo como Ottobock iX Shoulder Air; como a patente não nomeia o produto, a correspondência entre esse produto, o modelo em CAD e os desenhos da patente não está documentada. As grandezas são tratadas como medidas em CAD, nos termos da seção 3A.1, e não como dimensões do dispositivo comercial.</w:t>
+      </w:r>
+    </w:p>
+    <w:p>
+      <w:pPr>
+        <w:pStyle w:val="Ttulo3"/>
+      </w:pPr>
+      <w:bookmarkStart w:id="38" w:name="_Toc0038"/>
+      <w:r>
+        <w:t xml:space="preserve">3B.2</w:t>
+      </w:r>
+      <w:r>
+        <w:tab/>
+      </w:r>
+      <w:r>
+        <w:t xml:space="preserve">Parâmetros inerciais do membro e transporte ao eixo da articulação 20</w:t>
+      </w:r>
+      <w:bookmarkEnd w:id="38"/>
+    </w:p>
+    <w:p>
+      <w:pPr>
+        <w:pStyle w:val="SemRecuo"/>
+      </w:pPr>
+      <w:r>
+        <w:t xml:space="preserve">O membro humano segue </w:t>
+      </w:r>
+      <w:r>
+        <w:t xml:space="preserve">de Leva (1996)</w:t>
+      </w:r>
+      <w:r>
+        <w:t xml:space="preserve">, com o mesmo indivíduo de referência da seção 4A: homem de 73,0 kg e 1,741 m, com o cotovelo estendido. Braço, antebraço e mão estão em série a partir de O, alinhados ao eixo do braço; os comprimentos escalam com a estatura dividida por 1,741 m, e as massas são as frações tabeladas da massa corporal. O momento de inércia de cada segmento no centro de massa é M</w:t>
+      </w:r>
+      <w:r>
+        <w:rPr>
+          <w:vertAlign w:val="subscript"/>
+        </w:rPr>
+        <w:t xml:space="preserve">s</w:t>
+      </w:r>
+      <w:r>
+        <w:t xml:space="preserve"> (k L)</w:t>
+      </w:r>
+      <w:r>
+        <w:rPr>
+          <w:vertAlign w:val="superscript"/>
+        </w:rPr>
+        <w:t xml:space="preserve">2</w:t>
+      </w:r>
+      <w:r>
+        <w:t xml:space="preserve">, com M</w:t>
+      </w:r>
+      <w:r>
+        <w:rPr>
+          <w:vertAlign w:val="subscript"/>
+        </w:rPr>
+        <w:t xml:space="preserve">s</w:t>
+      </w:r>
+      <w:r>
+        <w:t xml:space="preserve"> a massa do segmento e k o raio de giração transversal em fração do comprimento L, e o transporte ao eixo usa a Equação (1). A Tabela 15, na seção 4B.1, reúne os resultados, que coincidem com os da planilha do autor.</w:t>
       </w:r>
     </w:p>
     <w:p>
@@ -14398,90 +14419,9 @@
         <w:tab/>
       </w:r>
       <w:r>
-        <w:t xml:space="preserve">Reconstrução geométrica em CAD</w:t>
+        <w:t xml:space="preserve">Referenciais e convenções angulares e de sinal</w:t>
       </w:r>
       <w:bookmarkEnd w:id="39"/>
-    </w:p>
-    <w:p>
-      <w:pPr>
-        <w:pStyle w:val="SemRecuo"/>
-      </w:pPr>
-      <w:r>
-        <w:t xml:space="preserve">O circuito do mecanismo foi fechado no modelo em CAD do Autodesk Fusion, e as grandezas medidas nesse modelo, com as derivadas delas, estão na Tabela 14 (seção 4B.1). Para o gerador da US 9.889.554 B2, a seção 4A.1 registra o fator de escala de 0,870 e o critério que o fixou. Para a Ottobock, o arquivo do modelo e o critério de escala não constam do repositório, e as medições não têm, por isso, conferência independente. A planilha de composição inercial identifica o modelo como Ottobock iX Shoulder Air; como a patente não nomeia o produto (seção 3B.2), a correspondência entre esse produto, o modelo em CAD e os desenhos da patente não está documentada. As grandezas são tratadas como medidas em CAD, nos termos da seção 3A.1, e não como dimensões do dispositivo comercial.</w:t>
-      </w:r>
-    </w:p>
-    <w:p>
-      <w:pPr>
-        <w:pStyle w:val="Ttulo3"/>
-      </w:pPr>
-      <w:bookmarkStart w:id="40" w:name="_Toc0040"/>
-      <w:r>
-        <w:t xml:space="preserve">3B.4</w:t>
-      </w:r>
-      <w:r>
-        <w:tab/>
-      </w:r>
-      <w:r>
-        <w:t xml:space="preserve">Parâmetros inerciais do membro e transporte ao eixo da articulação 20</w:t>
-      </w:r>
-      <w:bookmarkEnd w:id="40"/>
-    </w:p>
-    <w:p>
-      <w:pPr>
-        <w:pStyle w:val="SemRecuo"/>
-      </w:pPr>
-      <w:r>
-        <w:t xml:space="preserve">O membro humano segue </w:t>
-      </w:r>
-      <w:r>
-        <w:t xml:space="preserve">de Leva (1996)</w:t>
-      </w:r>
-      <w:r>
-        <w:t xml:space="preserve">, com o mesmo indivíduo de referência da seção 4A: homem de 73,0 kg e 1,741 m, com o cotovelo estendido. Braço, antebraço e mão estão em série a partir de O, alinhados ao eixo do braço; os comprimentos escalam com a estatura dividida por 1,741 m, e as massas são as frações tabeladas da massa corporal. O momento de inércia de cada segmento no centro de massa é M</w:t>
-      </w:r>
-      <w:r>
-        <w:rPr>
-          <w:vertAlign w:val="subscript"/>
-        </w:rPr>
-        <w:t xml:space="preserve">s</w:t>
-      </w:r>
-      <w:r>
-        <w:t xml:space="preserve"> (k L)</w:t>
-      </w:r>
-      <w:r>
-        <w:rPr>
-          <w:vertAlign w:val="superscript"/>
-        </w:rPr>
-        <w:t xml:space="preserve">2</w:t>
-      </w:r>
-      <w:r>
-        <w:t xml:space="preserve">, com M</w:t>
-      </w:r>
-      <w:r>
-        <w:rPr>
-          <w:vertAlign w:val="subscript"/>
-        </w:rPr>
-        <w:t xml:space="preserve">s</w:t>
-      </w:r>
-      <w:r>
-        <w:t xml:space="preserve"> a massa do segmento e k o raio de giração transversal em fração do comprimento L, e o transporte ao eixo usa a Equação (1). A Tabela 15, na seção 4B.1, reúne os resultados, que coincidem com os da planilha do autor.</w:t>
-      </w:r>
-    </w:p>
-    <w:p>
-      <w:pPr>
-        <w:pStyle w:val="Ttulo3"/>
-      </w:pPr>
-      <w:bookmarkStart w:id="41" w:name="_Toc0041"/>
-      <w:r>
-        <w:t xml:space="preserve">3B.5</w:t>
-      </w:r>
-      <w:r>
-        <w:tab/>
-      </w:r>
-      <w:r>
-        <w:t xml:space="preserve">Referenciais e convenções angulares e de sinal</w:t>
-      </w:r>
-      <w:bookmarkEnd w:id="41"/>
     </w:p>
     <w:p>
       <w:pPr>
@@ -14977,7 +14917,7 @@
         <w:spacing w:after="258"/>
         <w:jc w:val="center"/>
       </w:pPr>
-      <w:bookmarkStart w:id="42" w:name="_Toc0042"/>
+      <w:bookmarkStart w:id="40" w:name="_Toc0040"/>
       <w:r>
         <w:t xml:space="preserve">Tabela </w:t>
       </w:r>
@@ -15002,7 +14942,7 @@
       <w:r>
         <w:t xml:space="preserve">Convenções angulares e de sinal do modelo da Ottobock</w:t>
       </w:r>
-      <w:bookmarkEnd w:id="42"/>
+      <w:bookmarkEnd w:id="40"/>
     </w:p>
     <w:tbl>
       <w:tblPr>
@@ -15869,7 +15809,7 @@
                 <w:sz w:val="22"/>
                 <w:szCs w:val="22"/>
               </w:rPr>
-              <w:t xml:space="preserve">Seção 3B.7</w:t>
+              <w:t xml:space="preserve">Seção 3B.6</w:t>
             </w:r>
           </w:p>
         </w:tc>
@@ -15995,7 +15935,7 @@
                 <w:sz w:val="22"/>
                 <w:szCs w:val="22"/>
               </w:rPr>
-              <w:t xml:space="preserve">Equação (40)</w:t>
+              <w:t xml:space="preserve">Equação (39)</w:t>
             </w:r>
           </w:p>
         </w:tc>
@@ -16106,7 +16046,7 @@
                 <w:sz w:val="22"/>
                 <w:szCs w:val="22"/>
               </w:rPr>
-              <w:t xml:space="preserve">Equação (42)</w:t>
+              <w:t xml:space="preserve">Equação (41)</w:t>
             </w:r>
           </w:p>
         </w:tc>
@@ -16474,7 +16414,7 @@
         <w:t xml:space="preserve">el,pose</w:t>
       </w:r>
       <w:r>
-        <w:t xml:space="preserve"> a 97,962°, e a transição de regime da seção 3B.6 vai de 19,09° para 35,02°. Os efeitos sobre s</w:t>
+        <w:t xml:space="preserve"> a 97,962°, e a transição de regime da seção 3B.5 vai de 19,09° para 35,02°. Os efeitos sobre s</w:t>
       </w:r>
       <w:r>
         <w:rPr>
@@ -16499,17 +16439,17 @@
       <w:pPr>
         <w:pStyle w:val="Ttulo3"/>
       </w:pPr>
-      <w:bookmarkStart w:id="43" w:name="_Toc0043"/>
-      <w:r>
-        <w:t xml:space="preserve">3B.6</w:t>
+      <w:bookmarkStart w:id="41" w:name="_Toc0041"/>
+      <w:r>
+        <w:t xml:space="preserve">3B.4</w:t>
       </w:r>
       <w:r>
         <w:tab/>
       </w:r>
       <w:r>
-        <w:t xml:space="preserve">Cinemática: equações de circuito e troca de regime</w:t>
-      </w:r>
-      <w:bookmarkEnd w:id="43"/>
+        <w:t xml:space="preserve">Equação de fechamento do circuito vetorial</w:t>
+      </w:r>
+      <w:bookmarkEnd w:id="41"/>
     </w:p>
     <w:p>
       <w:pPr>
@@ -18047,6 +17987,25 @@
       </w:tr>
     </w:tbl>
     <w:p>
+      <w:pPr>
+        <w:pStyle w:val="Ttulo3"/>
+      </w:pPr>
+      <w:bookmarkStart w:id="42" w:name="_Toc0042"/>
+      <w:r>
+        <w:t xml:space="preserve">3B.5</w:t>
+      </w:r>
+      <w:r>
+        <w:tab/>
+      </w:r>
+      <w:r>
+        <w:t xml:space="preserve">Ponto de contato e troca de regime</w:t>
+      </w:r>
+      <w:bookmarkEnd w:id="42"/>
+    </w:p>
+    <w:p>
+      <w:pPr>
+        <w:pStyle w:val="SemRecuo"/>
+      </w:pPr>
       <w:r>
         <w:t xml:space="preserve">A troca de regime não é imposta por um ângulo. Ela é detectada pelo sinal do produto vetorial</w:t>
       </w:r>
@@ -18239,347 +18198,11 @@
       </w:r>
     </w:p>
     <w:p>
-      <w:r>
-        <w:t xml:space="preserve">Com o elemento 78 sobre o eixo (p</w:t>
-      </w:r>
-      <w:r>
-        <w:rPr>
-          <w:vertAlign w:val="subscript"/>
-        </w:rPr>
-        <w:t xml:space="preserve">78</w:t>
-      </w:r>
-      <w:r>
-        <w:t xml:space="preserve"> = 0), configuração preferida pela patente [0099], a transição tem forma fechada:</w:t>
-      </w:r>
-    </w:p>
-    <w:tbl>
-      <w:tblPr>
-        <w:tblW w:w="9071" w:type="dxa"/>
-        <w:jc w:val="center"/>
-        <w:tblLayout w:type="fixed"/>
-        <w:tblCellMar>
-          <w:left w:w="0" w:type="dxa"/>
-          <w:right w:w="0" w:type="dxa"/>
-        </w:tblCellMar>
-        <w:tblLook w:val="0000" w:firstRow="0" w:lastRow="0" w:firstColumn="0" w:lastColumn="0" w:noHBand="1" w:noVBand="1"/>
-      </w:tblPr>
-      <w:tblGrid>
-        <w:gridCol w:w="8171"/>
-        <w:gridCol w:w="900"/>
-      </w:tblGrid>
-      <w:tr>
-        <w:trPr>
-          <w:cantSplit/>
-        </w:trPr>
-        <w:tc>
-          <w:tcPr>
-            <w:tcW w:w="8171" w:type="dxa"/>
-            <w:vAlign w:val="center"/>
-          </w:tcPr>
-          <w:p>
-            <w:pPr>
-              <w:pStyle w:val="Equacao"/>
-              <w:spacing w:before="150" w:after="150"/>
-            </w:pPr>
-            <m:oMathPara>
-              <m:oMathParaPr>
-                <m:jc m:val="center"/>
-              </m:oMathParaPr>
-              <m:oMath>
-                <m:sSub>
-                  <m:e>
-                    <m:r>
-                      <m:t>λ</m:t>
-                    </m:r>
-                  </m:e>
-                  <m:sub>
-                    <m:r>
-                      <m:t>t</m:t>
-                    </m:r>
-                  </m:sub>
-                </m:sSub>
-                <m:r>
-                  <m:rPr>
-                    <m:sty m:val="p"/>
-                  </m:rPr>
-                  <m:t>=</m:t>
-                </m:r>
-                <m:func>
-                  <m:fName>
-                    <m:r>
-                      <m:rPr>
-                        <m:sty m:val="p"/>
-                      </m:rPr>
-                      <m:t>atan2</m:t>
-                    </m:r>
-                  </m:fName>
-                  <m:e>
-                    <m:d>
-                      <m:dPr>
-                        <m:begChr m:val="("/>
-                        <m:sepChr m:val=""/>
-                        <m:endChr m:val=")"/>
-                        <m:grow/>
-                      </m:dPr>
-                      <m:e>
-                        <m:sSub>
-                          <m:e>
-                            <m:r>
-                              <m:t>r</m:t>
-                            </m:r>
-                          </m:e>
-                          <m:sub>
-                            <m:r>
-                              <m:t>A</m:t>
-                            </m:r>
-                            <m:r>
-                              <m:t>O</m:t>
-                            </m:r>
-                            <m:r>
-                              <m:rPr>
-                                <m:sty m:val="p"/>
-                              </m:rPr>
-                              <m:t>,</m:t>
-                            </m:r>
-                            <m:r>
-                              <m:t>y</m:t>
-                            </m:r>
-                          </m:sub>
-                        </m:sSub>
-                        <m:r>
-                          <m:rPr>
-                            <m:sty m:val="p"/>
-                          </m:rPr>
-                          <m:t>,</m:t>
-                        </m:r>
-                        <m:r>
-                          <m:t> </m:t>
-                        </m:r>
-                        <m:sSub>
-                          <m:e>
-                            <m:r>
-                              <m:t>r</m:t>
-                            </m:r>
-                          </m:e>
-                          <m:sub>
-                            <m:r>
-                              <m:t>A</m:t>
-                            </m:r>
-                            <m:r>
-                              <m:t>O</m:t>
-                            </m:r>
-                            <m:r>
-                              <m:rPr>
-                                <m:sty m:val="p"/>
-                              </m:rPr>
-                              <m:t>,</m:t>
-                            </m:r>
-                            <m:r>
-                              <m:t>x</m:t>
-                            </m:r>
-                          </m:sub>
-                        </m:sSub>
-                      </m:e>
-                    </m:d>
-                  </m:e>
-                </m:func>
-                <m:r>
-                  <m:rPr>
-                    <m:sty m:val="p"/>
-                  </m:rPr>
-                  <m:t>−</m:t>
-                </m:r>
-                <m:r>
-                  <m:t>ε</m:t>
-                </m:r>
-                <m:r>
-                  <m:rPr>
-                    <m:sty m:val="p"/>
-                  </m:rPr>
-                  <m:t>,</m:t>
-                </m:r>
-                <m:r>
-                  <m:t> </m:t>
-                </m:r>
-                <m:r>
-                  <m:t>ε</m:t>
-                </m:r>
-                <m:r>
-                  <m:rPr>
-                    <m:sty m:val="p"/>
-                  </m:rPr>
-                  <m:t>=</m:t>
-                </m:r>
-                <m:func>
-                  <m:fName>
-                    <m:r>
-                      <m:rPr>
-                        <m:sty m:val="p"/>
-                      </m:rPr>
-                      <m:t>atan2</m:t>
-                    </m:r>
-                  </m:fName>
-                  <m:e>
-                    <m:d>
-                      <m:dPr>
-                        <m:begChr m:val="("/>
-                        <m:sepChr m:val=""/>
-                        <m:endChr m:val=")"/>
-                        <m:grow/>
-                      </m:dPr>
-                      <m:e>
-                        <m:sSub>
-                          <m:e>
-                            <m:r>
-                              <m:t>C</m:t>
-                            </m:r>
-                          </m:e>
-                          <m:sub>
-                            <m:r>
-                              <m:t>3</m:t>
-                            </m:r>
-                          </m:sub>
-                        </m:sSub>
-                        <m:r>
-                          <m:rPr>
-                            <m:sty m:val="p"/>
-                          </m:rPr>
-                          <m:t>sin</m:t>
-                        </m:r>
-                        <m:sSub>
-                          <m:e>
-                            <m:r>
-                              <m:t>β</m:t>
-                            </m:r>
-                          </m:e>
-                          <m:sub>
-                            <m:r>
-                              <m:t>c</m:t>
-                            </m:r>
-                          </m:sub>
-                        </m:sSub>
-                        <m:r>
-                          <m:rPr>
-                            <m:sty m:val="p"/>
-                          </m:rPr>
-                          <m:t>,</m:t>
-                        </m:r>
-                        <m:r>
-                          <m:t> </m:t>
-                        </m:r>
-                        <m:r>
-                          <m:t>e</m:t>
-                        </m:r>
-                        <m:r>
-                          <m:rPr>
-                            <m:sty m:val="p"/>
-                          </m:rPr>
-                          <m:t>+</m:t>
-                        </m:r>
-                        <m:sSub>
-                          <m:e>
-                            <m:r>
-                              <m:t>C</m:t>
-                            </m:r>
-                          </m:e>
-                          <m:sub>
-                            <m:r>
-                              <m:t>3</m:t>
-                            </m:r>
-                          </m:sub>
-                        </m:sSub>
-                        <m:r>
-                          <m:rPr>
-                            <m:sty m:val="p"/>
-                          </m:rPr>
-                          <m:t>cos</m:t>
-                        </m:r>
-                        <m:sSub>
-                          <m:e>
-                            <m:r>
-                              <m:t>β</m:t>
-                            </m:r>
-                          </m:e>
-                          <m:sub>
-                            <m:r>
-                              <m:t>c</m:t>
-                            </m:r>
-                          </m:sub>
-                        </m:sSub>
-                      </m:e>
-                    </m:d>
-                  </m:e>
-                </m:func>
-              </m:oMath>
-            </m:oMathPara>
-          </w:p>
-        </w:tc>
-        <w:tc>
-          <w:tcPr>
-            <w:tcW w:w="900" w:type="dxa"/>
-            <w:vAlign w:val="center"/>
-          </w:tcPr>
-          <w:p>
-            <w:pPr>
-              <w:pStyle w:val="Equacao"/>
-              <w:spacing w:before="150" w:after="150"/>
-              <w:jc w:val="right"/>
-            </w:pPr>
-            <w:r>
-              <w:t xml:space="preserve">(39)</w:t>
-            </w:r>
-          </w:p>
-        </w:tc>
-      </w:tr>
-    </w:tbl>
-    <w:p>
-      <w:r>
-        <w:t xml:space="preserve">em que ε é o ângulo fixo de OP em relação ao trecho </w:t>
-      </w:r>
-      <w:r>
-        <w:rPr>
-          <w:i/>
-          <w:iCs/>
-        </w:rPr>
-        <w:t xml:space="preserve">e</w:t>
-      </w:r>
-      <w:r>
-        <w:t xml:space="preserve">. Nesse caso, a direção de OP na transição coincide com a de r</w:t>
-      </w:r>
-      <w:r>
-        <w:rPr>
-          <w:vertAlign w:val="subscript"/>
-        </w:rPr>
-        <w:t xml:space="preserve">AO</w:t>
-      </w:r>
-      <w:r>
-        <w:t xml:space="preserve">, a reta do elástico passa pelo pivô e o torque no regime II é nulo. Com as demais grandezas do CAD, a Equação (39) dá θ</w:t>
-      </w:r>
-      <w:r>
-        <w:rPr>
-          <w:vertAlign w:val="subscript"/>
-        </w:rPr>
-        <w:t xml:space="preserve">el,t</w:t>
-      </w:r>
-      <w:r>
-        <w:t xml:space="preserve"> = 11,765°. As curvas da Figura 16 da patente partem de razão nula entre 14,23° e 14,36° (seção 4B.2), entre os dois valores do modelo; só no caso p</w:t>
-      </w:r>
-      <w:r>
-        <w:rPr>
-          <w:vertAlign w:val="subscript"/>
-        </w:rPr>
-        <w:t xml:space="preserve">78</w:t>
-      </w:r>
-      <w:r>
-        <w:t xml:space="preserve"> = 0, porém, o modelo tem torque nulo antes da transição (seção 4B.9).</w:t>
-      </w:r>
-    </w:p>
-    <w:p>
       <w:pPr>
         <w:pStyle w:val="Legenda"/>
         <w:jc w:val="both"/>
       </w:pPr>
-      <w:bookmarkStart w:id="44" w:name="_Toc0044"/>
+      <w:bookmarkStart w:id="43" w:name="_Toc0043"/>
       <w:r>
         <w:t xml:space="preserve">Figura </w:t>
       </w:r>
@@ -18622,7 +18245,7 @@
       <w:r>
         <w:t xml:space="preserve"> = 10° (regime II)</w:t>
       </w:r>
-      <w:bookmarkEnd w:id="44"/>
+      <w:bookmarkEnd w:id="43"/>
     </w:p>
     <w:p>
       <w:pPr>
@@ -18694,17 +18317,17 @@
       <w:pPr>
         <w:pStyle w:val="Ttulo3"/>
       </w:pPr>
-      <w:bookmarkStart w:id="45" w:name="_Toc0045"/>
-      <w:r>
-        <w:t xml:space="preserve">3B.7</w:t>
+      <w:bookmarkStart w:id="44" w:name="_Toc0044"/>
+      <w:r>
+        <w:t xml:space="preserve">3B.6</w:t>
       </w:r>
       <w:r>
         <w:tab/>
       </w:r>
       <w:r>
-        <w:t xml:space="preserve">Força elástica e torque</w:t>
-      </w:r>
-      <w:bookmarkEnd w:id="45"/>
+        <w:t xml:space="preserve">Comprimento do elástico, lei da mola e torque</w:t>
+      </w:r>
+      <w:bookmarkEnd w:id="44"/>
     </w:p>
     <w:p>
       <w:pPr>
@@ -18855,7 +18478,7 @@
               <w:jc w:val="right"/>
             </w:pPr>
             <w:r>
-              <w:t xml:space="preserve">(40)</w:t>
+              <w:t xml:space="preserve">(39)</w:t>
             </w:r>
           </w:p>
         </w:tc>
@@ -18935,7 +18558,7 @@
         <w:t xml:space="preserve">pre</w:t>
       </w:r>
       <w:r>
-        <w:t xml:space="preserve">, análoga à Equação (18); e identificada a partir das curvas da Figura 16 da patente (seção 3B.10). As duas primeiras usam K = 9 N/mm, valor ilustrativo sem origem documental, e não produzem resultados neste trabalho; a terceira é a adotada, com s</w:t>
+        <w:t xml:space="preserve">, análoga à Equação (18); e identificada a partir das curvas da Figura 16 da patente (seção 3B.9). As duas primeiras usam K = 9 N/mm, valor ilustrativo sem origem documental, e não produzem resultados neste trabalho; a terceira é a adotada, com s</w:t>
       </w:r>
       <w:r>
         <w:rPr>
@@ -19232,7 +18855,7 @@
               <w:jc w:val="right"/>
             </w:pPr>
             <w:r>
-              <w:t xml:space="preserve">(41)</w:t>
+              <w:t xml:space="preserve">(40)</w:t>
             </w:r>
           </w:p>
         </w:tc>
@@ -19607,7 +19230,7 @@
               <w:jc w:val="right"/>
             </w:pPr>
             <w:r>
-              <w:t xml:space="preserve">(42)</w:t>
+              <w:t xml:space="preserve">(41)</w:t>
             </w:r>
           </w:p>
         </w:tc>
@@ -19725,7 +19348,7 @@
               <w:jc w:val="right"/>
             </w:pPr>
             <w:r>
-              <w:t xml:space="preserve">(43)</w:t>
+              <w:t xml:space="preserve">(42)</w:t>
             </w:r>
           </w:p>
         </w:tc>
@@ -19734,6 +19357,379 @@
     <w:p>
       <w:r>
         <w:t xml:space="preserve">com λ em radianos, relação análoga à Equação (17), verificada numericamente nos dois regimes (seção 4B.3). O sinal negativo, oposto ao da Equação (17), vem de λ crescer com a elevação do braço, ao passo que θ* decresce; nos dois mecanismos, m é positivo quando assiste a subida, e o elástico se encurta quando o braço sobe e devolve energia, como descreve [0034].</w:t>
+      </w:r>
+    </w:p>
+    <w:p>
+      <w:pPr>
+        <w:pStyle w:val="Ttulo3"/>
+      </w:pPr>
+      <w:bookmarkStart w:id="45" w:name="_Toc0045"/>
+      <w:r>
+        <w:t xml:space="preserve">3B.7</w:t>
+      </w:r>
+      <w:r>
+        <w:tab/>
+      </w:r>
+      <w:r>
+        <w:t xml:space="preserve">Faixa sem torque com o braço baixado</w:t>
+      </w:r>
+      <w:bookmarkEnd w:id="45"/>
+    </w:p>
+    <w:p>
+      <w:pPr>
+        <w:pStyle w:val="SemRecuo"/>
+      </w:pPr>
+      <w:r>
+        <w:t xml:space="preserve">Esta seção faz o papel da seção 3A.7: indica onde o modelo libera o braço. Pela Equação (41), m</w:t>
+      </w:r>
+      <w:r>
+        <w:rPr>
+          <w:vertAlign w:val="subscript"/>
+        </w:rPr>
+        <w:t xml:space="preserve">II</w:t>
+      </w:r>
+      <w:r>
+        <w:t xml:space="preserve"> é proporcional a p</w:t>
+      </w:r>
+      <w:r>
+        <w:rPr>
+          <w:vertAlign w:val="subscript"/>
+        </w:rPr>
+        <w:t xml:space="preserve">78</w:t>
+      </w:r>
+      <w:r>
+        <w:t xml:space="preserve">, de modo que, abaixo da transição, o torque só se anula se o elemento 78 estiver sobre o eixo. Com o elemento 78 sobre o eixo (p</w:t>
+      </w:r>
+      <w:r>
+        <w:rPr>
+          <w:vertAlign w:val="subscript"/>
+        </w:rPr>
+        <w:t xml:space="preserve">78</w:t>
+      </w:r>
+      <w:r>
+        <w:t xml:space="preserve"> = 0), configuração preferida pela patente [0099], a transição tem forma fechada:</w:t>
+      </w:r>
+    </w:p>
+    <w:tbl>
+      <w:tblPr>
+        <w:tblW w:w="9071" w:type="dxa"/>
+        <w:jc w:val="center"/>
+        <w:tblLayout w:type="fixed"/>
+        <w:tblCellMar>
+          <w:left w:w="0" w:type="dxa"/>
+          <w:right w:w="0" w:type="dxa"/>
+        </w:tblCellMar>
+        <w:tblLook w:val="0000" w:firstRow="0" w:lastRow="0" w:firstColumn="0" w:lastColumn="0" w:noHBand="1" w:noVBand="1"/>
+      </w:tblPr>
+      <w:tblGrid>
+        <w:gridCol w:w="8171"/>
+        <w:gridCol w:w="900"/>
+      </w:tblGrid>
+      <w:tr>
+        <w:trPr>
+          <w:cantSplit/>
+        </w:trPr>
+        <w:tc>
+          <w:tcPr>
+            <w:tcW w:w="8171" w:type="dxa"/>
+            <w:vAlign w:val="center"/>
+          </w:tcPr>
+          <w:p>
+            <w:pPr>
+              <w:pStyle w:val="Equacao"/>
+              <w:spacing w:before="150" w:after="150"/>
+            </w:pPr>
+            <m:oMathPara>
+              <m:oMathParaPr>
+                <m:jc m:val="center"/>
+              </m:oMathParaPr>
+              <m:oMath>
+                <m:sSub>
+                  <m:e>
+                    <m:r>
+                      <m:t>λ</m:t>
+                    </m:r>
+                  </m:e>
+                  <m:sub>
+                    <m:r>
+                      <m:t>t</m:t>
+                    </m:r>
+                  </m:sub>
+                </m:sSub>
+                <m:r>
+                  <m:rPr>
+                    <m:sty m:val="p"/>
+                  </m:rPr>
+                  <m:t>=</m:t>
+                </m:r>
+                <m:func>
+                  <m:fName>
+                    <m:r>
+                      <m:rPr>
+                        <m:sty m:val="p"/>
+                      </m:rPr>
+                      <m:t>atan2</m:t>
+                    </m:r>
+                  </m:fName>
+                  <m:e>
+                    <m:d>
+                      <m:dPr>
+                        <m:begChr m:val="("/>
+                        <m:sepChr m:val=""/>
+                        <m:endChr m:val=")"/>
+                        <m:grow/>
+                      </m:dPr>
+                      <m:e>
+                        <m:sSub>
+                          <m:e>
+                            <m:r>
+                              <m:t>r</m:t>
+                            </m:r>
+                          </m:e>
+                          <m:sub>
+                            <m:r>
+                              <m:t>A</m:t>
+                            </m:r>
+                            <m:r>
+                              <m:t>O</m:t>
+                            </m:r>
+                            <m:r>
+                              <m:rPr>
+                                <m:sty m:val="p"/>
+                              </m:rPr>
+                              <m:t>,</m:t>
+                            </m:r>
+                            <m:r>
+                              <m:t>y</m:t>
+                            </m:r>
+                          </m:sub>
+                        </m:sSub>
+                        <m:r>
+                          <m:rPr>
+                            <m:sty m:val="p"/>
+                          </m:rPr>
+                          <m:t>,</m:t>
+                        </m:r>
+                        <m:r>
+                          <m:t> </m:t>
+                        </m:r>
+                        <m:sSub>
+                          <m:e>
+                            <m:r>
+                              <m:t>r</m:t>
+                            </m:r>
+                          </m:e>
+                          <m:sub>
+                            <m:r>
+                              <m:t>A</m:t>
+                            </m:r>
+                            <m:r>
+                              <m:t>O</m:t>
+                            </m:r>
+                            <m:r>
+                              <m:rPr>
+                                <m:sty m:val="p"/>
+                              </m:rPr>
+                              <m:t>,</m:t>
+                            </m:r>
+                            <m:r>
+                              <m:t>x</m:t>
+                            </m:r>
+                          </m:sub>
+                        </m:sSub>
+                      </m:e>
+                    </m:d>
+                  </m:e>
+                </m:func>
+                <m:r>
+                  <m:rPr>
+                    <m:sty m:val="p"/>
+                  </m:rPr>
+                  <m:t>−</m:t>
+                </m:r>
+                <m:r>
+                  <m:t>ε</m:t>
+                </m:r>
+                <m:r>
+                  <m:rPr>
+                    <m:sty m:val="p"/>
+                  </m:rPr>
+                  <m:t>,</m:t>
+                </m:r>
+                <m:r>
+                  <m:t> </m:t>
+                </m:r>
+                <m:r>
+                  <m:t>ε</m:t>
+                </m:r>
+                <m:r>
+                  <m:rPr>
+                    <m:sty m:val="p"/>
+                  </m:rPr>
+                  <m:t>=</m:t>
+                </m:r>
+                <m:func>
+                  <m:fName>
+                    <m:r>
+                      <m:rPr>
+                        <m:sty m:val="p"/>
+                      </m:rPr>
+                      <m:t>atan2</m:t>
+                    </m:r>
+                  </m:fName>
+                  <m:e>
+                    <m:d>
+                      <m:dPr>
+                        <m:begChr m:val="("/>
+                        <m:sepChr m:val=""/>
+                        <m:endChr m:val=")"/>
+                        <m:grow/>
+                      </m:dPr>
+                      <m:e>
+                        <m:sSub>
+                          <m:e>
+                            <m:r>
+                              <m:t>C</m:t>
+                            </m:r>
+                          </m:e>
+                          <m:sub>
+                            <m:r>
+                              <m:t>3</m:t>
+                            </m:r>
+                          </m:sub>
+                        </m:sSub>
+                        <m:r>
+                          <m:rPr>
+                            <m:sty m:val="p"/>
+                          </m:rPr>
+                          <m:t>sin</m:t>
+                        </m:r>
+                        <m:sSub>
+                          <m:e>
+                            <m:r>
+                              <m:t>β</m:t>
+                            </m:r>
+                          </m:e>
+                          <m:sub>
+                            <m:r>
+                              <m:t>c</m:t>
+                            </m:r>
+                          </m:sub>
+                        </m:sSub>
+                        <m:r>
+                          <m:rPr>
+                            <m:sty m:val="p"/>
+                          </m:rPr>
+                          <m:t>,</m:t>
+                        </m:r>
+                        <m:r>
+                          <m:t> </m:t>
+                        </m:r>
+                        <m:r>
+                          <m:t>e</m:t>
+                        </m:r>
+                        <m:r>
+                          <m:rPr>
+                            <m:sty m:val="p"/>
+                          </m:rPr>
+                          <m:t>+</m:t>
+                        </m:r>
+                        <m:sSub>
+                          <m:e>
+                            <m:r>
+                              <m:t>C</m:t>
+                            </m:r>
+                          </m:e>
+                          <m:sub>
+                            <m:r>
+                              <m:t>3</m:t>
+                            </m:r>
+                          </m:sub>
+                        </m:sSub>
+                        <m:r>
+                          <m:rPr>
+                            <m:sty m:val="p"/>
+                          </m:rPr>
+                          <m:t>cos</m:t>
+                        </m:r>
+                        <m:sSub>
+                          <m:e>
+                            <m:r>
+                              <m:t>β</m:t>
+                            </m:r>
+                          </m:e>
+                          <m:sub>
+                            <m:r>
+                              <m:t>c</m:t>
+                            </m:r>
+                          </m:sub>
+                        </m:sSub>
+                      </m:e>
+                    </m:d>
+                  </m:e>
+                </m:func>
+              </m:oMath>
+            </m:oMathPara>
+          </w:p>
+        </w:tc>
+        <w:tc>
+          <w:tcPr>
+            <w:tcW w:w="900" w:type="dxa"/>
+            <w:vAlign w:val="center"/>
+          </w:tcPr>
+          <w:p>
+            <w:pPr>
+              <w:pStyle w:val="Equacao"/>
+              <w:spacing w:before="150" w:after="150"/>
+              <w:jc w:val="right"/>
+            </w:pPr>
+            <w:r>
+              <w:t xml:space="preserve">(43)</w:t>
+            </w:r>
+          </w:p>
+        </w:tc>
+      </w:tr>
+    </w:tbl>
+    <w:p>
+      <w:r>
+        <w:t xml:space="preserve">em que ε é o ângulo fixo de OP em relação ao trecho </w:t>
+      </w:r>
+      <w:r>
+        <w:rPr>
+          <w:i/>
+          <w:iCs/>
+        </w:rPr>
+        <w:t xml:space="preserve">e</w:t>
+      </w:r>
+      <w:r>
+        <w:t xml:space="preserve">. Nesse caso, a direção de OP na transição coincide com a de r</w:t>
+      </w:r>
+      <w:r>
+        <w:rPr>
+          <w:vertAlign w:val="subscript"/>
+        </w:rPr>
+        <w:t xml:space="preserve">AO</w:t>
+      </w:r>
+      <w:r>
+        <w:t xml:space="preserve">, a reta do elástico passa pelo pivô e o torque no regime II é nulo. Com as demais grandezas do CAD, a Equação (43) dá θ</w:t>
+      </w:r>
+      <w:r>
+        <w:rPr>
+          <w:vertAlign w:val="subscript"/>
+        </w:rPr>
+        <w:t xml:space="preserve">el,t</w:t>
+      </w:r>
+      <w:r>
+        <w:t xml:space="preserve"> = 11,765°. As curvas da Figura 16 da patente partem de razão nula entre 14,23° e 14,36° (seção 4B.2), entre os dois valores do modelo; só no caso p</w:t>
+      </w:r>
+      <w:r>
+        <w:rPr>
+          <w:vertAlign w:val="subscript"/>
+        </w:rPr>
+        <w:t xml:space="preserve">78</w:t>
+      </w:r>
+      <w:r>
+        <w:t xml:space="preserve"> = 0, porém, o modelo tem torque nulo antes da transição (seção 4B.9).</w:t>
       </w:r>
     </w:p>
     <w:p>
@@ -20039,7 +20035,7 @@
         <w:tab/>
       </w:r>
       <w:r>
-        <w:t xml:space="preserve">Dados da patente</w:t>
+        <w:t xml:space="preserve">Dados da patente e identificação dos parâmetros</w:t>
       </w:r>
       <w:bookmarkEnd w:id="47"/>
     </w:p>
@@ -20170,7 +20166,7 @@
     </w:p>
     <w:p>
       <w:r>
-        <w:t xml:space="preserve">Os pontos das três curvas foram extraídos pelo autor e estão no arquivo fig16_curvas.csv (Tabela 16). A extração, a segunda realizada, dividiu a leitura vertical por 21,1311 para obter a razão em divisões da grade, manteve a abscissa sem correção e teve erro mediano de sobreposição inferior a 0,5 px; a imagem e a resolução usadas na leitura não foram registradas. No documento B1, a figura está gravada a 300 ppp, com cerca de 215,7 px por divisão vertical e 266,2 px para 20° da abscissa. Se o erro de 0,5 px se refere à unidade da leitura vertical, ele corresponde a 0,024 divisão na ordenada e, na mesma unidade, a 0,38° na abscissa. A incerteza da extração não foi avaliada de forma independente; a seção 3B.10 propaga esse erro mediano à identificação por sorteio.</w:t>
+        <w:t xml:space="preserve">Os pontos das três curvas foram extraídos pelo autor e estão no arquivo fig16_curvas.csv (Tabela 16). A extração, a segunda realizada, dividiu a leitura vertical por 21,1311 para obter a razão em divisões da grade, manteve a abscissa sem correção e teve erro mediano de sobreposição inferior a 0,5 px; a imagem e a resolução usadas na leitura não foram registradas. No documento B1, a figura está gravada a 300 ppp, com cerca de 215,7 px por divisão vertical e 266,2 px para 20° da abscissa. Se o erro de 0,5 px se refere à unidade da leitura vertical, ele corresponde a 0,024 divisão na ordenada e, na mesma unidade, a 0,38° na abscissa. A incerteza da extração não foi avaliada de forma independente; a identificação, adiante, propaga esse erro mediano à identificação por sorteio.</w:t>
       </w:r>
     </w:p>
     <w:p>
@@ -20179,25 +20175,6 @@
       </w:r>
     </w:p>
     <w:p>
-      <w:pPr>
-        <w:pStyle w:val="Ttulo3"/>
-      </w:pPr>
-      <w:bookmarkStart w:id="49" w:name="_Toc0049"/>
-      <w:r>
-        <w:t xml:space="preserve">3B.10</w:t>
-      </w:r>
-      <w:r>
-        <w:tab/>
-      </w:r>
-      <w:r>
-        <w:t xml:space="preserve">Identificação dos parâmetros a partir da Figura 16 da patente</w:t>
-      </w:r>
-      <w:bookmarkEnd w:id="49"/>
-    </w:p>
-    <w:p>
-      <w:pPr>
-        <w:pStyle w:val="SemRecuo"/>
-      </w:pPr>
       <w:r>
         <w:t xml:space="preserve">A Figura 16 da patente informa s</w:t>
       </w:r>
@@ -20974,7 +20951,7 @@
         <w:t xml:space="preserve">el</w:t>
       </w:r>
       <w:r>
-        <w:t xml:space="preserve">) do circuito da seção 3B.6: não depende de K, de σ, de m nem de τ</w:t>
+        <w:t xml:space="preserve">) do circuito da seção 3B.4: não depende de K, de σ, de m nem de τ</w:t>
       </w:r>
       <w:r>
         <w:rPr>
@@ -21056,7 +21033,7 @@
         <w:t xml:space="preserve">el</w:t>
       </w:r>
       <w:r>
-        <w:t xml:space="preserve">, Equação (43), o elástico afrouxa primeiro com o braço elevado, e a razão da curva menos tensionada deve chegar a zero onde ℓ = s</w:t>
+        <w:t xml:space="preserve">, Equação (42), o elástico afrouxa primeiro com o braço elevado, e a razão da curva menos tensionada deve chegar a zero onde ℓ = s</w:t>
       </w:r>
       <w:r>
         <w:rPr>
@@ -22188,9 +22165,9 @@
       <w:pPr>
         <w:pStyle w:val="Ttulo3"/>
       </w:pPr>
-      <w:bookmarkStart w:id="50" w:name="_Toc0050"/>
-      <w:r>
-        <w:t xml:space="preserve">3B.11</w:t>
+      <w:bookmarkStart w:id="49" w:name="_Toc0049"/>
+      <w:r>
+        <w:t xml:space="preserve">3B.10</w:t>
       </w:r>
       <w:r>
         <w:tab/>
@@ -22208,7 +22185,7 @@
       <w:r>
         <w:t xml:space="preserve"> da alavanca</w:t>
       </w:r>
-      <w:bookmarkEnd w:id="50"/>
+      <w:bookmarkEnd w:id="49"/>
     </w:p>
     <w:p>
       <w:pPr>
@@ -22279,9 +22256,9 @@
       <w:pPr>
         <w:pStyle w:val="Ttulo3"/>
       </w:pPr>
-      <w:bookmarkStart w:id="51" w:name="_Toc0051"/>
-      <w:r>
-        <w:t xml:space="preserve">3B.12</w:t>
+      <w:bookmarkStart w:id="50" w:name="_Toc0050"/>
+      <w:r>
+        <w:t xml:space="preserve">3B.11</w:t>
       </w:r>
       <w:r>
         <w:tab/>
@@ -22289,7 +22266,7 @@
       <w:r>
         <w:t xml:space="preserve">Verificações numéricas</w:t>
       </w:r>
-      <w:bookmarkEnd w:id="51"/>
+      <w:bookmarkEnd w:id="50"/>
     </w:p>
     <w:p>
       <w:pPr>
@@ -22385,16 +22362,16 @@
         <w:t xml:space="preserve">e</w:t>
       </w:r>
       <w:r>
-        <w:t xml:space="preserve"> produzem curvas diferentes. Não há, para este modelo, um conjunto de testes automatizados executado com o pytest como o da seção 3A.11; as verificações são asserções executadas a cada cálculo, e a identificação pelo espaçamento entre as curvas é conferida pelo teste sintético da seção 3B.10.</w:t>
+        <w:t xml:space="preserve"> produzem curvas diferentes. Não há, para este modelo, um conjunto de testes automatizados executado com o pytest como o da seção 3A.11; as verificações são asserções executadas a cada cálculo, e a identificação pelo espaçamento entre as curvas é conferida pelo teste sintético da seção 3B.9.</w:t>
       </w:r>
     </w:p>
     <w:p>
       <w:pPr>
         <w:pStyle w:val="Ttulo3"/>
       </w:pPr>
-      <w:bookmarkStart w:id="52" w:name="_Toc0052"/>
-      <w:r>
-        <w:t xml:space="preserve">3B.13</w:t>
+      <w:bookmarkStart w:id="51" w:name="_Toc0051"/>
+      <w:r>
+        <w:t xml:space="preserve">3B.12</w:t>
       </w:r>
       <w:r>
         <w:tab/>
@@ -22402,7 +22379,7 @@
       <w:r>
         <w:t xml:space="preserve">Etapas dinâmicas previstas</w:t>
       </w:r>
-      <w:bookmarkEnd w:id="52"/>
+      <w:bookmarkEnd w:id="51"/>
     </w:p>
     <w:p>
       <w:pPr>
@@ -22659,7 +22636,7 @@
         <w:t xml:space="preserve">nc</w:t>
       </w:r>
       <w:r>
-        <w:t xml:space="preserve"> reúne os esforços não conservativos. Pela Equação (43), a energia elástica V</w:t>
+        <w:t xml:space="preserve"> reúne os esforços não conservativos. Pela Equação (42), a energia elástica V</w:t>
       </w:r>
       <w:r>
         <w:rPr>
@@ -22686,7 +22663,7 @@
         <w:t xml:space="preserve">e</w:t>
       </w:r>
       <w:r>
-        <w:t xml:space="preserve">/dλ = −K δ m, de modo que a força generalizada elástica coincide, a menos do fator 1/1000, com o torque da Equação (42); esse pré-requisito estático está verificado (Tabela 17).</w:t>
+        <w:t xml:space="preserve">/dλ = −K δ m, de modo que a força generalizada elástica coincide, a menos do fator 1/1000, com o torque da Equação (41); esse pré-requisito estático está verificado (Tabela 17).</w:t>
       </w:r>
     </w:p>
     <w:p>
@@ -22734,9 +22711,9 @@
       <w:pPr>
         <w:pStyle w:val="Ttulo3"/>
       </w:pPr>
-      <w:bookmarkStart w:id="53" w:name="_Toc0053"/>
-      <w:r>
-        <w:t xml:space="preserve">3B.14</w:t>
+      <w:bookmarkStart w:id="52" w:name="_Toc0052"/>
+      <w:r>
+        <w:t xml:space="preserve">3B.13</w:t>
       </w:r>
       <w:r>
         <w:tab/>
@@ -22744,7 +22721,7 @@
       <w:r>
         <w:t xml:space="preserve">Ferramentas e delimitação</w:t>
       </w:r>
-      <w:bookmarkEnd w:id="53"/>
+      <w:bookmarkEnd w:id="52"/>
     </w:p>
     <w:p>
       <w:pPr>
@@ -22780,7 +22757,7 @@
     </w:p>
     <w:p>
       <w:r>
-        <w:t xml:space="preserve">Valem as exclusões de escopo da seção 3A.13. O modelo é plano, restrito ao plano sagital, e admite elástico linear e sem massa, F = K δ, elemento 78 pontual e sem atrito e eixo da articulação 20 no centro do ombro, com a barra 18 fixa em relação ao tronco, hipótese discutida na seção 3B.5. O torque gravitacional considera só o membro humano estendido, sem ferramenta na mão; o braço do exoesqueleto, a alavanca e a braçadeira não entram nele.</w:t>
+        <w:t xml:space="preserve">Valem as exclusões de escopo da seção 3A.13. O modelo é plano, restrito ao plano sagital, e admite elástico linear e sem massa, F = K δ, elemento 78 pontual e sem atrito e eixo da articulação 20 no centro do ombro, com a barra 18 fixa em relação ao tronco, hipótese discutida na seção 3B.3. O torque gravitacional considera só o membro humano estendido, sem ferramenta na mão; o braço do exoesqueleto, a alavanca e a braçadeira não entram nele.</w:t>
       </w:r>
     </w:p>
     <w:p>
@@ -22815,7 +22792,7 @@
       <w:pPr>
         <w:pStyle w:val="Ttulo1"/>
       </w:pPr>
-      <w:bookmarkStart w:id="54" w:name="_Toc0054"/>
+      <w:bookmarkStart w:id="53" w:name="_Toc0053"/>
       <w:r>
         <w:t xml:space="preserve">Capítulo 4</w:t>
       </w:r>
@@ -22825,7 +22802,7 @@
       <w:r>
         <w:t xml:space="preserve">Resultados e discussão</w:t>
       </w:r>
-      <w:bookmarkEnd w:id="54"/>
+      <w:bookmarkEnd w:id="53"/>
       <w:r>
         <w:fldChar w:fldCharType="begin"/>
       </w:r>
@@ -22848,7 +22825,7 @@
       <w:pPr>
         <w:pStyle w:val="Ttulo2"/>
       </w:pPr>
-      <w:bookmarkStart w:id="55" w:name="_Toc0055"/>
+      <w:bookmarkStart w:id="54" w:name="_Toc0054"/>
       <w:r>
         <w:t xml:space="preserve">4A</w:t>
       </w:r>
@@ -22858,7 +22835,7 @@
       <w:r>
         <w:t xml:space="preserve">Exoesqueleto 1: US 9.889.554 B2</w:t>
       </w:r>
-      <w:bookmarkEnd w:id="55"/>
+      <w:bookmarkEnd w:id="54"/>
     </w:p>
     <w:p>
       <w:pPr>
@@ -22890,7 +22867,7 @@
       <w:pPr>
         <w:pStyle w:val="Ttulo3"/>
       </w:pPr>
-      <w:bookmarkStart w:id="56" w:name="_Toc0056"/>
+      <w:bookmarkStart w:id="55" w:name="_Toc0055"/>
       <w:r>
         <w:t xml:space="preserve">4A.1</w:t>
       </w:r>
@@ -22900,7 +22877,7 @@
       <w:r>
         <w:t xml:space="preserve">Geometria reconstruída e propriedades de massa</w:t>
       </w:r>
-      <w:bookmarkEnd w:id="56"/>
+      <w:bookmarkEnd w:id="55"/>
     </w:p>
     <w:p>
       <w:pPr>
@@ -22916,7 +22893,7 @@
         <w:spacing w:after="258"/>
         <w:jc w:val="center"/>
       </w:pPr>
-      <w:bookmarkStart w:id="57" w:name="_Toc0057"/>
+      <w:bookmarkStart w:id="56" w:name="_Toc0056"/>
       <w:r>
         <w:t xml:space="preserve">Tabela </w:t>
       </w:r>
@@ -22941,7 +22918,7 @@
       <w:r>
         <w:t xml:space="preserve">Grandezas medidas na reconstrução em CAD</w:t>
       </w:r>
-      <w:bookmarkEnd w:id="57"/>
+      <w:bookmarkEnd w:id="56"/>
     </w:p>
     <w:tbl>
       <w:tblPr>
@@ -23876,7 +23853,7 @@
         <w:spacing w:after="258"/>
         <w:jc w:val="center"/>
       </w:pPr>
-      <w:bookmarkStart w:id="58" w:name="_Toc0058"/>
+      <w:bookmarkStart w:id="57" w:name="_Toc0057"/>
       <w:r>
         <w:t xml:space="preserve">Tabela </w:t>
       </w:r>
@@ -23901,7 +23878,7 @@
       <w:r>
         <w:t xml:space="preserve">Propriedades de massa do conjunto braço–exoesqueleto</w:t>
       </w:r>
-      <w:bookmarkEnd w:id="58"/>
+      <w:bookmarkEnd w:id="57"/>
     </w:p>
     <w:tbl>
       <w:tblPr>
@@ -24554,7 +24531,7 @@
       <w:pPr>
         <w:pStyle w:val="Ttulo3"/>
       </w:pPr>
-      <w:bookmarkStart w:id="59" w:name="_Toc0059"/>
+      <w:bookmarkStart w:id="58" w:name="_Toc0058"/>
       <w:r>
         <w:t xml:space="preserve">4A.2</w:t>
       </w:r>
@@ -24564,7 +24541,7 @@
       <w:r>
         <w:t xml:space="preserve">Dados extraídos da patente</w:t>
       </w:r>
-      <w:bookmarkEnd w:id="59"/>
+      <w:bookmarkEnd w:id="58"/>
     </w:p>
     <w:p>
       <w:pPr>
@@ -24580,7 +24557,7 @@
         <w:spacing w:after="258"/>
         <w:jc w:val="center"/>
       </w:pPr>
-      <w:bookmarkStart w:id="60" w:name="_Toc0060"/>
+      <w:bookmarkStart w:id="59" w:name="_Toc0059"/>
       <w:r>
         <w:t xml:space="preserve">Tabela </w:t>
       </w:r>
@@ -24605,7 +24582,7 @@
       <w:r>
         <w:t xml:space="preserve">Pontos extraídos da curva da patente e torque calculado pelo modelo</w:t>
       </w:r>
-      <w:bookmarkEnd w:id="60"/>
+      <w:bookmarkEnd w:id="59"/>
     </w:p>
     <w:tbl>
       <w:tblPr>
@@ -29116,7 +29093,7 @@
       <w:pPr>
         <w:pStyle w:val="Ttulo3"/>
       </w:pPr>
-      <w:bookmarkStart w:id="61" w:name="_Toc0061"/>
+      <w:bookmarkStart w:id="60" w:name="_Toc0060"/>
       <w:r>
         <w:t xml:space="preserve">4A.3</w:t>
       </w:r>
@@ -29126,7 +29103,7 @@
       <w:r>
         <w:t xml:space="preserve">Verificação da cadeia de cálculo</w:t>
       </w:r>
-      <w:bookmarkEnd w:id="61"/>
+      <w:bookmarkEnd w:id="60"/>
     </w:p>
     <w:p>
       <w:pPr>
@@ -29142,7 +29119,7 @@
         <w:spacing w:after="258"/>
         <w:jc w:val="center"/>
       </w:pPr>
-      <w:bookmarkStart w:id="62" w:name="_Toc0062"/>
+      <w:bookmarkStart w:id="61" w:name="_Toc0061"/>
       <w:r>
         <w:t xml:space="preserve">Tabela </w:t>
       </w:r>
@@ -29167,7 +29144,7 @@
       <w:r>
         <w:t xml:space="preserve">Verificações da cadeia de cálculo (h = 22,701 mm)</w:t>
       </w:r>
-      <w:bookmarkEnd w:id="62"/>
+      <w:bookmarkEnd w:id="61"/>
     </w:p>
     <w:tbl>
       <w:tblPr>
@@ -29754,7 +29731,7 @@
       <w:pPr>
         <w:pStyle w:val="Ttulo3"/>
       </w:pPr>
-      <w:bookmarkStart w:id="63" w:name="_Toc0063"/>
+      <w:bookmarkStart w:id="62" w:name="_Toc0062"/>
       <w:r>
         <w:t xml:space="preserve">4A.4</w:t>
       </w:r>
@@ -29764,7 +29741,7 @@
       <w:r>
         <w:t xml:space="preserve">Parâmetros do modelo e reprodução da identificação</w:t>
       </w:r>
-      <w:bookmarkEnd w:id="63"/>
+      <w:bookmarkEnd w:id="62"/>
     </w:p>
     <w:p>
       <w:pPr>
@@ -29780,7 +29757,7 @@
         <w:spacing w:after="258"/>
         <w:jc w:val="center"/>
       </w:pPr>
-      <w:bookmarkStart w:id="64" w:name="_Toc0064"/>
+      <w:bookmarkStart w:id="63" w:name="_Toc0063"/>
       <w:r>
         <w:t xml:space="preserve">Tabela </w:t>
       </w:r>
@@ -29805,7 +29782,7 @@
       <w:r>
         <w:t xml:space="preserve">Parâmetros não publicados, origem e verificação</w:t>
       </w:r>
-      <w:bookmarkEnd w:id="64"/>
+      <w:bookmarkEnd w:id="63"/>
     </w:p>
     <w:tbl>
       <w:tblPr>
@@ -30477,7 +30454,7 @@
       <w:pPr>
         <w:pStyle w:val="Ttulo3"/>
       </w:pPr>
-      <w:bookmarkStart w:id="65" w:name="_Toc0065"/>
+      <w:bookmarkStart w:id="64" w:name="_Toc0064"/>
       <w:r>
         <w:t xml:space="preserve">4A.5</w:t>
       </w:r>
@@ -30487,7 +30464,7 @@
       <w:r>
         <w:t xml:space="preserve">Qualidade do ajuste à curva da patente</w:t>
       </w:r>
-      <w:bookmarkEnd w:id="65"/>
+      <w:bookmarkEnd w:id="64"/>
     </w:p>
     <w:p>
       <w:pPr>
@@ -30502,7 +30479,7 @@
         <w:pStyle w:val="Legenda"/>
         <w:jc w:val="both"/>
       </w:pPr>
-      <w:bookmarkStart w:id="66" w:name="_Toc0066"/>
+      <w:bookmarkStart w:id="65" w:name="_Toc0065"/>
       <w:r>
         <w:t xml:space="preserve">Figura </w:t>
       </w:r>
@@ -30536,7 +30513,7 @@
       <w:r>
         <w:t xml:space="preserve"> = 37,383 mm) </w:t>
       </w:r>
-      <w:bookmarkEnd w:id="66"/>
+      <w:bookmarkEnd w:id="65"/>
     </w:p>
     <w:p>
       <w:pPr>
@@ -30610,7 +30587,7 @@
         <w:spacing w:after="258"/>
         <w:jc w:val="center"/>
       </w:pPr>
-      <w:bookmarkStart w:id="67" w:name="_Toc0067"/>
+      <w:bookmarkStart w:id="66" w:name="_Toc0066"/>
       <w:r>
         <w:t xml:space="preserve">Tabela </w:t>
       </w:r>
@@ -30635,7 +30612,7 @@
       <w:r>
         <w:t xml:space="preserve">Indicadores de qualidade do ajuste à curva da patente</w:t>
       </w:r>
-      <w:bookmarkEnd w:id="67"/>
+      <w:bookmarkEnd w:id="66"/>
     </w:p>
     <w:tbl>
       <w:tblPr>
@@ -31269,7 +31246,7 @@
         <w:spacing w:after="258"/>
         <w:jc w:val="center"/>
       </w:pPr>
-      <w:bookmarkStart w:id="68" w:name="_Toc0068"/>
+      <w:bookmarkStart w:id="67" w:name="_Toc0067"/>
       <w:r>
         <w:t xml:space="preserve">Tabela </w:t>
       </w:r>
@@ -31294,7 +31271,7 @@
       <w:r>
         <w:t xml:space="preserve">Zonas de sinal dos resíduos (modelo − extraído), em ordem de θ*</w:t>
       </w:r>
-      <w:bookmarkEnd w:id="68"/>
+      <w:bookmarkEnd w:id="67"/>
     </w:p>
     <w:tbl>
       <w:tblPr>
@@ -32170,7 +32147,7 @@
       <w:pPr>
         <w:pStyle w:val="Ttulo3"/>
       </w:pPr>
-      <w:bookmarkStart w:id="69" w:name="_Toc0069"/>
+      <w:bookmarkStart w:id="68" w:name="_Toc0068"/>
       <w:r>
         <w:t xml:space="preserve">4A.6</w:t>
       </w:r>
@@ -32180,7 +32157,7 @@
       <w:r>
         <w:t xml:space="preserve">Comportamento da mola e do mecanismo</w:t>
       </w:r>
-      <w:bookmarkEnd w:id="69"/>
+      <w:bookmarkEnd w:id="68"/>
     </w:p>
     <w:p>
       <w:pPr>
@@ -32196,7 +32173,7 @@
         <w:spacing w:after="258"/>
         <w:jc w:val="center"/>
       </w:pPr>
-      <w:bookmarkStart w:id="70" w:name="_Toc0070"/>
+      <w:bookmarkStart w:id="69" w:name="_Toc0069"/>
       <w:r>
         <w:t xml:space="preserve">Tabela </w:t>
       </w:r>
@@ -32221,7 +32198,7 @@
       <w:r>
         <w:t xml:space="preserve">Grandezas do mecanismo na faixa de operação</w:t>
       </w:r>
-      <w:bookmarkEnd w:id="70"/>
+      <w:bookmarkEnd w:id="69"/>
     </w:p>
     <w:tbl>
       <w:tblPr>
@@ -33155,7 +33132,7 @@
       <w:pPr>
         <w:pStyle w:val="Ttulo3"/>
       </w:pPr>
-      <w:bookmarkStart w:id="71" w:name="_Toc0071"/>
+      <w:bookmarkStart w:id="70" w:name="_Toc0070"/>
       <w:r>
         <w:t xml:space="preserve">4A.7</w:t>
       </w:r>
@@ -33165,7 +33142,7 @@
       <w:r>
         <w:t xml:space="preserve">Varredura paramétrica de h com K congelado</w:t>
       </w:r>
-      <w:bookmarkEnd w:id="71"/>
+      <w:bookmarkEnd w:id="70"/>
     </w:p>
     <w:p>
       <w:pPr>
@@ -33189,7 +33166,7 @@
         <w:pStyle w:val="Legenda"/>
         <w:jc w:val="both"/>
       </w:pPr>
-      <w:bookmarkStart w:id="72" w:name="_Toc0072"/>
+      <w:bookmarkStart w:id="71" w:name="_Toc0071"/>
       <w:r>
         <w:t xml:space="preserve">Figura </w:t>
       </w:r>
@@ -33223,7 +33200,7 @@
       <w:r>
         <w:t xml:space="preserve"> = 37,383 mm congelados, e os 29 pontos extraídos da patente</w:t>
       </w:r>
-      <w:bookmarkEnd w:id="72"/>
+      <w:bookmarkEnd w:id="71"/>
     </w:p>
     <w:p>
       <w:pPr>
@@ -33294,7 +33271,7 @@
         <w:pStyle w:val="Legenda"/>
         <w:jc w:val="both"/>
       </w:pPr>
-      <w:bookmarkStart w:id="73" w:name="_Toc0073"/>
+      <w:bookmarkStart w:id="72" w:name="_Toc0072"/>
       <w:r>
         <w:t xml:space="preserve">Figura </w:t>
       </w:r>
@@ -33319,7 +33296,7 @@
       <w:r>
         <w:t xml:space="preserve">RMSE contra os pontos extraídos em função de h, com K congelado: faixa completa, em escala logarítmica, com os valores fisicamente viáveis, e ampliação em torno do mínimo, com os platôs de RMSE</w:t>
       </w:r>
-      <w:bookmarkEnd w:id="73"/>
+      <w:bookmarkEnd w:id="72"/>
     </w:p>
     <w:p>
       <w:pPr>
@@ -33404,7 +33381,7 @@
         <w:spacing w:after="258"/>
         <w:jc w:val="center"/>
       </w:pPr>
-      <w:bookmarkStart w:id="74" w:name="_Toc0074"/>
+      <w:bookmarkStart w:id="73" w:name="_Toc0073"/>
       <w:r>
         <w:t xml:space="preserve">Tabela </w:t>
       </w:r>
@@ -33429,7 +33406,7 @@
       <w:r>
         <w:t xml:space="preserve">Platôs de RMSE com K congelado</w:t>
       </w:r>
-      <w:bookmarkEnd w:id="74"/>
+      <w:bookmarkEnd w:id="73"/>
     </w:p>
     <w:tbl>
       <w:tblPr>
@@ -34066,7 +34043,7 @@
         <w:spacing w:after="258"/>
         <w:jc w:val="center"/>
       </w:pPr>
-      <w:bookmarkStart w:id="75" w:name="_Toc0075"/>
+      <w:bookmarkStart w:id="74" w:name="_Toc0074"/>
       <w:r>
         <w:t xml:space="preserve">Tabela </w:t>
       </w:r>
@@ -34091,7 +34068,7 @@
       <w:r>
         <w:t xml:space="preserve">Valores notáveis de h na varredura com K congelado</w:t>
       </w:r>
-      <w:bookmarkEnd w:id="75"/>
+      <w:bookmarkEnd w:id="74"/>
     </w:p>
     <w:tbl>
       <w:tblPr>
@@ -35436,7 +35413,7 @@
       <w:pPr>
         <w:pStyle w:val="Ttulo3"/>
       </w:pPr>
-      <w:bookmarkStart w:id="76" w:name="_Toc0076"/>
+      <w:bookmarkStart w:id="75" w:name="_Toc0075"/>
       <w:r>
         <w:t xml:space="preserve">4A.8</w:t>
       </w:r>
@@ -35446,7 +35423,7 @@
       <w:r>
         <w:t xml:space="preserve">Confronto entre o torque do cabo e o torque gravitacional</w:t>
       </w:r>
-      <w:bookmarkEnd w:id="76"/>
+      <w:bookmarkEnd w:id="75"/>
     </w:p>
     <w:p>
       <w:pPr>
@@ -35466,7 +35443,7 @@
         <w:pStyle w:val="Legenda"/>
         <w:jc w:val="both"/>
       </w:pPr>
-      <w:bookmarkStart w:id="77" w:name="_Toc0077"/>
+      <w:bookmarkStart w:id="76" w:name="_Toc0076"/>
       <w:r>
         <w:t xml:space="preserve">Figura </w:t>
       </w:r>
@@ -35500,7 +35477,7 @@
       <w:r>
         <w:t xml:space="preserve"> = 37,383 mm)</w:t>
       </w:r>
-      <w:bookmarkEnd w:id="77"/>
+      <w:bookmarkEnd w:id="76"/>
     </w:p>
     <w:p>
       <w:pPr>
@@ -35610,7 +35587,7 @@
       <w:pPr>
         <w:pStyle w:val="Ttulo3"/>
       </w:pPr>
-      <w:bookmarkStart w:id="78" w:name="_Toc0078"/>
+      <w:bookmarkStart w:id="77" w:name="_Toc0077"/>
       <w:r>
         <w:t xml:space="preserve">4A.9</w:t>
       </w:r>
@@ -35620,7 +35597,7 @@
       <w:r>
         <w:t xml:space="preserve">Limitações dos resultados</w:t>
       </w:r>
-      <w:bookmarkEnd w:id="78"/>
+      <w:bookmarkEnd w:id="77"/>
     </w:p>
     <w:p>
       <w:pPr>
@@ -35695,7 +35672,7 @@
       <w:pPr>
         <w:pStyle w:val="Ttulo2"/>
       </w:pPr>
-      <w:bookmarkStart w:id="79" w:name="_Toc0079"/>
+      <w:bookmarkStart w:id="78" w:name="_Toc0078"/>
       <w:r>
         <w:t xml:space="preserve">4B</w:t>
       </w:r>
@@ -35705,14 +35682,14 @@
       <w:r>
         <w:t xml:space="preserve">Exoesqueleto 2: EP 3 504 033 B1</w:t>
       </w:r>
-      <w:bookmarkEnd w:id="79"/>
+      <w:bookmarkEnd w:id="78"/>
     </w:p>
     <w:p>
       <w:pPr>
         <w:pStyle w:val="SemRecuo"/>
       </w:pPr>
       <w:r>
-        <w:t xml:space="preserve">Esta seção apresenta os resultados das etapas das seções 3B.3 a 3B.12, aplicadas ao dispositivo da EP 3 504 033 B1. Salvo indicação em contrário, os números foram obtidos com a geometria do CAD, </w:t>
+        <w:t xml:space="preserve">Esta seção apresenta os resultados das etapas das seções 3B.1 a 3B.11, aplicadas ao dispositivo da EP 3 504 033 B1. Salvo indicação em contrário, os números foram obtidos com a geometria do CAD, </w:t>
       </w:r>
       <w:r>
         <w:rPr>
@@ -35740,14 +35717,14 @@
         <w:t xml:space="preserve">40</w:t>
       </w:r>
       <w:r>
-        <w:t xml:space="preserve"> = 1,45915 N/mm, hipótese de projeto. As etapas dinâmicas da seção 3B.13 não foram executadas.</w:t>
+        <w:t xml:space="preserve"> = 1,45915 N/mm, hipótese de projeto. As etapas dinâmicas da seção 3B.12 não foram executadas.</w:t>
       </w:r>
     </w:p>
     <w:p>
       <w:pPr>
         <w:pStyle w:val="Ttulo3"/>
       </w:pPr>
-      <w:bookmarkStart w:id="80" w:name="_Toc0080"/>
+      <w:bookmarkStart w:id="79" w:name="_Toc0079"/>
       <w:r>
         <w:t xml:space="preserve">4B.1</w:t>
       </w:r>
@@ -35757,14 +35734,14 @@
       <w:r>
         <w:t xml:space="preserve">Geometria reconstruída e propriedades de massa</w:t>
       </w:r>
-      <w:bookmarkEnd w:id="80"/>
+      <w:bookmarkEnd w:id="79"/>
     </w:p>
     <w:p>
       <w:pPr>
         <w:pStyle w:val="SemRecuo"/>
       </w:pPr>
       <w:r>
-        <w:t xml:space="preserve">A Tabela 14 reúne as grandezas medidas no modelo em CAD e as que delas derivam, com a origem de cada uma (seção 3B.3).</w:t>
+        <w:t xml:space="preserve">A Tabela 14 reúne as grandezas medidas no modelo em CAD e as que delas derivam, com a origem de cada uma (seção 3B.1).</w:t>
       </w:r>
     </w:p>
     <w:p>
@@ -35773,7 +35750,7 @@
         <w:spacing w:after="258"/>
         <w:jc w:val="center"/>
       </w:pPr>
-      <w:bookmarkStart w:id="81" w:name="_Toc0081"/>
+      <w:bookmarkStart w:id="80" w:name="_Toc0080"/>
       <w:r>
         <w:t xml:space="preserve">Tabela </w:t>
       </w:r>
@@ -35798,7 +35775,7 @@
       <w:r>
         <w:t xml:space="preserve">Grandezas medidas no modelo em CAD e grandezas derivadas</w:t>
       </w:r>
-      <w:bookmarkEnd w:id="81"/>
+      <w:bookmarkEnd w:id="80"/>
     </w:p>
     <w:tbl>
       <w:tblPr>
@@ -38265,7 +38242,7 @@
                 <w:sz w:val="22"/>
                 <w:szCs w:val="22"/>
               </w:rPr>
-              <w:t xml:space="preserve">Derivada, Equação (39)</w:t>
+              <w:t xml:space="preserve">Derivada, Equação (43)</w:t>
             </w:r>
           </w:p>
         </w:tc>
@@ -38421,7 +38398,7 @@
           <w:sz w:val="20"/>
           <w:szCs w:val="20"/>
         </w:rPr>
-        <w:t xml:space="preserve">Nota: ângulos medidos a partir de +x, no sentido anti-horário (seção 3B.5). x</w:t>
+        <w:t xml:space="preserve">Nota: ângulos medidos a partir de +x, no sentido anti-horário (seção 3B.3). x</w:t>
       </w:r>
       <w:r>
         <w:rPr>
@@ -38607,7 +38584,7 @@
         <w:t xml:space="preserve">78</w:t>
       </w:r>
       <w:r>
-        <w:t xml:space="preserve"> = 7,754 mm do eixo da articulação, enquanto a patente prefere esse elemento sobre o eixo [0099]; as consequências dessa diferença são tratadas nas seções 3B.6 e 4B.9.</w:t>
+        <w:t xml:space="preserve"> = 7,754 mm do eixo da articulação, enquanto a patente prefere esse elemento sobre o eixo [0099]; as consequências dessa diferença são tratadas nas seções 3B.7 e 4B.9.</w:t>
       </w:r>
     </w:p>
     <w:p>
@@ -38616,7 +38593,7 @@
         <w:spacing w:after="258"/>
         <w:jc w:val="center"/>
       </w:pPr>
-      <w:bookmarkStart w:id="82" w:name="_Toc0082"/>
+      <w:bookmarkStart w:id="81" w:name="_Toc0081"/>
       <w:r>
         <w:t xml:space="preserve">Tabela </w:t>
       </w:r>
@@ -38641,7 +38618,7 @@
       <w:r>
         <w:t xml:space="preserve">Propriedades de massa do membro humano em relação ao eixo da articulação 20</w:t>
       </w:r>
-      <w:bookmarkEnd w:id="82"/>
+      <w:bookmarkEnd w:id="81"/>
     </w:p>
     <w:tbl>
       <w:tblPr>
@@ -39523,7 +39500,7 @@
       <w:pPr>
         <w:pStyle w:val="Ttulo3"/>
       </w:pPr>
-      <w:bookmarkStart w:id="83" w:name="_Toc0083"/>
+      <w:bookmarkStart w:id="82" w:name="_Toc0082"/>
       <w:r>
         <w:t xml:space="preserve">4B.2</w:t>
       </w:r>
@@ -39533,7 +39510,7 @@
       <w:r>
         <w:t xml:space="preserve">Dados extraídos da patente</w:t>
       </w:r>
-      <w:bookmarkEnd w:id="83"/>
+      <w:bookmarkEnd w:id="82"/>
     </w:p>
     <w:p>
       <w:pPr>
@@ -39549,7 +39526,7 @@
         <w:spacing w:after="258"/>
         <w:jc w:val="center"/>
       </w:pPr>
-      <w:bookmarkStart w:id="84" w:name="_Toc0084"/>
+      <w:bookmarkStart w:id="83" w:name="_Toc0083"/>
       <w:r>
         <w:t xml:space="preserve">Tabela </w:t>
       </w:r>
@@ -39574,7 +39551,7 @@
       <w:r>
         <w:t xml:space="preserve">Pontos extraídos da Figura 16 da patente (razão em divisões da grade)</w:t>
       </w:r>
-      <w:bookmarkEnd w:id="84"/>
+      <w:bookmarkEnd w:id="83"/>
     </w:p>
     <w:tbl>
       <w:tblPr>
@@ -47263,14 +47240,14 @@
           <w:sz w:val="20"/>
           <w:szCs w:val="20"/>
         </w:rPr>
-        <w:t xml:space="preserve"> &lt; 165° usada na identificação (seção 3B.10).</w:t>
+        <w:t xml:space="preserve"> &lt; 165° usada na identificação (seção 3B.9).</w:t>
       </w:r>
     </w:p>
     <w:p>
       <w:pPr>
         <w:pStyle w:val="Ttulo3"/>
       </w:pPr>
-      <w:bookmarkStart w:id="85" w:name="_Toc0085"/>
+      <w:bookmarkStart w:id="84" w:name="_Toc0084"/>
       <w:r>
         <w:t xml:space="preserve">4B.3</w:t>
       </w:r>
@@ -47280,14 +47257,14 @@
       <w:r>
         <w:t xml:space="preserve">Verificação da cadeia de cálculo</w:t>
       </w:r>
-      <w:bookmarkEnd w:id="85"/>
+      <w:bookmarkEnd w:id="84"/>
     </w:p>
     <w:p>
       <w:pPr>
         <w:pStyle w:val="SemRecuo"/>
       </w:pPr>
       <w:r>
-        <w:t xml:space="preserve">As verificações automáticas da seção 3B.12 resultaram nos resíduos da Tabela 17, todos da ordem do erro de arredondamento da aritmética de ponto flutuante, exceto os do trabalho virtual, limitados pelo truncamento da diferença finita, e o do fechamento com o CAD, limitado pela resolução da medida. No teste sintético, a identificação pelo espaçamento entre as curvas recupera os valores de s</w:t>
+        <w:t xml:space="preserve">As verificações automáticas da seção 3B.11 resultaram nos resíduos da Tabela 17, todos da ordem do erro de arredondamento da aritmética de ponto flutuante, exceto os do trabalho virtual, limitados pelo truncamento da diferença finita, e o do fechamento com o CAD, limitado pela resolução da medida. No teste sintético, a identificação pelo espaçamento entre as curvas recupera os valores de s</w:t>
       </w:r>
       <w:r>
         <w:rPr>
@@ -47305,7 +47282,7 @@
         <w:spacing w:after="258"/>
         <w:jc w:val="center"/>
       </w:pPr>
-      <w:bookmarkStart w:id="86" w:name="_Toc0086"/>
+      <w:bookmarkStart w:id="85" w:name="_Toc0085"/>
       <w:r>
         <w:t xml:space="preserve">Tabela </w:t>
       </w:r>
@@ -47330,7 +47307,7 @@
       <w:r>
         <w:t xml:space="preserve">Verificações da cadeia de cálculo do modelo da Ottobock</w:t>
       </w:r>
-      <w:bookmarkEnd w:id="86"/>
+      <w:bookmarkEnd w:id="85"/>
     </w:p>
     <w:tbl>
       <w:tblPr>
@@ -47715,7 +47692,7 @@
                 <w:sz w:val="22"/>
                 <w:szCs w:val="22"/>
               </w:rPr>
-              <w:t xml:space="preserve">Trabalho virtual no regime I, Equação (43)</w:t>
+              <w:t xml:space="preserve">Trabalho virtual no regime I, Equação (42)</w:t>
             </w:r>
           </w:p>
         </w:tc>
@@ -47781,7 +47758,7 @@
                 <w:sz w:val="22"/>
                 <w:szCs w:val="22"/>
               </w:rPr>
-              <w:t xml:space="preserve">Trabalho virtual no regime II, Equação (43)</w:t>
+              <w:t xml:space="preserve">Trabalho virtual no regime II, Equação (42)</w:t>
             </w:r>
           </w:p>
         </w:tc>
@@ -48009,7 +47986,7 @@
                 <w:sz w:val="22"/>
                 <w:szCs w:val="22"/>
               </w:rPr>
-              <w:t xml:space="preserve"> numérico contra a Equação (39)</w:t>
+              <w:t xml:space="preserve"> numérico contra a Equação (43)</w:t>
             </w:r>
           </w:p>
         </w:tc>
@@ -48542,7 +48519,7 @@
       <w:pPr>
         <w:pStyle w:val="Ttulo3"/>
       </w:pPr>
-      <w:bookmarkStart w:id="87" w:name="_Toc0087"/>
+      <w:bookmarkStart w:id="86" w:name="_Toc0086"/>
       <w:r>
         <w:t xml:space="preserve">4B.4</w:t>
       </w:r>
@@ -48561,7 +48538,7 @@
       <w:r>
         <w:t xml:space="preserve"> pelo espaçamento entre as curvas</w:t>
       </w:r>
-      <w:bookmarkEnd w:id="87"/>
+      <w:bookmarkEnd w:id="86"/>
     </w:p>
     <w:p>
       <w:pPr>
@@ -48595,7 +48572,7 @@
         <w:spacing w:after="258"/>
         <w:jc w:val="both"/>
       </w:pPr>
-      <w:bookmarkStart w:id="88" w:name="_Toc0088"/>
+      <w:bookmarkStart w:id="87" w:name="_Toc0087"/>
       <w:r>
         <w:t xml:space="preserve">Tabela </w:t>
       </w:r>
@@ -48629,7 +48606,7 @@
       <w:r>
         <w:t xml:space="preserve"> identificado pelo espaçamento entre as curvas da Figura 16 da patente</w:t>
       </w:r>
-      <w:bookmarkEnd w:id="88"/>
+      <w:bookmarkEnd w:id="87"/>
     </w:p>
     <w:tbl>
       <w:tblPr>
@@ -50176,7 +50153,7 @@
         <w:pStyle w:val="Legenda"/>
         <w:jc w:val="both"/>
       </w:pPr>
-      <w:bookmarkStart w:id="89" w:name="_Toc0089"/>
+      <w:bookmarkStart w:id="88" w:name="_Toc0088"/>
       <w:r>
         <w:t xml:space="preserve">Figura </w:t>
       </w:r>
@@ -50219,7 +50196,7 @@
       <w:r>
         <w:t xml:space="preserve"> de cada curva e (b) o fator G lido na Figura 16 da patente e a forma prevista pelo modelo, normalizados em 90°</w:t>
       </w:r>
-      <w:bookmarkEnd w:id="89"/>
+      <w:bookmarkEnd w:id="88"/>
     </w:p>
     <w:p>
       <w:pPr>
@@ -50320,7 +50297,7 @@
       <w:pPr>
         <w:pStyle w:val="Ttulo3"/>
       </w:pPr>
-      <w:bookmarkStart w:id="90" w:name="_Toc0090"/>
+      <w:bookmarkStart w:id="89" w:name="_Toc0089"/>
       <w:r>
         <w:t xml:space="preserve">4B.5</w:t>
       </w:r>
@@ -50330,7 +50307,7 @@
       <w:r>
         <w:t xml:space="preserve">Forma das curvas e ajuste de forma</w:t>
       </w:r>
-      <w:bookmarkEnd w:id="90"/>
+      <w:bookmarkEnd w:id="89"/>
     </w:p>
     <w:p>
       <w:pPr>
@@ -50373,12 +50350,12 @@
         <w:t xml:space="preserve">g</w:t>
       </w:r>
       <w:r>
-        <w:t xml:space="preserve"> do membro humano, a razão calculada não reproduz a Figura 16 da patente: com escala comum às três curvas, o coeficiente de determinação é −0,548 (pontilhada), −1,620 (tracejada) e −0,674 (contínua). Como o ℓ implícito na figura concorda com o do CAD (seção 4B.4), a diferença não se explica por ℓ. Restam o braço de momento, que depende da derivada de ℓ, e o torque do peso que a patente usou para formar a razão, que o texto não define de forma consistente (seção 3B.9). Entre 35° e 155°, a concordância de ℓ limita a primeira causa: pela Equação (43), atribuir ao braço de momento toda a diferença afastaria o ℓ implícito do ℓ do CAD em até 7,78 mm (3,24 mm RMS), contra os 2,31 mm observados. Nessa faixa, a causa mais compatível com os dados é o torque do peso ou a definição da ordenada; o braço de momento permanece possível perto dos extremos. A patente não traz dado que permita confirmar a causa.</w:t>
-      </w:r>
-    </w:p>
-    <w:p>
-      <w:r>
-        <w:t xml:space="preserve">O ajuste de forma da seção 3B.10 deixa s</w:t>
+        <w:t xml:space="preserve"> do membro humano, a razão calculada não reproduz a Figura 16 da patente: com escala comum às três curvas, o coeficiente de determinação é −0,548 (pontilhada), −1,620 (tracejada) e −0,674 (contínua). Como o ℓ implícito na figura concorda com o do CAD (seção 4B.4), a diferença não se explica por ℓ. Restam o braço de momento, que depende da derivada de ℓ, e o torque do peso que a patente usou para formar a razão, que o texto não define de forma consistente (seção 3B.9). Entre 35° e 155°, a concordância de ℓ limita a primeira causa: pela Equação (42), atribuir ao braço de momento toda a diferença afastaria o ℓ implícito do ℓ do CAD em até 7,78 mm (3,24 mm RMS), contra os 2,31 mm observados. Nessa faixa, a causa mais compatível com os dados é o torque do peso ou a definição da ordenada; o braço de momento permanece possível perto dos extremos. A patente não traz dado que permita confirmar a causa.</w:t>
+      </w:r>
+    </w:p>
+    <w:p>
+      <w:r>
+        <w:t xml:space="preserve">O ajuste de forma da seção 3B.9 deixa s</w:t>
       </w:r>
       <w:r>
         <w:rPr>
@@ -50414,7 +50391,7 @@
         <w:spacing w:after="258"/>
         <w:jc w:val="center"/>
       </w:pPr>
-      <w:bookmarkStart w:id="91" w:name="_Toc0091"/>
+      <w:bookmarkStart w:id="90" w:name="_Toc0090"/>
       <w:r>
         <w:t xml:space="preserve">Tabela </w:t>
       </w:r>
@@ -50448,7 +50425,7 @@
       <w:r>
         <w:t xml:space="preserve"> à forma de cada curva da Figura 16 da patente</w:t>
       </w:r>
-      <w:bookmarkEnd w:id="91"/>
+      <w:bookmarkEnd w:id="90"/>
     </w:p>
     <w:tbl>
       <w:tblPr>
@@ -51989,7 +51966,7 @@
         <w:spacing w:after="258"/>
         <w:jc w:val="center"/>
       </w:pPr>
-      <w:bookmarkStart w:id="92" w:name="_Toc0092"/>
+      <w:bookmarkStart w:id="91" w:name="_Toc0091"/>
       <w:r>
         <w:t xml:space="preserve">Tabela </w:t>
       </w:r>
@@ -52014,7 +51991,7 @@
       <w:r>
         <w:t xml:space="preserve">Ajuste conjunto com escala comum e ajuste com força constante</w:t>
       </w:r>
-      <w:bookmarkEnd w:id="92"/>
+      <w:bookmarkEnd w:id="91"/>
     </w:p>
     <w:tbl>
       <w:tblPr>
@@ -52941,7 +52918,7 @@
         <w:pStyle w:val="Legenda"/>
         <w:jc w:val="both"/>
       </w:pPr>
-      <w:bookmarkStart w:id="93" w:name="_Toc0093"/>
+      <w:bookmarkStart w:id="92" w:name="_Toc0092"/>
       <w:r>
         <w:t xml:space="preserve">Figura </w:t>
       </w:r>
@@ -52966,7 +52943,7 @@
       <w:r>
         <w:t xml:space="preserve">Pontos extraídos da Figura 16 da patente e razão calculada pelo ajuste de forma, com (a) escala c por curva e (b) escala c comum às três curvas</w:t>
       </w:r>
-      <w:bookmarkEnd w:id="93"/>
+      <w:bookmarkEnd w:id="92"/>
     </w:p>
     <w:p>
       <w:pPr>
@@ -53067,7 +53044,7 @@
       <w:pPr>
         <w:pStyle w:val="Ttulo3"/>
       </w:pPr>
-      <w:bookmarkStart w:id="94" w:name="_Toc0094"/>
+      <w:bookmarkStart w:id="93" w:name="_Toc0093"/>
       <w:r>
         <w:t xml:space="preserve">4B.6</w:t>
       </w:r>
@@ -53077,7 +53054,7 @@
       <w:r>
         <w:t xml:space="preserve">Parâmetros do modelo</w:t>
       </w:r>
-      <w:bookmarkEnd w:id="94"/>
+      <w:bookmarkEnd w:id="93"/>
     </w:p>
     <w:p>
       <w:pPr>
@@ -53093,7 +53070,7 @@
         <w:spacing w:after="258"/>
         <w:jc w:val="center"/>
       </w:pPr>
-      <w:bookmarkStart w:id="95" w:name="_Toc0095"/>
+      <w:bookmarkStart w:id="94" w:name="_Toc0094"/>
       <w:r>
         <w:t xml:space="preserve">Tabela </w:t>
       </w:r>
@@ -53118,7 +53095,7 @@
       <w:r>
         <w:t xml:space="preserve">Parâmetros não publicados, origem e identificabilidade</w:t>
       </w:r>
-      <w:bookmarkEnd w:id="95"/>
+      <w:bookmarkEnd w:id="94"/>
     </w:p>
     <w:tbl>
       <w:tblPr>
@@ -54084,7 +54061,7 @@
       <w:pPr>
         <w:pStyle w:val="Ttulo3"/>
       </w:pPr>
-      <w:bookmarkStart w:id="96" w:name="_Toc0096"/>
+      <w:bookmarkStart w:id="95" w:name="_Toc0095"/>
       <w:r>
         <w:t xml:space="preserve">4B.7</w:t>
       </w:r>
@@ -54094,7 +54071,7 @@
       <w:r>
         <w:t xml:space="preserve">Comportamento do elástico e do mecanismo</w:t>
       </w:r>
-      <w:bookmarkEnd w:id="96"/>
+      <w:bookmarkEnd w:id="95"/>
     </w:p>
     <w:p>
       <w:pPr>
@@ -54128,7 +54105,7 @@
         <w:spacing w:after="258"/>
         <w:jc w:val="center"/>
       </w:pPr>
-      <w:bookmarkStart w:id="97" w:name="_Toc0097"/>
+      <w:bookmarkStart w:id="96" w:name="_Toc0096"/>
       <w:r>
         <w:t xml:space="preserve">Tabela </w:t>
       </w:r>
@@ -54163,7 +54140,7 @@
       <w:r>
         <w:t xml:space="preserve"> = 34,785 mm)</w:t>
       </w:r>
-      <w:bookmarkEnd w:id="97"/>
+      <w:bookmarkEnd w:id="96"/>
     </w:p>
     <w:tbl>
       <w:tblPr>
@@ -55987,7 +55964,7 @@
       <w:pPr>
         <w:pStyle w:val="Ttulo3"/>
       </w:pPr>
-      <w:bookmarkStart w:id="98" w:name="_Toc0098"/>
+      <w:bookmarkStart w:id="97" w:name="_Toc0097"/>
       <w:r>
         <w:t xml:space="preserve">4B.8</w:t>
       </w:r>
@@ -56007,7 +55984,7 @@
       <w:r>
         <w:t xml:space="preserve"> da alavanca</w:t>
       </w:r>
-      <w:bookmarkEnd w:id="98"/>
+      <w:bookmarkEnd w:id="97"/>
     </w:p>
     <w:p>
       <w:pPr>
@@ -56119,7 +56096,7 @@
         <w:spacing w:after="258"/>
         <w:jc w:val="center"/>
       </w:pPr>
-      <w:bookmarkStart w:id="99" w:name="_Toc0099"/>
+      <w:bookmarkStart w:id="98" w:name="_Toc0098"/>
       <w:r>
         <w:t xml:space="preserve">Tabela </w:t>
       </w:r>
@@ -56163,7 +56140,7 @@
       <w:r>
         <w:t xml:space="preserve"> = 287,190 mm e K = 1,45915 N/mm</w:t>
       </w:r>
-      <w:bookmarkEnd w:id="99"/>
+      <w:bookmarkEnd w:id="98"/>
     </w:p>
     <w:tbl>
       <w:tblPr>
@@ -57661,7 +57638,7 @@
         <w:pStyle w:val="Legenda"/>
         <w:jc w:val="both"/>
       </w:pPr>
-      <w:bookmarkStart w:id="100" w:name="_Toc0100"/>
+      <w:bookmarkStart w:id="99" w:name="_Toc0099"/>
       <w:r>
         <w:t xml:space="preserve">Figura </w:t>
       </w:r>
@@ -57711,7 +57688,7 @@
         </w:rPr>
         <w:t xml:space="preserve">40</w:t>
       </w:r>
-      <w:bookmarkEnd w:id="100"/>
+      <w:bookmarkEnd w:id="99"/>
     </w:p>
     <w:p>
       <w:pPr>
@@ -57771,7 +57748,7 @@
       <w:pPr>
         <w:pStyle w:val="Ttulo3"/>
       </w:pPr>
-      <w:bookmarkStart w:id="101" w:name="_Toc0101"/>
+      <w:bookmarkStart w:id="100" w:name="_Toc0100"/>
       <w:r>
         <w:t xml:space="preserve">4B.9</w:t>
       </w:r>
@@ -57781,7 +57758,7 @@
       <w:r>
         <w:t xml:space="preserve">Confronto com o torque gravitacional</w:t>
       </w:r>
-      <w:bookmarkEnd w:id="101"/>
+      <w:bookmarkEnd w:id="100"/>
     </w:p>
     <w:p>
       <w:pPr>
@@ -57846,7 +57823,7 @@
         <w:pStyle w:val="Legenda"/>
         <w:jc w:val="both"/>
       </w:pPr>
-      <w:bookmarkStart w:id="102" w:name="_Toc0102"/>
+      <w:bookmarkStart w:id="101" w:name="_Toc0101"/>
       <w:r>
         <w:t xml:space="preserve">Figura </w:t>
       </w:r>
@@ -57871,7 +57848,7 @@
       <w:r>
         <w:t xml:space="preserve">Torque do elástico e torque do peso normalizados pelos respectivos picos, em função da anteversão</w:t>
       </w:r>
-      <w:bookmarkEnd w:id="102"/>
+      <w:bookmarkEnd w:id="101"/>
     </w:p>
     <w:p>
       <w:pPr>
@@ -58007,7 +57984,7 @@
         <w:spacing w:after="258"/>
         <w:jc w:val="center"/>
       </w:pPr>
-      <w:bookmarkStart w:id="103" w:name="_Toc0103"/>
+      <w:bookmarkStart w:id="102" w:name="_Toc0102"/>
       <w:r>
         <w:t xml:space="preserve">Tabela </w:t>
       </w:r>
@@ -58050,7 +58027,7 @@
       <w:r>
         <w:t xml:space="preserve"> = 1,45915 N/mm</w:t>
       </w:r>
-      <w:bookmarkEnd w:id="103"/>
+      <w:bookmarkEnd w:id="102"/>
     </w:p>
     <w:tbl>
       <w:tblPr>
@@ -59931,7 +59908,7 @@
           <w:sz w:val="20"/>
           <w:szCs w:val="20"/>
         </w:rPr>
-        <w:t xml:space="preserve"> é hipótese de projeto (seção 3B.10); τ</w:t>
+        <w:t xml:space="preserve"> é hipótese de projeto (seção 3B.9); τ</w:t>
       </w:r>
       <w:r>
         <w:rPr>
@@ -59954,7 +59931,7 @@
         <w:pStyle w:val="Legenda"/>
         <w:jc w:val="both"/>
       </w:pPr>
-      <w:bookmarkStart w:id="104" w:name="_Toc0104"/>
+      <w:bookmarkStart w:id="103" w:name="_Toc0103"/>
       <w:r>
         <w:t xml:space="preserve">Figura </w:t>
       </w:r>
@@ -59988,7 +59965,7 @@
       <w:r>
         <w:t xml:space="preserve"> no cenário de projeto, torque do peso do membro humano e alvo de 40%</w:t>
       </w:r>
-      <w:bookmarkEnd w:id="104"/>
+      <w:bookmarkEnd w:id="103"/>
     </w:p>
     <w:p>
       <w:pPr>
@@ -60162,7 +60139,7 @@
       <w:pPr>
         <w:pStyle w:val="Ttulo3"/>
       </w:pPr>
-      <w:bookmarkStart w:id="105" w:name="_Toc0105"/>
+      <w:bookmarkStart w:id="104" w:name="_Toc0104"/>
       <w:r>
         <w:t xml:space="preserve">4B.10</w:t>
       </w:r>
@@ -60172,14 +60149,14 @@
       <w:r>
         <w:t xml:space="preserve">Limitações dos resultados</w:t>
       </w:r>
-      <w:bookmarkEnd w:id="105"/>
+      <w:bookmarkEnd w:id="104"/>
     </w:p>
     <w:p>
       <w:pPr>
         <w:pStyle w:val="SemRecuo"/>
       </w:pPr>
       <w:r>
-        <w:t xml:space="preserve">Além das limitações de escopo da seção 3B.14, os resultados comportam as ressalvas da Tabela 25, que reúne o que falta para concluir cada etapa, a consequência da ausência e a forma de obter o dado. A principal é a diferença de forma entre o modelo e a Figura 16 da patente (seção 4B.5): o s</w:t>
+        <w:t xml:space="preserve">Além das limitações de escopo da seção 3B.13, os resultados comportam as ressalvas da Tabela 25, que reúne o que falta para concluir cada etapa, a consequência da ausência e a forma de obter o dado. A principal é a diferença de forma entre o modelo e a Figura 16 da patente (seção 4B.5): o s</w:t>
       </w:r>
       <w:r>
         <w:rPr>
@@ -60197,7 +60174,7 @@
         <w:spacing w:after="258"/>
         <w:jc w:val="center"/>
       </w:pPr>
-      <w:bookmarkStart w:id="106" w:name="_Toc0106"/>
+      <w:bookmarkStart w:id="105" w:name="_Toc0105"/>
       <w:r>
         <w:t xml:space="preserve">Tabela </w:t>
       </w:r>
@@ -60222,7 +60199,7 @@
       <w:r>
         <w:t xml:space="preserve">Pendências da análise da EP 3 504 033 B1</w:t>
       </w:r>
-      <w:bookmarkEnd w:id="106"/>
+      <w:bookmarkEnd w:id="105"/>
     </w:p>
     <w:tbl>
       <w:tblPr>
@@ -60494,7 +60471,7 @@
                 <w:sz w:val="22"/>
                 <w:szCs w:val="22"/>
               </w:rPr>
-              <w:t xml:space="preserve"> (seções 3B.5 e 4B.4)</w:t>
+              <w:t xml:space="preserve"> (seções 3B.3 e 4B.4)</w:t>
             </w:r>
           </w:p>
         </w:tc>
@@ -60751,7 +60728,7 @@
                 <w:sz w:val="22"/>
                 <w:szCs w:val="22"/>
               </w:rPr>
-              <w:t xml:space="preserve">Comparações angulares com a patente (início das curvas, transição, posição do pico) dependem da hipótese de eixo no centro do ombro e barra fixa no tronco (seção 3B.5)</w:t>
+              <w:t xml:space="preserve">Comparações angulares com a patente (início das curvas, transição, posição do pico) dependem da hipótese de eixo no centro do ombro e barra fixa no tronco (seção 3B.3)</w:t>
             </w:r>
           </w:p>
         </w:tc>
@@ -61600,7 +61577,7 @@
       <w:pPr>
         <w:pStyle w:val="Ttulo3"/>
       </w:pPr>
-      <w:bookmarkStart w:id="107" w:name="_Toc0107"/>
+      <w:bookmarkStart w:id="106" w:name="_Toc0106"/>
       <w:r>
         <w:t xml:space="preserve">4B.11</w:t>
       </w:r>
@@ -61610,14 +61587,14 @@
       <w:r>
         <w:t xml:space="preserve">Comparação com o exoesqueleto 1</w:t>
       </w:r>
-      <w:bookmarkEnd w:id="107"/>
+      <w:bookmarkEnd w:id="106"/>
     </w:p>
     <w:p>
       <w:pPr>
         <w:pStyle w:val="SemRecuo"/>
       </w:pPr>
       <w:r>
-        <w:t xml:space="preserve">A Tabela 26 compara os dois dispositivos com os números das seções 4A e 4B. Os ângulos são comparáveis porque as duas convenções medem o braço a partir da posição pendente: a elevação anatômica da seção 3A.3 e a anteversão da seção 3B.5.</w:t>
+        <w:t xml:space="preserve">A Tabela 26 compara os dois dispositivos com os números das seções 4A e 4B. Os ângulos são comparáveis porque as duas convenções medem o braço a partir da posição pendente: a elevação anatômica da seção 3A.3 e a anteversão da seção 3B.3.</w:t>
       </w:r>
     </w:p>
     <w:p>
@@ -61626,7 +61603,7 @@
         <w:spacing w:after="258"/>
         <w:jc w:val="center"/>
       </w:pPr>
-      <w:bookmarkStart w:id="108" w:name="_Toc0108"/>
+      <w:bookmarkStart w:id="107" w:name="_Toc0107"/>
       <w:r>
         <w:t xml:space="preserve">Tabela </w:t>
       </w:r>
@@ -61651,7 +61628,7 @@
       <w:r>
         <w:t xml:space="preserve">Comparação entre os dois dispositivos analisados</w:t>
       </w:r>
-      <w:bookmarkEnd w:id="108"/>
+      <w:bookmarkEnd w:id="107"/>
     </w:p>
     <w:tbl>
       <w:tblPr>
@@ -62543,7 +62520,7 @@
       <w:pPr>
         <w:pStyle w:val="Ttulo1"/>
       </w:pPr>
-      <w:bookmarkStart w:id="109" w:name="_Toc0109"/>
+      <w:bookmarkStart w:id="108" w:name="_Toc0108"/>
       <w:r>
         <w:t xml:space="preserve">Capítulo 5</w:t>
       </w:r>
@@ -62553,7 +62530,7 @@
       <w:r>
         <w:t xml:space="preserve">Conclusão</w:t>
       </w:r>
-      <w:bookmarkEnd w:id="109"/>
+      <w:bookmarkEnd w:id="108"/>
       <w:r>
         <w:fldChar w:fldCharType="begin"/>
       </w:r>
@@ -62570,6 +62547,78 @@
       </w:pPr>
       <w:r>
         <w:t xml:space="preserve">As conclusões estão organizadas por dispositivo: a seção 5A trata do gerador de torque da US 9.889.554 B2, e a seção 5B, do dispositivo da EP 3 504 033 B1.</w:t>
+      </w:r>
+    </w:p>
+    <w:p>
+      <w:pPr>
+        <w:pStyle w:val="Ttulo2"/>
+      </w:pPr>
+      <w:bookmarkStart w:id="109" w:name="_Toc0109"/>
+      <w:r>
+        <w:t xml:space="preserve">5A</w:t>
+      </w:r>
+      <w:r>
+        <w:tab/>
+      </w:r>
+      <w:r>
+        <w:t xml:space="preserve">Exoesqueleto 1: US 9.889.554 B2</w:t>
+      </w:r>
+      <w:bookmarkEnd w:id="109"/>
+    </w:p>
+    <w:p>
+      <w:pPr>
+        <w:pStyle w:val="SemRecuo"/>
+      </w:pPr>
+      <w:r>
+        <w:t xml:space="preserve">Este trabalho reconstruiu, a partir da documentação de patente, o gerador de torque de mola da US 9.889.554 B2 e formulou um modelo estático do torque que ele entrega em função do ângulo. A cinemática foi resolvida em forma fechada a partir da equação de fechamento do circuito vetorial, e cada etapa da cadeia de cálculo foi conferida por verificações independentes, com resíduos da ordem de 10</w:t>
+      </w:r>
+      <w:r>
+        <w:rPr>
+          <w:vertAlign w:val="superscript"/>
+        </w:rPr>
+        <w:t xml:space="preserve">−13</w:t>
+      </w:r>
+      <w:r>
+        <w:t xml:space="preserve"> mm nas relações geométricas.</w:t>
+      </w:r>
+    </w:p>
+    <w:p>
+      <w:r>
+        <w:t xml:space="preserve">O princípio dos trabalhos virtuais mostrou-se o critério decisivo na formulação. Ele revelou que a extensão da mola deve acompanhar o caminho completo do cabo, ℓ = s − Rψ, e não apenas o vão livre, que violava a conservação de energia com resíduo de 1,71 mm. A mesma verificação distinguiu o braço de momento perpendicular, limitado a 22,919 mm, da distância do pivô ao ponto de tangência, próxima de 283 mm, cuja confusão superestimaria o torque por um fator superior a 12.</w:t>
+      </w:r>
+    </w:p>
+    <w:p>
+      <w:r>
+        <w:t xml:space="preserve">Com os parâmetros congelados, o modelo reproduz a forma da curva publicada com coeficiente de determinação de 0,99839 e RMSE de 1,83 u.p., equivalente a 1,24% do maior valor extraído. Os resíduos, contudo, organizam-se em zonas de sinal alternado, o que indica diferença sistemática de forma, e a formulação anterior, fisicamente inconsistente, ajustava melhor a curva. A adoção da formulação consistente, apesar do RMSE maior, reflete o critério de que a escolha entre modelos se faz por validade física, e não pelo indicador de erro.</w:t>
+      </w:r>
+    </w:p>
+    <w:p>
+      <w:r>
+        <w:t xml:space="preserve">A varredura de h com K congelado separou o que a geometria impõe do que a curva extraída sugere. O cabo permanece tracionado em toda a faixa de operação somente para h ≤ 32,886 mm, o que exclui a cota de 34,785 mm lida no CAD. A curva extraída favorece um intervalo de 0,145 mm em torno do valor adotado, mas essa concentração é esperada por construção, porque K e X</w:t>
+      </w:r>
+      <w:r>
+        <w:rPr>
+          <w:vertAlign w:val="subscript"/>
+        </w:rPr>
+        <w:t xml:space="preserve">pose</w:t>
+      </w:r>
+      <w:r>
+        <w:t xml:space="preserve"> foram identificados nesse mesmo valor; o critério que levou a h = 22,701 mm não pôde ser reproduzido, e a afirmação anterior de decrescimento monotônico do erro com h foi refutada pela auditoria.</w:t>
+      </w:r>
+    </w:p>
+    <w:p>
+      <w:r>
+        <w:t xml:space="preserve">No confronto com o torque gravitacional do conjunto braço–exoesqueleto, cujo pico de 11,16 N·m ocorre a 89,4° de elevação, as curvas normalizadas diferem em no máximo 0,027 entre 105° e 150° de elevação. O pico do torque do cabo, a 97,5°, fica 8,05° acima do pico gravitacional, e o ponto morto, a 30,5°, libera o braço nas posturas de não trabalho, à custa de subcompensação abaixo de 94°. O resultado quantifica o compromisso de um mecanismo passivo de torque fixo por ângulo, que favorece o trabalho acima da cabeça.</w:t>
+      </w:r>
+    </w:p>
+    <w:p>
+      <w:r>
+        <w:t xml:space="preserve">O objetivo geral foi atingido em sua parte estática e para o primeiro dos três dispositivos previstos; o segundo é tratado na seção 5B. Os objetivos específicos a, b, c e e foram cumpridos; o objetivo d, parcialmente, pois a rigidez e a extensão da mola na pose foram reproduzidas, mas a origem da posição da ancoragem e da calibração angular não. Os objetivos f e g, referentes à equação de movimento e ao acoplamento com o MBDyn, não foram executados. A principal restrição é a ausência de unidade na ordenada da curva da patente: o torque do cabo permanece em unidade da patente, e a leitura em N·m conduz a forças implausíveis, de modo que o modelo determina a forma do torque, mas não sua escala física.</w:t>
+      </w:r>
+    </w:p>
+    <w:p>
+      <w:r>
+        <w:t xml:space="preserve">Como continuidade, recomenda-se obter um dado independente que fixe a escala do torque, como a especificação de uma mola comercial compatível; conferir no CAD a cota de ancoragem, o comprimento do alojamento e o comprimento da mola na pose; documentar o procedimento de extração dos pontos e sua incerteza; representar a protuberância responsável pela zona neutra; e, com o torque em unidade física, executar as etapas dinâmicas pela formulação de Lagrange e no MBDyn e estender o procedimento à US 9.737.374 B2. A extensão à EP 3 504 033 B1 é apresentada nas seções 3B, 4B e 5B.</w:t>
       </w:r>
     </w:p>
     <w:p>
@@ -62578,87 +62627,15 @@
       </w:pPr>
       <w:bookmarkStart w:id="110" w:name="_Toc0110"/>
       <w:r>
-        <w:t xml:space="preserve">5A</w:t>
+        <w:t xml:space="preserve">5B</w:t>
       </w:r>
       <w:r>
         <w:tab/>
       </w:r>
       <w:r>
-        <w:t xml:space="preserve">Exoesqueleto 1: US 9.889.554 B2</w:t>
+        <w:t xml:space="preserve">Exoesqueleto 2: EP 3 504 033 B1</w:t>
       </w:r>
       <w:bookmarkEnd w:id="110"/>
-    </w:p>
-    <w:p>
-      <w:pPr>
-        <w:pStyle w:val="SemRecuo"/>
-      </w:pPr>
-      <w:r>
-        <w:t xml:space="preserve">Este trabalho reconstruiu, a partir da documentação de patente, o gerador de torque de mola da US 9.889.554 B2 e formulou um modelo estático do torque que ele entrega em função do ângulo. A cinemática foi resolvida em forma fechada a partir da equação de fechamento do circuito vetorial, e cada etapa da cadeia de cálculo foi conferida por verificações independentes, com resíduos da ordem de 10</w:t>
-      </w:r>
-      <w:r>
-        <w:rPr>
-          <w:vertAlign w:val="superscript"/>
-        </w:rPr>
-        <w:t xml:space="preserve">−13</w:t>
-      </w:r>
-      <w:r>
-        <w:t xml:space="preserve"> mm nas relações geométricas.</w:t>
-      </w:r>
-    </w:p>
-    <w:p>
-      <w:r>
-        <w:t xml:space="preserve">O princípio dos trabalhos virtuais mostrou-se o critério decisivo na formulação. Ele revelou que a extensão da mola deve acompanhar o caminho completo do cabo, ℓ = s − Rψ, e não apenas o vão livre, que violava a conservação de energia com resíduo de 1,71 mm. A mesma verificação distinguiu o braço de momento perpendicular, limitado a 22,919 mm, da distância do pivô ao ponto de tangência, próxima de 283 mm, cuja confusão superestimaria o torque por um fator superior a 12.</w:t>
-      </w:r>
-    </w:p>
-    <w:p>
-      <w:r>
-        <w:t xml:space="preserve">Com os parâmetros congelados, o modelo reproduz a forma da curva publicada com coeficiente de determinação de 0,99839 e RMSE de 1,83 u.p., equivalente a 1,24% do maior valor extraído. Os resíduos, contudo, organizam-se em zonas de sinal alternado, o que indica diferença sistemática de forma, e a formulação anterior, fisicamente inconsistente, ajustava melhor a curva. A adoção da formulação consistente, apesar do RMSE maior, reflete o critério de que a escolha entre modelos se faz por validade física, e não pelo indicador de erro.</w:t>
-      </w:r>
-    </w:p>
-    <w:p>
-      <w:r>
-        <w:t xml:space="preserve">A varredura de h com K congelado separou o que a geometria impõe do que a curva extraída sugere. O cabo permanece tracionado em toda a faixa de operação somente para h ≤ 32,886 mm, o que exclui a cota de 34,785 mm lida no CAD. A curva extraída favorece um intervalo de 0,145 mm em torno do valor adotado, mas essa concentração é esperada por construção, porque K e X</w:t>
-      </w:r>
-      <w:r>
-        <w:rPr>
-          <w:vertAlign w:val="subscript"/>
-        </w:rPr>
-        <w:t xml:space="preserve">pose</w:t>
-      </w:r>
-      <w:r>
-        <w:t xml:space="preserve"> foram identificados nesse mesmo valor; o critério que levou a h = 22,701 mm não pôde ser reproduzido, e a afirmação anterior de decrescimento monotônico do erro com h foi refutada pela auditoria.</w:t>
-      </w:r>
-    </w:p>
-    <w:p>
-      <w:r>
-        <w:t xml:space="preserve">No confronto com o torque gravitacional do conjunto braço–exoesqueleto, cujo pico de 11,16 N·m ocorre a 89,4° de elevação, as curvas normalizadas diferem em no máximo 0,027 entre 105° e 150° de elevação. O pico do torque do cabo, a 97,5°, fica 8,05° acima do pico gravitacional, e o ponto morto, a 30,5°, libera o braço nas posturas de não trabalho, à custa de subcompensação abaixo de 94°. O resultado quantifica o compromisso de um mecanismo passivo de torque fixo por ângulo, que favorece o trabalho acima da cabeça.</w:t>
-      </w:r>
-    </w:p>
-    <w:p>
-      <w:r>
-        <w:t xml:space="preserve">O objetivo geral foi atingido em sua parte estática e para o primeiro dos três dispositivos previstos; o segundo é tratado na seção 5B. Os objetivos específicos a, b, c e e foram cumpridos; o objetivo d, parcialmente, pois a rigidez e a extensão da mola na pose foram reproduzidas, mas a origem da posição da ancoragem e da calibração angular não. Os objetivos f e g, referentes à equação de movimento e ao acoplamento com o MBDyn, não foram executados. A principal restrição é a ausência de unidade na ordenada da curva da patente: o torque do cabo permanece em unidade da patente, e a leitura em N·m conduz a forças implausíveis, de modo que o modelo determina a forma do torque, mas não sua escala física.</w:t>
-      </w:r>
-    </w:p>
-    <w:p>
-      <w:r>
-        <w:t xml:space="preserve">Como continuidade, recomenda-se obter um dado independente que fixe a escala do torque, como a especificação de uma mola comercial compatível; conferir no CAD a cota de ancoragem, o comprimento do alojamento e o comprimento da mola na pose; documentar o procedimento de extração dos pontos e sua incerteza; representar a protuberância responsável pela zona neutra; e, com o torque em unidade física, executar as etapas dinâmicas pela formulação de Lagrange e no MBDyn e estender o procedimento à US 9.737.374 B2. A extensão à EP 3 504 033 B1 é apresentada nas seções 3B, 4B e 5B.</w:t>
-      </w:r>
-    </w:p>
-    <w:p>
-      <w:pPr>
-        <w:pStyle w:val="Ttulo2"/>
-      </w:pPr>
-      <w:bookmarkStart w:id="111" w:name="_Toc0111"/>
-      <w:r>
-        <w:t xml:space="preserve">5B</w:t>
-      </w:r>
-      <w:r>
-        <w:tab/>
-      </w:r>
-      <w:r>
-        <w:t xml:space="preserve">Exoesqueleto 2: EP 3 504 033 B1</w:t>
-      </w:r>
-      <w:bookmarkEnd w:id="111"/>
     </w:p>
     <w:p>
       <w:pPr>
@@ -62858,7 +62835,7 @@
         <w:t xml:space="preserve">40</w:t>
       </w:r>
       <w:r>
-        <w:t xml:space="preserve">; as grandezas do CAD não puderam ser conferidas; e a composição inercial e o torque gravitacional incluem só o membro humano, sem as peças do exoesqueleto previstas nos itens a e e. O item i foi cumprido pelo espaçamento entre as curvas. Para esse dispositivo, o objetivo geral foi atingido na parte estática, com o confronto com o torque gravitacional feito pela forma normalizada e, em N·m, apenas no cenário de projeto. As etapas dinâmicas não foram executadas, pelas razões da seção 3B.13.</w:t>
+        <w:t xml:space="preserve">; as grandezas do CAD não puderam ser conferidas; e a composição inercial e o torque gravitacional incluem só o membro humano, sem as peças do exoesqueleto previstas nos itens a e e. O item i foi cumprido pelo espaçamento entre as curvas. Para esse dispositivo, o objetivo geral foi atingido na parte estática, com o confronto com o torque gravitacional feito pela forma normalizada e, em N·m, apenas no cenário de projeto. As etapas dinâmicas não foram executadas, pelas razões da seção 3B.12.</w:t>
       </w:r>
     </w:p>
     <w:p>
@@ -62941,11 +62918,11 @@
         <w:pStyle w:val="Ttulo1"/>
         <w:spacing w:after="560"/>
       </w:pPr>
-      <w:bookmarkStart w:id="112" w:name="_Toc0112"/>
+      <w:bookmarkStart w:id="111" w:name="_Toc0111"/>
       <w:r>
         <w:t xml:space="preserve">Referências</w:t>
       </w:r>
-      <w:bookmarkEnd w:id="112"/>
+      <w:bookmarkEnd w:id="111"/>
       <w:r>
         <w:fldChar w:fldCharType="begin"/>
       </w:r>

</xml_diff>

<commit_message>
Exo 2: figura dos circuitos conforme a formulação do autor
A figura da seção 3B.5 passa a mostrar os circuitos das equações do
autor, com a alavanca como segmento reto OP: no regime I, o circuito
fechado C1, C2, OP e s; no regime II, o circuito fechado C1, C2, p e
s − x e o triângulo OP, p e x. O elemento 78 só aparece depois do
contato. Os números do modelo não mudam.

Co-Authored-By: Claude Opus 5.5 <noreply@anthropic.com>
Claude-Session: https://claude.ai/code/session_011EXBtMgMjcpkiJ44sLq9TW
</commit_message>
<xml_diff>
--- a/tcc/TCC_modelo_FT.docx
+++ b/tcc/TCC_modelo_FT.docx
@@ -525,7 +525,7 @@
           <w:t xml:space="preserve">Figura 2: </w:t>
         </w:r>
         <w:r>
-          <w:t xml:space="preserve">Circuito do mecanismo na pose do CAD (regime I, θ</w:t>
+          <w:t xml:space="preserve">Circuitos do mecanismo: regime I na pose do CAD (θ</w:t>
         </w:r>
         <w:r>
           <w:rPr>
@@ -534,7 +534,7 @@
           <w:t xml:space="preserve">el</w:t>
         </w:r>
         <w:r>
-          <w:t xml:space="preserve"> = 82,038°) e em θ</w:t>
+          <w:t xml:space="preserve"> = 82,038°) e regime II em θ</w:t>
         </w:r>
         <w:r>
           <w:rPr>
@@ -543,7 +543,7 @@
           <w:t xml:space="preserve">el</w:t>
         </w:r>
         <w:r>
-          <w:t xml:space="preserve"> = 10° (regime II)</w:t>
+          <w:t xml:space="preserve"> = 10°</w:t>
         </w:r>
         <w:r>
           <w:tab/>
@@ -2403,7 +2403,7 @@
           <w:tab/>
         </w:r>
         <w:r>
-          <w:t xml:space="preserve">48</w:t>
+          <w:t xml:space="preserve">49</w:t>
         </w:r>
       </w:hyperlink>
     </w:p>
@@ -18225,7 +18225,7 @@
         <w:t xml:space="preserve">: </w:t>
       </w:r>
       <w:r>
-        <w:t xml:space="preserve">Circuito do mecanismo na pose do CAD (regime I, θ</w:t>
+        <w:t xml:space="preserve">Circuitos do mecanismo: regime I na pose do CAD (θ</w:t>
       </w:r>
       <w:r>
         <w:rPr>
@@ -18234,7 +18234,7 @@
         <w:t xml:space="preserve">el</w:t>
       </w:r>
       <w:r>
-        <w:t xml:space="preserve"> = 82,038°) e em θ</w:t>
+        <w:t xml:space="preserve"> = 82,038°) e regime II em θ</w:t>
       </w:r>
       <w:r>
         <w:rPr>
@@ -18243,7 +18243,7 @@
         <w:t xml:space="preserve">el</w:t>
       </w:r>
       <w:r>
-        <w:t xml:space="preserve"> = 10° (regime II)</w:t>
+        <w:t xml:space="preserve"> = 10°</w:t>
       </w:r>
       <w:bookmarkEnd w:id="43"/>
     </w:p>
@@ -18254,9 +18254,9 @@
       <w:r>
         <w:drawing>
           <wp:inline distT="0" distB="0" distL="0" distR="0">
-            <wp:extent cx="5760000" cy="2649600"/>
+            <wp:extent cx="5760000" cy="4838400"/>
             <wp:effectExtent l="0" t="0" r="0" b="0"/>
-            <wp:docPr id="2" name="Imagem 2" descr="Circuito do mecanismo da Ottobock: ancoragem A, pivô O, alavanca com cotovelo até P, elemento 78 e elástico, na pose do CAD e com o braço a 10 graus de anteversão; à direita, ampliação da região do pivô."/>
+            <wp:docPr id="2" name="Imagem 2" descr="Circuitos do mecanismo da Ottobock. Acima, regime I na pose do CAD: vetores C1, C2, e e s fechando o circuito de A por O e P. Abaixo, regime II com o braço a 10 graus: circuito C1, C2, p e s menos x, e triângulo e, p, x. À direita, ampliação da região do pivô."/>
             <wp:cNvGraphicFramePr>
               <a:graphicFrameLocks xmlns:a="http://schemas.openxmlformats.org/drawingml/2006/main" noChangeAspect="1"/>
             </wp:cNvGraphicFramePr>
@@ -18276,7 +18276,7 @@
                   <pic:spPr>
                     <a:xfrm>
                       <a:off x="0" y="0"/>
-                      <a:ext cx="5760000" cy="2649600"/>
+                      <a:ext cx="5760000" cy="4838400"/>
                     </a:xfrm>
                     <a:prstGeom prst="rect">
                       <a:avLst/>
@@ -18310,7 +18310,67 @@
           <w:sz w:val="20"/>
           <w:szCs w:val="20"/>
         </w:rPr>
-        <w:t xml:space="preserve">Nota: à direita, ampliação da região do pivô. O traço preto vai de O ao cotovelo e ao ponto P; os quadrados marcam o centro do elemento 78; as linhas pontilhadas indicam o eixo do braço.</w:t>
+        <w:t xml:space="preserve">Nota: à direita, ampliação da região do pivô. A alavanca está representada pelo segmento OP, de comprimento |OP|. Regime I: circuito fechado C</w:t>
+      </w:r>
+      <w:r>
+        <w:rPr>
+          <w:sz w:val="20"/>
+          <w:szCs w:val="20"/>
+          <w:vertAlign w:val="subscript"/>
+        </w:rPr>
+        <w:t xml:space="preserve">1</w:t>
+      </w:r>
+      <w:r>
+        <w:rPr>
+          <w:sz w:val="20"/>
+          <w:szCs w:val="20"/>
+        </w:rPr>
+        <w:t xml:space="preserve">, C</w:t>
+      </w:r>
+      <w:r>
+        <w:rPr>
+          <w:sz w:val="20"/>
+          <w:szCs w:val="20"/>
+          <w:vertAlign w:val="subscript"/>
+        </w:rPr>
+        <w:t xml:space="preserve">2</w:t>
+      </w:r>
+      <w:r>
+        <w:rPr>
+          <w:sz w:val="20"/>
+          <w:szCs w:val="20"/>
+        </w:rPr>
+        <w:t xml:space="preserve">, OP e s. Regime II: circuito fechado C</w:t>
+      </w:r>
+      <w:r>
+        <w:rPr>
+          <w:sz w:val="20"/>
+          <w:szCs w:val="20"/>
+          <w:vertAlign w:val="subscript"/>
+        </w:rPr>
+        <w:t xml:space="preserve">1</w:t>
+      </w:r>
+      <w:r>
+        <w:rPr>
+          <w:sz w:val="20"/>
+          <w:szCs w:val="20"/>
+        </w:rPr>
+        <w:t xml:space="preserve">, C</w:t>
+      </w:r>
+      <w:r>
+        <w:rPr>
+          <w:sz w:val="20"/>
+          <w:szCs w:val="20"/>
+          <w:vertAlign w:val="subscript"/>
+        </w:rPr>
+        <w:t xml:space="preserve">2</w:t>
+      </w:r>
+      <w:r>
+        <w:rPr>
+          <w:sz w:val="20"/>
+          <w:szCs w:val="20"/>
+        </w:rPr>
+        <w:t xml:space="preserve">, p e s − x, e triângulo OP, p e x (OP tracejado); o elemento 78, na ponta de p, só entra depois do contato. As linhas pontilhadas indicam o eixo do braço.</w:t>
       </w:r>
     </w:p>
     <w:p>

</xml_diff>

<commit_message>
TCC: exo 2 sem citação de parágrafos e reivindicações da patente
Uniformiza as partes 3B e 4B com a 3A, que cita a patente sem número de
parágrafo nem de reivindicação: saem as 89 citações entre colchetes
([0093] etc.) e as reivindicações numeradas, e as frases que dependiam
delas ("Segundo [0093]") passam a "segundo a patente". Na Tabela de
fontes, a lista de trechos citados fica só com as figuras da patente.

Co-Authored-By: Claude Opus 5.5 <noreply@anthropic.com>
Claude-Session: https://claude.ai/code/session_011EXBtMgMjcpkiJ44sLq9TW
</commit_message>
<xml_diff>
--- a/tcc/TCC_modelo_FT.docx
+++ b/tcc/TCC_modelo_FT.docx
@@ -2195,7 +2195,7 @@
           <w:tab/>
         </w:r>
         <w:r>
-          <w:t xml:space="preserve">37</w:t>
+          <w:t xml:space="preserve">36</w:t>
         </w:r>
       </w:hyperlink>
     </w:p>
@@ -13546,12 +13546,12 @@
     </w:p>
     <w:p>
       <w:r>
-        <w:t xml:space="preserve">A classificação de origem é a da introdução deste capítulo: medida no modelo em CAD, obtida da literatura, documental, identificada por ajuste, derivada pelo modelo ou assumida como hipótese. Os trechos da patente são citados pelo número do parágrafo, entre colchetes, pelo número da reivindicação ou pelo número da figura.</w:t>
-      </w:r>
-    </w:p>
-    <w:p>
-      <w:r>
-        <w:t xml:space="preserve">A análise usou os documentos e arquivos da Tabela 2. A patente foi lida no documento B1 completo, de 44 páginas, com a descrição, os parágrafos [0001] a [0105], as reivindicações em alemão, inglês e francês e as 29 figuras, que ocupam as páginas 22 a 43 como imagens bitonais de 300 ppp. Os dados bibliográficos conferem com a referência listada: pedido europeu 18729947.4, depositado em 6 jun. 2018 (PCT/EP2018/064910, publicado como WO 2018/224555), prioridade alemã DE 10 2017 112 436, de 6 jun. 2017, e menção da concessão publicada em 29 mar. 2023.</w:t>
+        <w:t xml:space="preserve">A classificação de origem é a da introdução deste capítulo: medida no modelo em CAD, obtida da literatura, documental, identificada por ajuste, derivada pelo modelo ou assumida como hipótese.</w:t>
+      </w:r>
+    </w:p>
+    <w:p>
+      <w:r>
+        <w:t xml:space="preserve">A análise usou os documentos e arquivos da Tabela 2. A patente foi lida no documento B1 completo, de 44 páginas, com a descrição, as reivindicações em alemão, inglês e francês e as 29 figuras, que ocupam as páginas 22 a 43 como imagens bitonais de 300 ppp. Os dados bibliográficos conferem com a referência listada: pedido europeu 18729947.4, depositado em 6 jun. 2018 (PCT/EP2018/064910, publicado como WO 2018/224555), prioridade alemã DE 10 2017 112 436, de 6 jun. 2017, e menção da concessão publicada em 29 mar. 2023.</w:t>
       </w:r>
     </w:p>
     <w:p>
@@ -13772,7 +13772,7 @@
                 <w:sz w:val="22"/>
                 <w:szCs w:val="22"/>
               </w:rPr>
-              <w:t xml:space="preserve">Arquitetura e numeração dos elementos; [0016] a [0019], [0021] a [0023], [0026], [0027], [0030], [0034], [0040], [0043], [0044], [0060], [0070], [0071], [0073], [0074], [0077] a [0080], [0083], [0092] a [0095], [0099], [0101]; reivindicações 1, 8 e 9; Figuras 1, 16, 17, 18, 22 e 24 da patente</w:t>
+              <w:t xml:space="preserve">Arquitetura e numeração dos elementos; Figuras 1, 16, 17, 18, 22 e 24 da patente</w:t>
             </w:r>
           </w:p>
         </w:tc>
@@ -14317,22 +14317,22 @@
         <w:pStyle w:val="SemRecuo"/>
       </w:pPr>
       <w:r>
-        <w:t xml:space="preserve">A reconstrução parte da arquitetura descrita na patente. A EP 3 504 033 B1 descreve um dispositivo de apoio de pelo menos um braço do usuário. O elemento de apoio do braço (6), formado por um elemento distanciador (8) e uma concha (10) e fixado ao braço por uma braçadeira (12), liga-se por uma articulação (20) à extremidade superior de um elemento de transmissão de força (18), uma barra telescópica no exemplo da Figura 1 da patente [0078], [0079]. A extremidade inferior da barra apoia-se, por uma articulação esférica (22), num elemento de contra-apoio (16) em forma de cinto pélvico, de modo que a reação à força de apoio é levada à pelve [0021], [0022], [0079]. Com o dispositivo vestido, a articulação 20 fica aproximadamente na altura da articulação do ombro [0021], [0073].</w:t>
-      </w:r>
-    </w:p>
-    <w:p>
-      <w:r>
-        <w:t xml:space="preserve">O atuador passivo (26) é uma mola de tração na Figura 1 da patente [0080] e um cabo ou fio elástico na Figura 18 da patente [0095]. Uma de suas extremidades fica presa à barra 18, e a outra atua sobre um elemento de alavanca (28) do elemento distanciador 8, de modo que a força é aplicada excentricamente em relação ao eixo da articulação 20 [0043], [0080] (reivindicação 8). A força pode ser alterada pela pré-tensão do atuador ou pela excentricidade do ponto de aplicação (reivindicação 9; [0044]). A Figura 24 da patente mostra o ponto de ataque (82) deslocado com uma chave de fenda em relação ao eixo da articulação [0101], e o parágrafo [0060] prevê a regulagem do comprimento do braço de alavanca por um parafuso.</w:t>
-      </w:r>
-    </w:p>
-    <w:p>
-      <w:r>
-        <w:t xml:space="preserve">O elemento 78, chamado na patente de Anlageelement e aqui de elemento de encosto, fica junto à articulação 20 e encosta no elemento elástico a partir de um ângulo predeterminado entre o elemento de apoio do braço e a barra [0070], [0099] (Figura 22 da patente). A partir do contato, a direção da força deixa de ser a da reta entre os dois pontos de fixação do elástico e passa a depender do ponto de contato. A patente prefere o elemento 78 exatamente sobre o eixo da articulação 20; nesse caso, os dois trechos em que o elástico fica dividido exercem forças radiais ao eixo e não produzem torque, e o braço desce sem assistência [0070], [0099]. O ângulo de contato é ajustável [0071], [0099]. Esse é o mecanismo da faixa sem torque com o braço baixado, que no gerador da US 9.889.554 B2 resulta da protuberância descrita na seção 2.3.</w:t>
-      </w:r>
-    </w:p>
-    <w:p>
-      <w:r>
-        <w:t xml:space="preserve">Como preferência, a patente indica que nenhuma força seja aplicada até que o braço ultrapasse um ângulo em relação à vertical, com 45°, 60° ou 90° como exemplos, e que a força máxima ocorra entre 70° e 120°, de preferência em 90° [0043]. O documento não traz cotas do mecanismo nem rigidez, pré-tensão ou dimensões do elemento elástico. Os dados numéricos que contém são a largura de 3,0 cm ± 1,0 cm, de preferência 3,5 cm ± 0,2 cm, da extremidade livre do cinto [0026], o afastamento lateral mínimo de 5 cm entre o contra-apoio e a linha média da coluna [0074], limites de 1,1 a 5,0 para a razão entre a distância da articulação ao contra-apoio e a distância da braçadeira à articulação [0023] e as escalas angulares das Figuras 16 e 17 da patente, nenhum deles utilizável como dimensão do gerador de torque.</w:t>
+        <w:t xml:space="preserve">A reconstrução parte da arquitetura descrita na patente. A EP 3 504 033 B1 descreve um dispositivo de apoio de pelo menos um braço do usuário. O elemento de apoio do braço (6), formado por um elemento distanciador (8) e uma concha (10) e fixado ao braço por uma braçadeira (12), liga-se por uma articulação (20) à extremidade superior de um elemento de transmissão de força (18), uma barra telescópica no exemplo da Figura 1 da patente. A extremidade inferior da barra apoia-se, por uma articulação esférica (22), num elemento de contra-apoio (16) em forma de cinto pélvico, de modo que a reação à força de apoio é levada à pelve. Com o dispositivo vestido, a articulação 20 fica aproximadamente na altura da articulação do ombro.</w:t>
+      </w:r>
+    </w:p>
+    <w:p>
+      <w:r>
+        <w:t xml:space="preserve">O atuador passivo (26) é uma mola de tração na Figura 1 da patente e um cabo ou fio elástico na Figura 18 da patente. Uma de suas extremidades fica presa à barra 18, e a outra atua sobre um elemento de alavanca (28) do elemento distanciador 8, de modo que a força é aplicada excentricamente em relação ao eixo da articulação 20. A força pode ser alterada pela pré-tensão do atuador ou pela excentricidade do ponto de aplicação. A Figura 24 da patente mostra o ponto de ataque (82) deslocado com uma chave de fenda em relação ao eixo da articulação, e a patente prevê ainda a regulagem do comprimento do braço de alavanca por um parafuso.</w:t>
+      </w:r>
+    </w:p>
+    <w:p>
+      <w:r>
+        <w:t xml:space="preserve">O elemento 78, chamado na patente de Anlageelement e aqui de elemento de encosto, fica junto à articulação 20 e encosta no elemento elástico a partir de um ângulo predeterminado entre o elemento de apoio do braço e a barra (Figura 22 da patente). A partir do contato, a direção da força deixa de ser a da reta entre os dois pontos de fixação do elástico e passa a depender do ponto de contato. A patente prefere o elemento 78 exatamente sobre o eixo da articulação 20; nesse caso, os dois trechos em que o elástico fica dividido exercem forças radiais ao eixo e não produzem torque, e o braço desce sem assistência. O ângulo de contato é ajustável. Esse é o mecanismo da faixa sem torque com o braço baixado, que no gerador da US 9.889.554 B2 resulta da protuberância descrita na seção 2.3.</w:t>
+      </w:r>
+    </w:p>
+    <w:p>
+      <w:r>
+        <w:t xml:space="preserve">Como preferência, a patente indica que nenhuma força seja aplicada até que o braço ultrapasse um ângulo em relação à vertical, com 45°, 60° ou 90° como exemplos, e que a força máxima ocorra entre 70° e 120°, de preferência em 90°. O documento não traz cotas do mecanismo nem rigidez, pré-tensão ou dimensões do elemento elástico. Os dados numéricos que contém são a largura de 3,0 cm ± 1,0 cm, de preferência 3,5 cm ± 0,2 cm, da extremidade livre do cinto, o afastamento lateral mínimo de 5 cm entre o contra-apoio e a linha média da coluna, limites de 1,1 a 5,0 para a razão entre a distância da articulação ao contra-apoio e a distância da braçadeira à articulação e as escalas angulares das Figuras 16 e 17 da patente, nenhum deles utilizável como dimensão do gerador de torque.</w:t>
       </w:r>
     </w:p>
     <w:p>
@@ -14342,7 +14342,7 @@
     </w:p>
     <w:p>
       <w:r>
-        <w:t xml:space="preserve">O dispositivo admite abdução, adução e movimentos do tronco (reivindicação 1; [0016] a [0019]). O modelo é plano, restrito ao plano sagital, e representa somente a anteversão, que é o movimento das Figuras 16 e 17 da patente [0092].</w:t>
+        <w:t xml:space="preserve">O dispositivo admite abdução, adução e movimentos do tronco. O modelo é plano, restrito ao plano sagital, e representa somente a anteversão, que é o movimento das Figuras 16 e 17 da patente.</w:t>
       </w:r>
     </w:p>
     <w:p>
@@ -14442,7 +14442,7 @@
         <w:t xml:space="preserve">el</w:t>
       </w:r>
       <w:r>
-        <w:t xml:space="preserve">, com 0° para o braço pendente e 90° para o braço horizontal à frente. É a grandeza da abscissa das Figuras 16 e 17 da patente, definida nesses termos em [0092]. Por isso, ao contrário da seção 3A.3, o ângulo da patente não precisa ser convertido em elevação anatômica. O modelo admite, porém, que o giro do elemento de apoio do braço em relação à barra 18 seja igual à anteversão, o que supõe o eixo da articulação 20 no centro do ombro e a barra 18 fixa em relação ao tronco. A patente situa a articulação na altura do ombro, na região da escápula e afastada para trás do corpo com o braço pendente [0030], [0083], com eixo que não coincide com o de abdução do ombro [0027], e admite que a orientação da barra 18 mude com o movimento do braço [0040]. O documento não informa a relação entre o giro da articulação e a anteversão, e as comparações angulares com as Figuras 16 e 17 da patente dependem dessa hipótese. O eixo do braço aponta na direção θ</w:t>
+        <w:t xml:space="preserve">, com 0° para o braço pendente e 90° para o braço horizontal à frente. É a grandeza da abscissa das Figuras 16 e 17 da patente, definida nesses termos pela própria patente. Por isso, ao contrário da seção 3A.3, o ângulo da patente não precisa ser convertido em elevação anatômica. O modelo admite, porém, que o giro do elemento de apoio do braço em relação à barra 18 seja igual à anteversão, o que supõe o eixo da articulação 20 no centro do ombro e a barra 18 fixa em relação ao tronco. A patente situa a articulação na altura do ombro, na região da escápula e afastada para trás do corpo com o braço pendente, com eixo que não coincide com o de abdução do ombro, e admite que a orientação da barra 18 mude com o movimento do braço. O documento não informa a relação entre o giro da articulação e a anteversão, e as comparações angulares com as Figuras 16 e 17 da patente dependem dessa hipótese. O eixo do braço aponta na direção θ</w:t>
       </w:r>
       <w:r>
         <w:rPr>
@@ -18973,7 +18973,7 @@
     </w:p>
     <w:p>
       <w:r>
-        <w:t xml:space="preserve">No regime II, o trecho entre o elemento 78 e P liga dois pontos do mesmo corpo; as forças que exerce sobre P e sobre o elemento 78 são iguais, opostas e colineares e não contribuem para o torque, o que corresponde à descrição de [0099]. O braço de momento com sinal é</w:t>
+        <w:t xml:space="preserve">No regime II, o trecho entre o elemento 78 e P liga dois pontos do mesmo corpo; as forças que exerce sobre P e sobre o elemento 78 são iguais, opostas e colineares e não contribuem para o torque, o que corresponde à descrição da patente. O braço de momento com sinal é</w:t>
       </w:r>
     </w:p>
     <w:tbl>
@@ -19416,7 +19416,7 @@
     </w:tbl>
     <w:p>
       <w:r>
-        <w:t xml:space="preserve">com λ em radianos, relação análoga à Equação (17), verificada numericamente nos dois regimes (seção 4B.3). O sinal negativo, oposto ao da Equação (17), vem de λ crescer com a elevação do braço, ao passo que θ* decresce; nos dois mecanismos, m é positivo quando assiste a subida, e o elástico se encurta quando o braço sobe e devolve energia, como descreve [0034].</w:t>
+        <w:t xml:space="preserve">com λ em radianos, relação análoga à Equação (17), verificada numericamente nos dois regimes (seção 4B.3). O sinal negativo, oposto ao da Equação (17), vem de λ crescer com a elevação do braço, ao passo que θ* decresce; nos dois mecanismos, m é positivo quando assiste a subida, e o elástico se encurta quando o braço sobe e devolve energia, como descreve a patente.</w:t>
       </w:r>
     </w:p>
     <w:p>
@@ -19467,7 +19467,7 @@
         <w:t xml:space="preserve">78</w:t>
       </w:r>
       <w:r>
-        <w:t xml:space="preserve"> = 0), configuração preferida pela patente [0099], a transição tem forma fechada:</w:t>
+        <w:t xml:space="preserve"> = 0), configuração preferida pela patente, a transição tem forma fechada:</w:t>
       </w:r>
     </w:p>
     <w:tbl>
@@ -20104,12 +20104,12 @@
         <w:pStyle w:val="SemRecuo"/>
       </w:pPr>
       <w:r>
-        <w:t xml:space="preserve">As Figuras 16 e 17 da patente são apresentadas como representações exemplares das curvas de força que o dispositivo pode aplicar ao braço [0077], [0092]; o documento não informa se foram medidas ou calculadas, nem a configuração do dispositivo que as gerou. A abscissa é o ângulo de anteversão, com escala de 0° a 180° e grade a cada 20°. A ordenada não tem rótulo nem valores, apenas linhas de grade: há cinco divisões acima da linha de razão nula e uma abaixo (Figura 3). Segundo [0092], a ordenada da Figura 16 da patente é uma razão de torques: o torque causado pelo peso próprio do braço e pela força peso, sem indicação do corpo a que esta se refere, dividido pelo torque aplicado pelo dispositivo. As curvas partem de zero perto de 14° e crescem com o ângulo, e com essa definição a razão seria infinita onde o dispositivo não aplica torque. Das duas leituras como razão, só a inversa, torque do dispositivo dividido pelo torque do peso, é coerente com a figura, inclusive com a subida das curvas tracejada e contínua perto de 180°, onde o torque do peso tende a zero. Essa interpretação foi a adotada, e a divergência entre o texto e a figura fica registrada.</w:t>
-      </w:r>
-    </w:p>
-    <w:p>
-      <w:r>
-        <w:t xml:space="preserve">Segundo [0093], as três curvas da Figura 16 da patente foram geradas com um único atuador passivo, com pré-tensões diferentes: quase nula na curva pontilhada e crescente na tracejada e na contínua. A Figura 17 da patente mantém a pré-tensão e desloca o ponto de ataque do atuador, cuja distância ao eixo da articulação cresce da curva pontilhada para a contínua [0094]; o texto descreve a ordenada dessa figura como a força aplicável ao braço, sem outra definição.</w:t>
+        <w:t xml:space="preserve">As Figuras 16 e 17 da patente são apresentadas como representações exemplares das curvas de força que o dispositivo pode aplicar ao braço; o documento não informa se foram medidas ou calculadas, nem a configuração do dispositivo que as gerou. A abscissa é o ângulo de anteversão, com escala de 0° a 180° e grade a cada 20°. A ordenada não tem rótulo nem valores, apenas linhas de grade: há cinco divisões acima da linha de razão nula e uma abaixo (Figura 3). Segundo a patente, a ordenada da Figura 16 da patente é uma razão de torques: o torque causado pelo peso próprio do braço e pela força peso, sem indicação do corpo a que esta se refere, dividido pelo torque aplicado pelo dispositivo. As curvas partem de zero perto de 14° e crescem com o ângulo, e com essa definição a razão seria infinita onde o dispositivo não aplica torque. Das duas leituras como razão, só a inversa, torque do dispositivo dividido pelo torque do peso, é coerente com a figura, inclusive com a subida das curvas tracejada e contínua perto de 180°, onde o torque do peso tende a zero. Essa interpretação foi a adotada, e a divergência entre o texto e a figura fica registrada.</w:t>
+      </w:r>
+    </w:p>
+    <w:p>
+      <w:r>
+        <w:t xml:space="preserve">Segundo a patente, as três curvas da Figura 16 da patente foram geradas com um único atuador passivo, com pré-tensões diferentes: quase nula na curva pontilhada e crescente na tracejada e na contínua. A Figura 17 da patente mantém a pré-tensão e desloca o ponto de ataque do atuador, cuja distância ao eixo da articulação cresce da curva pontilhada para a contínua; o texto descreve a ordenada dessa figura como a força aplicável ao braço, sem outra definição.</w:t>
       </w:r>
     </w:p>
     <w:p>
@@ -20488,7 +20488,7 @@
     </w:p>
     <w:p>
       <w:r>
-        <w:t xml:space="preserve">As três curvas foram geradas com o mesmo atuador e pré-tensões diferentes [0093]; admite-se que a geometria e a rigidez sejam as mesmas nas três, hipótese testada pela coincidência dos fatores G</w:t>
+        <w:t xml:space="preserve">As três curvas foram geradas com o mesmo atuador e pré-tensões diferentes; admite-se que a geometria e a rigidez sejam as mesmas nas três, hipótese testada pela coincidência dos fatores G</w:t>
       </w:r>
       <w:r>
         <w:rPr>
@@ -21084,7 +21084,7 @@
     </w:p>
     <w:p>
       <w:r>
-        <w:t xml:space="preserve">Uma verificação independente vem do fim da curva pontilhada, de pré-tensão quase nula [0093]. Como ℓ decresce com θ</w:t>
+        <w:t xml:space="preserve">Uma verificação independente vem do fim da curva pontilhada, de pré-tensão quase nula. Como ℓ decresce com θ</w:t>
       </w:r>
       <w:r>
         <w:rPr>
@@ -21709,7 +21709,7 @@
     </w:p>
     <w:p>
       <w:r>
-        <w:t xml:space="preserve">A patente atribui as três curvas a um único atuador [0093] e as desenha no mesmo eixo, o que implica K e σ comuns e, portanto, um único c. Esse ajuste conjunto foi feito como verificação independente da hipótese do modelo, com c comum e um s</w:t>
+        <w:t xml:space="preserve">A patente atribui as três curvas a um único atuador e as desenha no mesmo eixo, o que implica K e σ comuns e, portanto, um único c. Esse ajuste conjunto foi feito como verificação independente da hipótese do modelo, com c comum e um s</w:t>
       </w:r>
       <w:r>
         <w:rPr>
@@ -22280,7 +22280,7 @@
         <w:t xml:space="preserve">c</w:t>
       </w:r>
       <w:r>
-        <w:t xml:space="preserve">, a excentricidade |OP| do ponto de aplicação, um dos parâmetros de ajuste previstos na patente (reivindicação 9; [0044], [0060], [0101]) e objeto da Figura 17 da patente [0094]. Por isso, o papel de h na seção 4A é desempenhado aqui por </w:t>
+        <w:t xml:space="preserve">, a excentricidade |OP| do ponto de aplicação, um dos parâmetros de ajuste previstos na patente e objeto da Figura 17 da patente. Por isso, o papel de h na seção 4A é desempenhado aqui por </w:t>
       </w:r>
       <w:r>
         <w:rPr>
@@ -38644,7 +38644,7 @@
         <w:t xml:space="preserve">78</w:t>
       </w:r>
       <w:r>
-        <w:t xml:space="preserve"> = 7,754 mm do eixo da articulação, enquanto a patente prefere esse elemento sobre o eixo [0099]; as consequências dessa diferença são tratadas nas seções 3B.7 e 4B.9.</w:t>
+        <w:t xml:space="preserve"> = 7,754 mm do eixo da articulação, enquanto a patente prefere esse elemento sobre o eixo; as consequências dessa diferença são tratadas nas seções 3B.7 e 4B.9.</w:t>
       </w:r>
     </w:p>
     <w:p>
@@ -48614,7 +48614,7 @@
         <w:t xml:space="preserve">0</w:t>
       </w:r>
       <w:r>
-        <w:t xml:space="preserve"> vale 300,908 mm na curva pontilhada, 287,190 mm na tracejada e 275,589 mm na contínua, com RMSE de 0,255 mm nas 234 equações. A ordem coincide com a das pré-tensões descritas em [0093], porque menor s</w:t>
+        <w:t xml:space="preserve"> vale 300,908 mm na curva pontilhada, 287,190 mm na tracejada e 275,589 mm na contínua, com RMSE de 0,255 mm nas 234 equações. A ordem coincide com a das pré-tensões descritas na patente, porque menor s</w:t>
       </w:r>
       <w:r>
         <w:rPr>
@@ -50164,7 +50164,7 @@
         <w:t xml:space="preserve">0</w:t>
       </w:r>
       <w:r>
-        <w:t xml:space="preserve">, o modelo afrouxa a partir de 166,4°. A patente não diz em que posição a pré-tensão é medida. Interpretando a pré-tensão quase nula de [0093] como extensão próxima de zero na posição de menor comprimento do elástico, perto de 180°, o s</w:t>
+        <w:t xml:space="preserve">, o modelo afrouxa a partir de 166,4°. A patente não diz em que posição a pré-tensão é medida. Interpretando a pré-tensão quase nula como extensão próxima de zero na posição de menor comprimento do elástico, perto de 180°, o s</w:t>
       </w:r>
       <w:r>
         <w:rPr>
@@ -50205,7 +50205,7 @@
         <w:t xml:space="preserve">0</w:t>
       </w:r>
       <w:r>
-        <w:t xml:space="preserve"> igual a ℓ no início da curva tracejada, 387,68 mm, o elástico ficaria frouxo em todos os 1.658 pontos da malha acima desse ângulo, e o torque seria nulo justamente onde a figura o mostra. O início das curvas é atribuído, neste trabalho, ao contato do elástico com o elemento 78, cujo ângulo a patente ajusta pela posição desse elemento [0071], [0099]; a patente não indica a configuração que gerou a Figura 16 da patente e cita outros meios de anular a força abaixo de um ângulo, como cames e corrediças [0043].</w:t>
+        <w:t xml:space="preserve"> igual a ℓ no início da curva tracejada, 387,68 mm, o elástico ficaria frouxo em todos os 1.658 pontos da malha acima desse ângulo, e o torque seria nulo justamente onde a figura o mostra. O início das curvas é atribuído, neste trabalho, ao contato do elástico com o elemento 78, cujo ângulo a patente ajusta pela posição desse elemento; a patente não indica a configuração que gerou a Figura 16 da patente e cita outros meios de anular a força abaixo de um ângulo, como cames e corrediças.</w:t>
       </w:r>
     </w:p>
     <w:p>
@@ -50442,7 +50442,7 @@
         <w:t xml:space="preserve">0</w:t>
       </w:r>
       <w:r>
-        <w:t xml:space="preserve"> = 0 na contínua, ficam longe dos do espaçamento, e as escalas por curva contrariam o atuador único de [0093]. São mantidos como resultado secundário: descrevem a melhor forma que o modelo consegue produzir com a geometria do CAD, e não a pré-tensão do dispositivo.</w:t>
+        <w:t xml:space="preserve"> = 0 na contínua, ficam longe dos do espaçamento, e as escalas por curva contrariam o atuador único descrito na patente. São mantidos como resultado secundário: descrevem a melhor forma que o modelo consegue produzir com a geometria do CAD, e não a pré-tensão do dispositivo.</w:t>
       </w:r>
     </w:p>
     <w:p>
@@ -52920,7 +52920,7 @@
     </w:p>
     <w:p>
       <w:r>
-        <w:t xml:space="preserve">O ajuste conjunto ordena os comprimentos de referência como as pré-tensões descritas em [0093]: s</w:t>
+        <w:t xml:space="preserve">O ajuste conjunto ordena os comprimentos de referência como as pré-tensões descritas na patente: s</w:t>
       </w:r>
       <w:r>
         <w:rPr>
@@ -52952,7 +52952,7 @@
     </w:p>
     <w:p>
       <w:r>
-        <w:t xml:space="preserve">A pré-tensão da curva pontilhada, descrita como quase nula [0093], também diverge do ajuste de forma. Pelo critério da seção 4B.4, a extensão em 180°, essa curva teria 20,37 mm com o s</w:t>
+        <w:t xml:space="preserve">A pré-tensão da curva pontilhada, descrita como quase nula, também diverge do ajuste de forma. Pelo critério da seção 4B.4, a extensão em 180°, essa curva teria 20,37 mm com o s</w:t>
       </w:r>
       <w:r>
         <w:rPr>
@@ -53851,7 +53851,7 @@
                 <w:sz w:val="22"/>
                 <w:szCs w:val="22"/>
               </w:rPr>
-              <w:t xml:space="preserve"> = 0 [0099]</w:t>
+              <w:t xml:space="preserve"> = 0</w:t>
             </w:r>
           </w:p>
         </w:tc>
@@ -57671,7 +57671,7 @@
     </w:p>
     <w:p>
       <w:r>
-        <w:t xml:space="preserve">A Figura 17 da patente não foi digitalizada, e a comparação com ela é visual. Nela, as três curvas partem de perto de 14°; a de maior excentricidade, contínua, atinge o máximo perto de 100°, decresce e cruza as outras duas entre cerca de 155° e 160°, e as três sobem acentuadamente acima de 160°. O texto registra que, acima de cerca de 150°, o andamento difere do da Figura 16 da patente [0094]. No modelo, as curvas de τ/τ</w:t>
+        <w:t xml:space="preserve">A Figura 17 da patente não foi digitalizada, e a comparação com ela é visual. Nela, as três curvas partem de perto de 14°; a de maior excentricidade, contínua, atinge o máximo perto de 100°, decresce e cruza as outras duas entre cerca de 155° e 160°, e as três sobem acentuadamente acima de 160°. O texto registra que, acima de cerca de 150°, o andamento difere do da Figura 16 da patente. No modelo, as curvas de τ/τ</w:t>
       </w:r>
       <w:r>
         <w:rPr>
@@ -57852,7 +57852,7 @@
         <w:t xml:space="preserve">el</w:t>
       </w:r>
       <w:r>
-        <w:t xml:space="preserve"> testadas na identificação, o pico vai de 78,5° a 79,1°, de modo que essas conclusões não dependem da faixa escolhida. A posição do pico fica na faixa de 70° a 120° em que a patente prefere a força máxima [0043], desde que essa força seja lida como a força de apoio sobre o braço, proporcional ao torque na articulação, interpretação do autor; a força do próprio elástico é máxima com o braço pendente. O mesmo parágrafo cita, como exemplo, força nula até 45°, 60° ou 90°, preferência que nem a Figura 16 da patente, com razão não nula a partir de cerca de 14°, nem o modelo, com torque desde 0°, seguem; como esse ângulo é ajustável pela posição do elemento 78 [0071], [0099], os valores citados em [0043] correspondem a regulagens para as quais a patente não publica curva.</w:t>
+        <w:t xml:space="preserve"> testadas na identificação, o pico vai de 78,5° a 79,1°, de modo que essas conclusões não dependem da faixa escolhida. A posição do pico fica na faixa de 70° a 120° em que a patente prefere a força máxima, desde que essa força seja lida como a força de apoio sobre o braço, proporcional ao torque na articulação, interpretação do autor; a força do próprio elástico é máxima com o braço pendente. O mesmo parágrafo cita, como exemplo, força nula até 45°, 60° ou 90°, preferência que nem a Figura 16 da patente, com razão não nula a partir de cerca de 14°, nem o modelo, com torque desde 0°, seguem; como esse ângulo é ajustável pela posição do elemento 78, os valores citados pela patente correspondem a regulagens para as quais a patente não publica curva.</w:t>
       </w:r>
     </w:p>
     <w:p>
@@ -60119,7 +60119,7 @@
         <w:t xml:space="preserve">el</w:t>
       </w:r>
       <w:r>
-        <w:t xml:space="preserve"> &lt; 19,09°, o modelo mantém torque positivo, 0,887 N·m em 10° no cenário de projeto, porque o elemento 78 está a 7,754 mm do eixo. A Figura 16 da patente mostra razão nula abaixo de cerca de 14°, e a patente prefere o elemento 78 sobre o eixo [0099]. A divergência foi mantida no modelo, e não corrigida: ela depende da posição real do elemento 78 e de seu raio de contato, que não estão documentados.</w:t>
+        <w:t xml:space="preserve"> &lt; 19,09°, o modelo mantém torque positivo, 0,887 N·m em 10° no cenário de projeto, porque o elemento 78 está a 7,754 mm do eixo. A Figura 16 da patente mostra razão nula abaixo de cerca de 14°, e a patente prefere o elemento 78 sobre o eixo. A divergência foi mantida no modelo, e não corrigida: ela depende da posição real do elemento 78 e de seu raio de contato, que não estão documentados.</w:t>
       </w:r>
     </w:p>
     <w:p>
@@ -61191,7 +61191,7 @@
                 <w:sz w:val="22"/>
                 <w:szCs w:val="22"/>
               </w:rPr>
-              <w:t xml:space="preserve"> = 0, preferido em [0099]</w:t>
+              <w:t xml:space="preserve"> = 0, preferido pela patente</w:t>
             </w:r>
           </w:p>
         </w:tc>

</xml_diff>

<commit_message>
TCC: agradecimentos com o texto do autor
Co-Authored-By: Claude Opus 5.5 <noreply@anthropic.com>
Claude-Session: https://claude.ai/code/session_011EXBtMgMjcpkiJ44sLq9TW
</commit_message>
<xml_diff>
--- a/tcc/TCC_modelo_FT.docx
+++ b/tcc/TCC_modelo_FT.docx
@@ -313,7 +313,7 @@
         <w:jc w:val="both"/>
       </w:pPr>
       <w:r>
-        <w:t xml:space="preserve">Agradeço à minha família, em especial a [nomes], pelo apoio e pela paciência ao longo de toda a graduação.</w:t>
+        <w:t xml:space="preserve">A Deus, por me sustentar ao longo destes anos.</w:t>
       </w:r>
     </w:p>
     <w:p>
@@ -324,7 +324,7 @@
         <w:jc w:val="both"/>
       </w:pPr>
       <w:r>
-        <w:t xml:space="preserve">Ao meu orientador, Prof. Dr. Eduardo Paiva Okabe, pela orientação, pela confiança e pela disponibilidade durante o desenvolvimento deste trabalho, e pela parceria no artigo </w:t>
+        <w:t xml:space="preserve">Ao meu orientador, Prof. Dr. Eduardo Paiva Okabe, pela confiança depositada em minha formação acadêmica desde a segunda disciplina em que assisti às suas aulas, Cinemática de Mecanismos, base da teoria aplicada neste trabalho, e por me aceitar como seu monitor na mesma disciplina no ano seguinte. Agradeço por ter me proposto um projeto de Iniciação Científica na mesma área e pela oportunidade de colaborar no artigo </w:t>
       </w:r>
       <w:r>
         <w:rPr>
@@ -334,7 +334,7 @@
         <w:t xml:space="preserve">Modeling and simulation of an upper limb exoskeleton</w:t>
       </w:r>
       <w:r>
-        <w:t xml:space="preserve">.</w:t>
+        <w:t xml:space="preserve">, publicado em periódico internacional. Neste trabalho, agradeço a paciência, a orientação e a validação ao longo dos últimos meses, e o planejamento dos próximos passos em uma janela de tempo muito curta. Às quartas-feiras, depois das 17h30, e nas reuniões online.</w:t>
       </w:r>
     </w:p>
     <w:p>
@@ -345,7 +345,7 @@
         <w:jc w:val="both"/>
       </w:pPr>
       <w:r>
-        <w:t xml:space="preserve">Ao Prof. Dr. José Luiz Pereira Brittes, também coautor desse artigo, e ao Prof. Dr. Felipe Wenzel da Silva Tuckmantel, por aceitarem o convite para compor a banca examinadora.</w:t>
+        <w:t xml:space="preserve">Ao Prof. Dr. José Luiz Pereira Brittes, que, além das lições aprendidas em sala de aula, me ensinou a noção e a necessidade da educação continuada como um ato de amor às exatas, acompanhada de uma severa crítica ao utilitarismo que tantas vezes se prega nos circuitos em que vivemos. A ele agradeço também por identificar minha afinidade com os temas acadêmicos antes de mim, por acreditar no projeto de Exoesqueletos para assistência de pessoas com perdas neuromusculares e me envolver nele, e pela assistência em minha parte no artigo já citado.</w:t>
       </w:r>
     </w:p>
     <w:p>
@@ -356,7 +356,7 @@
         <w:jc w:val="both"/>
       </w:pPr>
       <w:r>
-        <w:t xml:space="preserve">Aos professores e funcionários da Faculdade de Ciências Aplicadas da UNICAMP, pela formação recebida no curso de Engenharia de Manufatura.</w:t>
+        <w:t xml:space="preserve">Ao Prof. Dr. Felipe Wenzel da Silva Tuckmantel, por ter aceitado o convite para compor a banca examinadora e por somar seus conhecimentos de pesquisa ao tema deste trabalho.</w:t>
       </w:r>
     </w:p>
     <w:p>
@@ -367,7 +367,7 @@
         <w:jc w:val="both"/>
       </w:pPr>
       <w:r>
-        <w:t xml:space="preserve">Aos colegas e amigos [nomes], pela convivência e pelo companheirismo ao longo do curso.</w:t>
+        <w:t xml:space="preserve">Aos meus pais, Valter Luís de Brito e Carla Simone de Almeida Brito, professores de formação. Por acreditarem na universidade pública. E por terem sido, em meio a desabafos e descrenças, um notável alento.</w:t>
       </w:r>
     </w:p>
     <w:p>
@@ -378,7 +378,40 @@
         <w:jc w:val="both"/>
       </w:pPr>
       <w:r>
-        <w:t xml:space="preserve">Às comunidades que desenvolvem e mantêm o Python e as bibliotecas científicas livres usadas neste trabalho.</w:t>
+        <w:t xml:space="preserve">Às agências de fomento ao ensino e à pesquisa, pela oportunidade de ser monitor em quatro ocasiões e de realizar dois projetos de Iniciação Científica.</w:t>
+      </w:r>
+    </w:p>
+    <w:p>
+      <w:pPr>
+        <w:pStyle w:val="PreTexto"/>
+        <w:spacing w:before="120"/>
+        <w:ind w:firstLine="360"/>
+        <w:jc w:val="both"/>
+      </w:pPr>
+      <w:r>
+        <w:t xml:space="preserve">Ao meu irmão, Daniel Vinícius de Almeida Brito, força motriz do esforço que me permitiu abrir caminho para que ele também estudasse, sem onerar o orçamento familiar.</w:t>
+      </w:r>
+    </w:p>
+    <w:p>
+      <w:pPr>
+        <w:pStyle w:val="PreTexto"/>
+        <w:spacing w:before="120"/>
+        <w:ind w:firstLine="360"/>
+        <w:jc w:val="both"/>
+      </w:pPr>
+      <w:r>
+        <w:t xml:space="preserve">Aos muitos colegas e amigos, pela convivência e pelo companheirismo ao longo do curso, em especial aos grupos Confraria FCA e Alvinegros FCA, formados entre os ingressantes de 2022 dos cursos de Engenharia de Manufatura e Engenharia de Produção.</w:t>
+      </w:r>
+    </w:p>
+    <w:p>
+      <w:pPr>
+        <w:pStyle w:val="PreTexto"/>
+        <w:spacing w:before="120"/>
+        <w:ind w:firstLine="360"/>
+        <w:jc w:val="both"/>
+      </w:pPr>
+      <w:r>
+        <w:t xml:space="preserve">Às comunidades que desenvolvem e mantêm o Python e as bibliotecas científicas livres, empregados neste trabalho.</w:t>
       </w:r>
     </w:p>
     <w:p>

</xml_diff>

<commit_message>
Exo 2: braço do exoesqueleto no peso e na inércia
Com a posição do eixo da articulação 20 no referencial do Fusion,
(31,023; 123,596) mm, informada pelo autor, o braço do exoesqueleto
(elemento 8, 163,951 g) passa a integrar o conjunto que gira com o braço:
o centro de massa fica a 47,362 mm do eixo, a massa do conjunto vai a
3,7702 kg e I_O a 0,436010 kg·m². O torque do peso tem amplitude de
10,604 N·m, em 89,7°; K40 passa a 1,467 N/mm e o pico do torque de
projeto a 4,376 N·m, ainda em 78,8°. O s0 identificado pelo espaçamento
entre as curvas não depende do peso e não muda.

- tcc_resultados_ottobock.py grava a amplitude M g d, o ângulo do pico e
  o valor só do membro humano, além da posição do eixo.
- Textos de 3B, 4B e 5B, a tabela de massa e o resumo atualizados; a
  ressalva sobre o braço do exoesqueleto fora do peso deixa de valer.

Co-Authored-By: Claude Opus 5.5 <noreply@anthropic.com>
Claude-Session: https://claude.ai/code/session_011EXBtMgMjcpkiJ44sLq9TW
</commit_message>
<xml_diff>
--- a/tcc/TCC_modelo_FT.docx
+++ b/tcc/TCC_modelo_FT.docx
@@ -443,7 +443,7 @@
         <w:jc w:val="both"/>
       </w:pPr>
       <w:r>
-        <w:t xml:space="preserve">Exoesqueletos passivos de apoio ao braço são empregados no trabalho com os braços elevados, associado a distúrbios do ombro, e o auxílio que entregam depende apenas da geometria do mecanismo e da mola. As patentes que descrevem os modelos comerciais detalham o mecanismo, mas não informam massa, inércia nem rigidez. Este trabalho reconstrói, a partir da documentação de patente, dois mecanismos de arquitetura distinta e formula modelos estáticos do torque que eles entregam em função do ângulo de elevação, confrontando-o com o torque gravitacional do braço: o gerador de torque de mola, cabo e polia da US 9.889.554 B2 e o dispositivo da EP 3 504 033 B1, em que um elemento elástico atua diretamente sobre uma alavanca solidária ao braço. A geometria foi reconstruída em CAD, a cinemática foi resolvida em forma fechada, e cada etapa do cálculo, implementado em Python, foi conferida por verificações independentes, entre elas o princípio dos trabalhos virtuais, que mostrou, na US 9.889.554 B2, que a extensão da mola deve acompanhar o caminho completo do cabo. Com os parâmetros não publicados identificados por mínimos quadrados, o modelo do primeiro mecanismo reproduz a forma da curva publicada com coeficiente de determinação de 0,99839 e raiz do erro quadrático médio de 1,24% do maior valor extraído, e o pico do torque do cabo, a 97,5° de elevação, fica 8,05° acima do pico gravitacional, de 11,16 N·m a 89,4°. Como a ordenada da curva não tem unidade declarada, o modelo determina a forma do torque, mas não sua escala física. Na EP 3 504 033 B1, o espaçamento entre as três curvas de pré-tensão publicadas determina os comprimentos de referência do elástico, de 300,91 mm, 287,19 mm e 275,59 mm, sem depender da escala da ordenada nem da rigidez. A forma prevista com a geometria do CAD, contudo, não reproduz as curvas da patente, e a rigidez não é identificável pela figura; sob a hipótese de assistência de 40% do torque do peso em 90°, o pico do torque é de 4,354 N·m em 78,8°. Nos dois dispositivos, o pico de assistência fica afastado do pico gravitacional, acima dele no primeiro e abaixo no segundo. A comparação entre os dois fica, assim, respondida quanto aos ângulos e à forma dos perfis, mas não quanto à magnitude. As etapas dinâmicas, pela formulação de Lagrange e no MBDyn, dependem de um dado independente que fixe a escala do torque e não foram executadas.</w:t>
+        <w:t xml:space="preserve">Exoesqueletos passivos de apoio ao braço são empregados no trabalho com os braços elevados, associado a distúrbios do ombro, e o auxílio que entregam depende apenas da geometria do mecanismo e da mola. As patentes que descrevem os modelos comerciais detalham o mecanismo, mas não informam massa, inércia nem rigidez. Este trabalho reconstrói, a partir da documentação de patente, dois mecanismos de arquitetura distinta e formula modelos estáticos do torque que eles entregam em função do ângulo de elevação, confrontando-o com o torque gravitacional do braço: o gerador de torque de mola, cabo e polia da US 9.889.554 B2 e o dispositivo da EP 3 504 033 B1, em que um elemento elástico atua diretamente sobre uma alavanca solidária ao braço. A geometria foi reconstruída em CAD, a cinemática foi resolvida em forma fechada, e cada etapa do cálculo, implementado em Python, foi conferida por verificações independentes, entre elas o princípio dos trabalhos virtuais, que mostrou, na US 9.889.554 B2, que a extensão da mola deve acompanhar o caminho completo do cabo. Com os parâmetros não publicados identificados por mínimos quadrados, o modelo do primeiro mecanismo reproduz a forma da curva publicada com coeficiente de determinação de 0,99839 e raiz do erro quadrático médio de 1,24% do maior valor extraído, e o pico do torque do cabo, a 97,5° de elevação, fica 8,05° acima do pico gravitacional, de 11,16 N·m a 89,4°. Como a ordenada da curva não tem unidade declarada, o modelo determina a forma do torque, mas não sua escala física. Na EP 3 504 033 B1, o espaçamento entre as três curvas de pré-tensão publicadas determina os comprimentos de referência do elástico, de 300,91 mm, 287,19 mm e 275,59 mm, sem depender da escala da ordenada nem da rigidez. A forma prevista com a geometria do CAD, contudo, não reproduz as curvas da patente, e a rigidez não é identificável pela figura; sob a hipótese de assistência de 40% do torque do peso em 90°, o pico do torque é de 4,376 N·m em 78,8°. Nos dois dispositivos, o pico de assistência fica afastado do pico gravitacional, acima dele no primeiro e abaixo no segundo. A comparação entre os dois fica, assim, respondida quanto aos ângulos e à forma dos perfis, mas não quanto à magnitude. As etapas dinâmicas, pela formulação de Lagrange e no MBDyn, dependem de um dado independente que fixe a escala do torque e não foram executadas.</w:t>
       </w:r>
     </w:p>
     <w:p>
@@ -485,7 +485,7 @@
         <w:jc w:val="both"/>
       </w:pPr>
       <w:r>
-        <w:t xml:space="preserve">Passive arm-support exoskeletons are used in work with raised arms, which is associated with shoulder disorders, and the assistance they deliver depends only on the geometry of the mechanism and on the spring. The patents that describe the commercial models detail the mechanism but do not report mass, inertia or stiffness. This work reconstructs, from patent documentation, two mechanisms of different architecture and formulates static models of the torque they deliver as a function of the elevation angle, comparing it with the gravitational torque of the arm: the spring, cable and pulley torque generator of US 9,889,554 B2 and the device of EP 3 504 033 B1, in which an elastic element acts directly on a lever attached to the arm. The geometry was reconstructed in CAD, the kinematics was solved in closed form, and each step of the calculation, implemented in Python, was checked by independent verifications, among them the principle of virtual work, which showed, for US 9,889,554 B2, that the spring extension must follow the complete cable path. With the unpublished parameters identified by least squares, the model of the first mechanism reproduces the shape of the published curve with a coefficient of determination of 0.99839 and a root mean square error of 1.24% of the largest extracted value, and the peak of the cable torque, at 97.5° of elevation, lies 8.05° above the gravitational peak of 11.16 N·m at 89.4°. Since the ordinate of the curve has no declared unit, the model determines the shape of the torque but not its physical scale. For EP 3 504 033 B1, the spacing between the three published pretension curves determines the reference lengths of the elastic element, 300.91 mm, 287.19 mm and 275.59 mm, without depending on the ordinate scale or on the stiffness. The shape predicted with the CAD geometry, however, does not reproduce the patent curves, and the stiffness cannot be identified from the figure; under the assumption of assistance equal to 40% of the weight torque at 90°, the torque peak is 4.354 N·m at 78.8°. In both devices, the assistance peak is set apart from the gravitational peak, above it in the first and below it in the second. The comparison between the two is thus answered regarding the angles and the shape of the profiles, but not regarding magnitude. The dynamic steps, through the Lagrange formulation and in MBDyn, depend on independent data that fix the torque scale and were not carried out.</w:t>
+        <w:t xml:space="preserve">Passive arm-support exoskeletons are used in work with raised arms, which is associated with shoulder disorders, and the assistance they deliver depends only on the geometry of the mechanism and on the spring. The patents that describe the commercial models detail the mechanism but do not report mass, inertia or stiffness. This work reconstructs, from patent documentation, two mechanisms of different architecture and formulates static models of the torque they deliver as a function of the elevation angle, comparing it with the gravitational torque of the arm: the spring, cable and pulley torque generator of US 9,889,554 B2 and the device of EP 3 504 033 B1, in which an elastic element acts directly on a lever attached to the arm. The geometry was reconstructed in CAD, the kinematics was solved in closed form, and each step of the calculation, implemented in Python, was checked by independent verifications, among them the principle of virtual work, which showed, for US 9,889,554 B2, that the spring extension must follow the complete cable path. With the unpublished parameters identified by least squares, the model of the first mechanism reproduces the shape of the published curve with a coefficient of determination of 0.99839 and a root mean square error of 1.24% of the largest extracted value, and the peak of the cable torque, at 97.5° of elevation, lies 8.05° above the gravitational peak of 11.16 N·m at 89.4°. Since the ordinate of the curve has no declared unit, the model determines the shape of the torque but not its physical scale. For EP 3 504 033 B1, the spacing between the three published pretension curves determines the reference lengths of the elastic element, 300.91 mm, 287.19 mm and 275.59 mm, without depending on the ordinate scale or on the stiffness. The shape predicted with the CAD geometry, however, does not reproduce the patent curves, and the stiffness cannot be identified from the figure; under the assumption of assistance equal to 40% of the weight torque at 90°, the torque peak is 4.376 N·m at 78.8°. In both devices, the assistance peak is set apart from the gravitational peak, above it in the first and below it in the second. The comparison between the two is thus answered regarding the angles and the shape of the profiles, but not regarding magnitude. The dynamic steps, through the Lagrange formulation and in MBDyn, depend on independent data that fix the torque scale and were not carried out.</w:t>
       </w:r>
     </w:p>
     <w:p>
@@ -845,7 +845,7 @@
           <w:t xml:space="preserve">40</w:t>
         </w:r>
         <w:r>
-          <w:t xml:space="preserve"> no cenário de projeto, torque do peso do membro humano e alvo de 40%</w:t>
+          <w:t xml:space="preserve"> no cenário de projeto, torque do peso do membro e do braço do exoesqueleto e alvo de 40%</w:t>
         </w:r>
         <w:r>
           <w:tab/>
@@ -1165,7 +1165,7 @@
           <w:t xml:space="preserve">Tabela 15: </w:t>
         </w:r>
         <w:r>
-          <w:t xml:space="preserve">Propriedades de massa do membro humano em relação ao eixo da articulação 20</w:t>
+          <w:t xml:space="preserve">Propriedades de massa do conjunto que gira com o braço em relação ao eixo da articulação 20</w:t>
         </w:r>
         <w:r>
           <w:tab/>
@@ -1364,7 +1364,7 @@
           <w:t xml:space="preserve">0</w:t>
         </w:r>
         <w:r>
-          <w:t xml:space="preserve"> = 287,190 mm e K = 1,45915 N/mm</w:t>
+          <w:t xml:space="preserve"> = 287,190 mm e K = 1,46670 N/mm</w:t>
         </w:r>
         <w:r>
           <w:tab/>
@@ -1401,7 +1401,7 @@
           <w:t xml:space="preserve">40</w:t>
         </w:r>
         <w:r>
-          <w:t xml:space="preserve"> = 1,45915 N/mm</w:t>
+          <w:t xml:space="preserve"> = 1,46670 N/mm</w:t>
         </w:r>
         <w:r>
           <w:tab/>
@@ -2810,7 +2810,7 @@
           <w:tab/>
         </w:r>
         <w:r>
-          <w:t xml:space="preserve">67</w:t>
+          <w:t xml:space="preserve">68</w:t>
         </w:r>
       </w:hyperlink>
     </w:p>
@@ -20059,7 +20059,7 @@
     </w:tbl>
     <w:p>
       <w:r>
-        <w:t xml:space="preserve">Com apenas o membro humano, a</w:t>
+        <w:t xml:space="preserve">O conjunto reúne o membro humano e o braço do exoesqueleto (elemento 8), cujo centro de massa é referido ao eixo da articulação 20 pela posição desse eixo no modelo em CAD (seção 4B.1). Com o membro humano, alinhado ao eixo do braço, a</w:t>
       </w:r>
       <w:r>
         <w:rPr>
@@ -20068,7 +20068,7 @@
         <w:t xml:space="preserve">CG</w:t>
       </w:r>
       <w:r>
-        <w:t xml:space="preserve"> = 0 e τ</w:t>
+        <w:t xml:space="preserve"> seria nulo e τ</w:t>
       </w:r>
       <w:r>
         <w:rPr>
@@ -20086,7 +20086,25 @@
         <w:t xml:space="preserve">el</w:t>
       </w:r>
       <w:r>
-        <w:t xml:space="preserve">/1000, com máximo de 10,550 N·m em θ</w:t>
+        <w:t xml:space="preserve">/1000; o braço do exoesqueleto desloca o centro de massa do conjunto em a</w:t>
+      </w:r>
+      <w:r>
+        <w:rPr>
+          <w:vertAlign w:val="subscript"/>
+        </w:rPr>
+        <w:t xml:space="preserve">CG</w:t>
+      </w:r>
+      <w:r>
+        <w:t xml:space="preserve"> = 0,287°, e o máximo de τ</w:t>
+      </w:r>
+      <w:r>
+        <w:rPr>
+          <w:vertAlign w:val="subscript"/>
+        </w:rPr>
+        <w:t xml:space="preserve">g</w:t>
+      </w:r>
+      <w:r>
+        <w:t xml:space="preserve">, 10,604 N·m, ocorre em θ</w:t>
       </w:r>
       <w:r>
         <w:rPr>
@@ -20095,25 +20113,7 @@
         <w:t xml:space="preserve">el</w:t>
       </w:r>
       <w:r>
-        <w:t xml:space="preserve"> = 90°. A Equação (44) mantém a</w:t>
-      </w:r>
-      <w:r>
-        <w:rPr>
-          <w:vertAlign w:val="subscript"/>
-        </w:rPr>
-        <w:t xml:space="preserve">CG</w:t>
-      </w:r>
-      <w:r>
-        <w:t xml:space="preserve"> para o caso em que o braço do exoesqueleto for incorporado; nesse caso, o máximo se desloca do ângulo a</w:t>
-      </w:r>
-      <w:r>
-        <w:rPr>
-          <w:vertAlign w:val="subscript"/>
-        </w:rPr>
-        <w:t xml:space="preserve">CG</w:t>
-      </w:r>
-      <w:r>
-        <w:t xml:space="preserve">, e o torque troca de sinal perto dos extremos da faixa.</w:t>
+        <w:t xml:space="preserve"> = 89,7°.</w:t>
       </w:r>
     </w:p>
     <w:p>
@@ -22332,7 +22332,7 @@
         <w:t xml:space="preserve">0</w:t>
       </w:r>
       <w:r>
-        <w:t xml:space="preserve"> = 287,190 mm e K = 1,45915 N/mm, isto é, o mesmo elástico, e variou apenas </w:t>
+        <w:t xml:space="preserve"> = 287,190 mm e K = 1,46670 N/mm, isto é, o mesmo elástico, e variou apenas </w:t>
       </w:r>
       <w:r>
         <w:rPr>
@@ -22779,7 +22779,7 @@
         <w:t xml:space="preserve">O</w:t>
       </w:r>
       <w:r>
-        <w:t xml:space="preserve"> = 0,434676 kg·m</w:t>
+        <w:t xml:space="preserve"> = 0,436010 kg·m</w:t>
       </w:r>
       <w:r>
         <w:rPr>
@@ -22788,7 +22788,7 @@
         <w:t xml:space="preserve">2</w:t>
       </w:r>
       <w:r>
-        <w:t xml:space="preserve">, é só o do membro humano; o braço do exoesqueleto está fora pela falta da posição do eixo da articulação no Fusion, e a alavanca e a braçadeira não estão modeladas como corpos separados. Massa e amortecimento do elástico e atrito no elemento 78 e na articulação 20 são desconhecidos, de modo que Q</w:t>
+        <w:t xml:space="preserve">, reúne o membro humano e o braço do exoesqueleto; a alavanca e a braçadeira não estão modeladas como corpos separados. Massa e amortecimento do elástico e atrito no elemento 78 e na articulação 20 são desconhecidos, de modo que Q</w:t>
       </w:r>
       <w:r>
         <w:rPr>
@@ -22850,7 +22850,7 @@
     </w:p>
     <w:p>
       <w:r>
-        <w:t xml:space="preserve">Valem as exclusões de escopo da seção 3A.13. O modelo é plano, restrito ao plano sagital, e admite elástico linear e sem massa, F = K δ, elemento 78 pontual e sem atrito e eixo da articulação 20 no centro do ombro, com a barra 18 fixa em relação ao tronco, hipótese discutida na seção 3B.3. O torque gravitacional considera só o membro humano estendido, sem ferramenta na mão; o braço do exoesqueleto, a alavanca e a braçadeira não entram nele.</w:t>
+        <w:t xml:space="preserve">Valem as exclusões de escopo da seção 3A.13. O modelo é plano, restrito ao plano sagital, e admite elástico linear e sem massa, F = K δ, elemento 78 pontual e sem atrito e eixo da articulação 20 no centro do ombro, com a barra 18 fixa em relação ao tronco, hipótese discutida na seção 3B.3. O torque gravitacional considera o membro humano estendido, sem ferramenta na mão, e o braço do exoesqueleto; a alavanca, o elemento 78 e a braçadeira não entram nele.</w:t>
       </w:r>
     </w:p>
     <w:p>
@@ -35810,7 +35810,7 @@
         <w:t xml:space="preserve">40</w:t>
       </w:r>
       <w:r>
-        <w:t xml:space="preserve"> = 1,45915 N/mm, hipótese de projeto. As etapas dinâmicas da seção 3B.12 não foram executadas.</w:t>
+        <w:t xml:space="preserve"> = 1,46670 N/mm, hipótese de projeto. As etapas dinâmicas da seção 3B.12 não foram executadas.</w:t>
       </w:r>
     </w:p>
     <w:p>
@@ -38684,7 +38684,7 @@
       <w:pPr>
         <w:pStyle w:val="Legenda"/>
         <w:spacing w:after="258"/>
-        <w:jc w:val="center"/>
+        <w:jc w:val="both"/>
       </w:pPr>
       <w:bookmarkStart w:id="81" w:name="_Toc0081"/>
       <w:r>
@@ -38709,7 +38709,7 @@
         <w:t xml:space="preserve">: </w:t>
       </w:r>
       <w:r>
-        <w:t xml:space="preserve">Propriedades de massa do membro humano em relação ao eixo da articulação 20</w:t>
+        <w:t xml:space="preserve">Propriedades de massa do conjunto que gira com o braço em relação ao eixo da articulação 20</w:t>
       </w:r>
       <w:bookmarkEnd w:id="81"/>
     </w:p>
@@ -39378,6 +39378,254 @@
         <w:tc>
           <w:tcPr>
             <w:tcW w:w="1516" w:type="dxa"/>
+            <w:tcMar>
+              <w:left w:w="0" w:type="dxa"/>
+            </w:tcMar>
+            <w:vAlign w:val="top"/>
+          </w:tcPr>
+          <w:p>
+            <w:pPr>
+              <w:pStyle w:val="TabelaTexto"/>
+              <w:keepNext/>
+              <w:jc w:val="left"/>
+            </w:pPr>
+            <w:r>
+              <w:rPr>
+                <w:sz w:val="22"/>
+                <w:szCs w:val="22"/>
+              </w:rPr>
+              <w:t xml:space="preserve">Membro humano</w:t>
+            </w:r>
+          </w:p>
+        </w:tc>
+        <w:tc>
+          <w:tcPr>
+            <w:tcW w:w="1333" w:type="dxa"/>
+            <w:vAlign w:val="top"/>
+          </w:tcPr>
+          <w:p>
+            <w:pPr>
+              <w:pStyle w:val="TabelaTexto"/>
+              <w:keepNext/>
+              <w:jc w:val="center"/>
+            </w:pPr>
+            <w:r>
+              <w:rPr>
+                <w:sz w:val="22"/>
+                <w:szCs w:val="22"/>
+              </w:rPr>
+              <w:t xml:space="preserve">3,6062</w:t>
+            </w:r>
+          </w:p>
+        </w:tc>
+        <w:tc>
+          <w:tcPr>
+            <w:tcW w:w="1165" w:type="dxa"/>
+            <w:vAlign w:val="top"/>
+          </w:tcPr>
+          <w:p>
+            <w:pPr>
+              <w:pStyle w:val="TabelaTexto"/>
+              <w:keepNext/>
+              <w:jc w:val="center"/>
+            </w:pPr>
+          </w:p>
+        </w:tc>
+        <w:tc>
+          <w:tcPr>
+            <w:tcW w:w="2006" w:type="dxa"/>
+            <w:vAlign w:val="top"/>
+          </w:tcPr>
+          <w:p>
+            <w:pPr>
+              <w:pStyle w:val="TabelaTexto"/>
+              <w:keepNext/>
+              <w:jc w:val="center"/>
+            </w:pPr>
+            <w:r>
+              <w:rPr>
+                <w:sz w:val="22"/>
+                <w:szCs w:val="22"/>
+              </w:rPr>
+              <w:t xml:space="preserve">d = 298,310</w:t>
+            </w:r>
+          </w:p>
+        </w:tc>
+        <w:tc>
+          <w:tcPr>
+            <w:tcW w:w="1585" w:type="dxa"/>
+            <w:vAlign w:val="top"/>
+          </w:tcPr>
+          <w:p>
+            <w:pPr>
+              <w:pStyle w:val="TabelaTexto"/>
+              <w:keepNext/>
+              <w:jc w:val="center"/>
+            </w:pPr>
+            <w:r>
+              <w:rPr>
+                <w:sz w:val="22"/>
+                <w:szCs w:val="22"/>
+              </w:rPr>
+              <w:t xml:space="preserve">0,113765</w:t>
+            </w:r>
+          </w:p>
+        </w:tc>
+        <w:tc>
+          <w:tcPr>
+            <w:tcW w:w="1466" w:type="dxa"/>
+            <w:tcMar>
+              <w:right w:w="0" w:type="dxa"/>
+            </w:tcMar>
+            <w:vAlign w:val="top"/>
+          </w:tcPr>
+          <w:p>
+            <w:pPr>
+              <w:pStyle w:val="TabelaTexto"/>
+              <w:keepNext/>
+              <w:jc w:val="center"/>
+            </w:pPr>
+            <w:r>
+              <w:rPr>
+                <w:sz w:val="22"/>
+                <w:szCs w:val="22"/>
+              </w:rPr>
+              <w:t xml:space="preserve">0,434676</w:t>
+            </w:r>
+          </w:p>
+        </w:tc>
+      </w:tr>
+      <w:tr>
+        <w:trPr>
+          <w:cantSplit/>
+        </w:trPr>
+        <w:tc>
+          <w:tcPr>
+            <w:tcW w:w="1516" w:type="dxa"/>
+            <w:tcMar>
+              <w:left w:w="0" w:type="dxa"/>
+            </w:tcMar>
+            <w:vAlign w:val="top"/>
+          </w:tcPr>
+          <w:p>
+            <w:pPr>
+              <w:pStyle w:val="TabelaTexto"/>
+              <w:keepNext/>
+              <w:jc w:val="left"/>
+            </w:pPr>
+            <w:r>
+              <w:rPr>
+                <w:sz w:val="22"/>
+                <w:szCs w:val="22"/>
+              </w:rPr>
+              <w:t xml:space="preserve">Braço do exoesqueleto (elemento 8)</w:t>
+            </w:r>
+          </w:p>
+        </w:tc>
+        <w:tc>
+          <w:tcPr>
+            <w:tcW w:w="1333" w:type="dxa"/>
+            <w:vAlign w:val="top"/>
+          </w:tcPr>
+          <w:p>
+            <w:pPr>
+              <w:pStyle w:val="TabelaTexto"/>
+              <w:keepNext/>
+              <w:jc w:val="center"/>
+            </w:pPr>
+            <w:r>
+              <w:rPr>
+                <w:sz w:val="22"/>
+                <w:szCs w:val="22"/>
+              </w:rPr>
+              <w:t xml:space="preserve">0,1640</w:t>
+            </w:r>
+          </w:p>
+        </w:tc>
+        <w:tc>
+          <w:tcPr>
+            <w:tcW w:w="1165" w:type="dxa"/>
+            <w:vAlign w:val="top"/>
+          </w:tcPr>
+          <w:p>
+            <w:pPr>
+              <w:pStyle w:val="TabelaTexto"/>
+              <w:keepNext/>
+              <w:jc w:val="center"/>
+            </w:pPr>
+          </w:p>
+        </w:tc>
+        <w:tc>
+          <w:tcPr>
+            <w:tcW w:w="2006" w:type="dxa"/>
+            <w:vAlign w:val="top"/>
+          </w:tcPr>
+          <w:p>
+            <w:pPr>
+              <w:pStyle w:val="TabelaTexto"/>
+              <w:keepNext/>
+              <w:jc w:val="center"/>
+            </w:pPr>
+            <w:r>
+              <w:rPr>
+                <w:sz w:val="22"/>
+                <w:szCs w:val="22"/>
+              </w:rPr>
+              <w:t xml:space="preserve">47,362</w:t>
+            </w:r>
+          </w:p>
+        </w:tc>
+        <w:tc>
+          <w:tcPr>
+            <w:tcW w:w="1585" w:type="dxa"/>
+            <w:vAlign w:val="top"/>
+          </w:tcPr>
+          <w:p>
+            <w:pPr>
+              <w:pStyle w:val="TabelaTexto"/>
+              <w:keepNext/>
+              <w:jc w:val="center"/>
+            </w:pPr>
+            <w:r>
+              <w:rPr>
+                <w:sz w:val="22"/>
+                <w:szCs w:val="22"/>
+              </w:rPr>
+              <w:t xml:space="preserve">0,000966</w:t>
+            </w:r>
+          </w:p>
+        </w:tc>
+        <w:tc>
+          <w:tcPr>
+            <w:tcW w:w="1466" w:type="dxa"/>
+            <w:tcMar>
+              <w:right w:w="0" w:type="dxa"/>
+            </w:tcMar>
+            <w:vAlign w:val="top"/>
+          </w:tcPr>
+          <w:p>
+            <w:pPr>
+              <w:pStyle w:val="TabelaTexto"/>
+              <w:keepNext/>
+              <w:jc w:val="center"/>
+            </w:pPr>
+            <w:r>
+              <w:rPr>
+                <w:sz w:val="22"/>
+                <w:szCs w:val="22"/>
+              </w:rPr>
+              <w:t xml:space="preserve">0,001334</w:t>
+            </w:r>
+          </w:p>
+        </w:tc>
+      </w:tr>
+      <w:tr>
+        <w:trPr>
+          <w:cantSplit/>
+        </w:trPr>
+        <w:tc>
+          <w:tcPr>
+            <w:tcW w:w="1516" w:type="dxa"/>
             <w:tcBorders>
               <w:bottom w:val="single" w:sz="8" w:space="0" w:color="000000"/>
             </w:tcBorders>
@@ -39396,7 +39644,7 @@
                 <w:sz w:val="22"/>
                 <w:szCs w:val="22"/>
               </w:rPr>
-              <w:t xml:space="preserve">Membro humano</w:t>
+              <w:t xml:space="preserve">Conjunto</w:t>
             </w:r>
           </w:p>
         </w:tc>
@@ -39418,7 +39666,7 @@
                 <w:sz w:val="22"/>
                 <w:szCs w:val="22"/>
               </w:rPr>
-              <w:t xml:space="preserve">3,6062</w:t>
+              <w:t xml:space="preserve">3,7702</w:t>
             </w:r>
           </w:p>
         </w:tc>
@@ -39455,7 +39703,7 @@
                 <w:sz w:val="22"/>
                 <w:szCs w:val="22"/>
               </w:rPr>
-              <w:t xml:space="preserve">d = 298,310</w:t>
+              <w:t xml:space="preserve">d = 286,819</w:t>
             </w:r>
           </w:p>
         </w:tc>
@@ -39477,7 +39725,7 @@
                 <w:sz w:val="22"/>
                 <w:szCs w:val="22"/>
               </w:rPr>
-              <w:t xml:space="preserve">0,113765</w:t>
+              <w:t xml:space="preserve">0,125859</w:t>
             </w:r>
           </w:p>
         </w:tc>
@@ -39502,7 +39750,7 @@
                 <w:sz w:val="22"/>
                 <w:szCs w:val="22"/>
               </w:rPr>
-              <w:t xml:space="preserve">0,434676</w:t>
+              <w:t xml:space="preserve">0,436010</w:t>
             </w:r>
           </w:p>
         </w:tc>
@@ -39531,12 +39779,12 @@
           <w:sz w:val="20"/>
           <w:szCs w:val="20"/>
         </w:rPr>
-        <w:t xml:space="preserve">.</w:t>
-      </w:r>
-    </w:p>
-    <w:p>
-      <w:r>
-        <w:t xml:space="preserve">A consistência foi conferida pela Equação (1): I</w:t>
+        <w:t xml:space="preserve"> e do modelo em CAD.</w:t>
+      </w:r>
+    </w:p>
+    <w:p>
+      <w:r>
+        <w:t xml:space="preserve">A consistência foi conferida pela Equação (1): para o membro humano, I</w:t>
       </w:r>
       <w:r>
         <w:rPr>
@@ -39563,7 +39811,16 @@
         <w:t xml:space="preserve">2</w:t>
       </w:r>
       <w:r>
-        <w:t xml:space="preserve">. A amplitude do momento gravitacional do membro é M g d = 10,550 N·m.</w:t>
+        <w:t xml:space="preserve">, e, para o conjunto, 0,125859 + 0,310151 = 0,436010 kg·m</w:t>
+      </w:r>
+      <w:r>
+        <w:rPr>
+          <w:vertAlign w:val="superscript"/>
+        </w:rPr>
+        <w:t xml:space="preserve">2</w:t>
+      </w:r>
+      <w:r>
+        <w:t xml:space="preserve">. A amplitude do momento gravitacional é M g d = 10,550 N·m para o membro e 10,604 N·m para o conjunto.</w:t>
       </w:r>
     </w:p>
     <w:p>
@@ -39586,7 +39843,7 @@
         <w:t xml:space="preserve">2</w:t>
       </w:r>
       <w:r>
-        <w:t xml:space="preserve"> no centro de massa. São estimativas obtidas da geometria reconstruída e de um material atribuído no CAD, náilon 6/6 em peça oca segundo a planilha, e não propriedades do produto. Esse corpo não entra no torque do peso nem no momento de inércia desta seção, porque a posição do eixo da articulação 20 no referencial do Fusion não foi medida; sem ela, a distância do centro de massa ao eixo é desconhecida. A alavanca, o elemento 78 e a braçadeira não estão modelados como corpos separados, e as peças do lado do tronco (barra 18, barra de ancoragem e capas do elástico) apoiam-se no cinto e não giram com o braço. A Tabela 5 da seção 4A.1 soma ao membro as peças do outro exoesqueleto; os valores desta seção referem-se só ao membro humano e não são comparáveis aos totais daquela tabela.</w:t>
+        <w:t xml:space="preserve"> no centro de massa. São estimativas obtidas da geometria reconstruída e de um material atribuído no CAD, náilon 6/6 em peça oca segundo a planilha, e não propriedades do produto. O eixo da articulação 20 está em (31,023; 123,596) mm no mesmo referencial, de modo que o centro de massa fica a 47,362 mm do eixo. Admitidos os eixos do Fusion paralelos aos do modelo, esse vetor foi levado ao eixo do braço pela direção do braço na pose do CAD, cujo sinal ainda depende de confirmação (seção 3B.3), e somado ao membro humano pela Equação (1). O braço do exoesqueleto acrescenta 0,1640 kg ao conjunto e desloca seu centro de massa em 0,287° em relação ao eixo do braço. A alavanca, o elemento 78 e a braçadeira não estão modelados como corpos separados, e as peças do lado do tronco (barra 18, barra de ancoragem e capas do elástico) apoiam-se no cinto e não giram com o braço. A Tabela 5 da seção 4A.1 tem o mesmo membro humano e soma a ele as peças do outro exoesqueleto.</w:t>
       </w:r>
     </w:p>
     <w:p>
@@ -47366,7 +47623,7 @@
         <w:t xml:space="preserve">0</w:t>
       </w:r>
       <w:r>
-        <w:t xml:space="preserve"> com erro máximo de 0,062 mm, limitado pela interpolação linear entre os pontos de cada curva.</w:t>
+        <w:t xml:space="preserve"> com erro máximo de 0,063 mm, limitado pela interpolação linear entre os pontos de cada curva.</w:t>
       </w:r>
     </w:p>
     <w:p>
@@ -48315,7 +48572,7 @@
                 <w:sz w:val="22"/>
                 <w:szCs w:val="22"/>
               </w:rPr>
-              <w:t xml:space="preserve">2,7 × 10</w:t>
+              <w:t xml:space="preserve">1,8 × 10</w:t>
             </w:r>
             <w:r>
               <w:rPr>
@@ -48563,7 +48820,7 @@
                 <w:sz w:val="22"/>
                 <w:szCs w:val="22"/>
               </w:rPr>
-              <w:t xml:space="preserve">0,062 mm</w:t>
+              <w:t xml:space="preserve">0,063 mm</w:t>
             </w:r>
           </w:p>
         </w:tc>
@@ -50079,7 +50336,7 @@
         <w:t xml:space="preserve">40</w:t>
       </w:r>
       <w:r>
-        <w:t xml:space="preserve">, a 1,64025 N/mm, com pico de τ de 4,225 N·m em 92,1°; no ajuste de forma, o s</w:t>
+        <w:t xml:space="preserve">, a 1,65068 N/mm, com pico de τ de 4,252 N·m em 92,1°; no ajuste de forma, o s</w:t>
       </w:r>
       <w:r>
         <w:rPr>
@@ -50088,7 +50345,7 @@
         <w:t xml:space="preserve">0</w:t>
       </w:r>
       <w:r>
-        <w:t xml:space="preserve"> da tracejada vai de 159,944 mm para 279,526 mm, com 4 dos 40 pontos ajustados no regime II, e K</w:t>
+        <w:t xml:space="preserve"> da tracejada vai de 167,098 mm para 280,059 mm, com 4 dos 40 pontos ajustados no regime II, e K</w:t>
       </w:r>
       <w:r>
         <w:rPr>
@@ -50097,7 +50354,7 @@
         <w:t xml:space="preserve">40</w:t>
       </w:r>
       <w:r>
-        <w:t xml:space="preserve">, de 0,50185 para 1,29549 N/mm. Com a abscissa espelhada, o RMSE sobe para 1,31 mm e os três valores de s</w:t>
+        <w:t xml:space="preserve">, de 0,52377 para 1,31188 N/mm. Com a abscissa espelhada, o RMSE sobe para 1,31 mm e os três valores de s</w:t>
       </w:r>
       <w:r>
         <w:rPr>
@@ -50425,7 +50682,7 @@
         <w:t xml:space="preserve">g</w:t>
       </w:r>
       <w:r>
-        <w:t xml:space="preserve">) do modelo diferem (Figura 8(b)). Normalizada em 90°, a razão entre os dois vale 0,38 em 20°, 0,78 em 60°, 1,34 em 120°, 2,04 em 150° e 3,03 em 165°. Com esses valores de s</w:t>
+        <w:t xml:space="preserve">) do modelo diferem (Figura 8(b)). Normalizada em 90°, a razão entre os dois vale 0,39 em 20°, 0,79 em 60°, 1,33 em 120°, 2,02 em 150° e 2,97 em 165°. Com esses valores de s</w:t>
       </w:r>
       <w:r>
         <w:rPr>
@@ -50443,7 +50700,7 @@
         <w:t xml:space="preserve">g</w:t>
       </w:r>
       <w:r>
-        <w:t xml:space="preserve"> do membro humano, a razão calculada não reproduz a Figura 16 da patente: com escala comum às três curvas, o coeficiente de determinação é −0,548 (pontilhada), −1,620 (tracejada) e −0,674 (contínua). Como o ℓ implícito na figura concorda com o do CAD (seção 4B.4), a diferença não se explica por ℓ. Restam o braço de momento, que depende da derivada de ℓ, e o torque do peso que a patente usou para formar a razão, que o texto não define de forma consistente (seção 3B.9). Entre 35° e 155°, a concordância de ℓ limita a primeira causa: pela Equação (42), atribuir ao braço de momento toda a diferença afastaria o ℓ implícito do ℓ do CAD em até 7,78 mm (3,24 mm RMS), contra os 2,31 mm observados. Nessa faixa, a causa mais compatível com os dados é o torque do peso ou a definição da ordenada; o braço de momento permanece possível perto dos extremos. A patente não traz dado que permita confirmar a causa.</w:t>
+        <w:t xml:space="preserve"> do conjunto, a razão calculada não reproduz a Figura 16 da patente: com escala comum às três curvas, o coeficiente de determinação é −0,521 (pontilhada), −1,565 (tracejada) e −0,635 (contínua). Como o ℓ implícito na figura concorda com o do CAD (seção 4B.4), a diferença não se explica por ℓ. Restam o braço de momento, que depende da derivada de ℓ, e o torque do peso que a patente usou para formar a razão, que o texto não define de forma consistente (seção 3B.9). Entre 35° e 155°, a concordância de ℓ limita a primeira causa: pela Equação (42), atribuir ao braço de momento toda a diferença afastaria o ℓ implícito do ℓ do CAD em até 7,68 mm (3,20 mm RMS), contra os 2,31 mm observados. Nessa faixa, a causa mais compatível com os dados é o torque do peso ou a definição da ordenada; o braço de momento permanece possível perto dos extremos. A patente não traz dado que permita confirmar a causa.</w:t>
       </w:r>
     </w:p>
     <w:p>
@@ -50466,7 +50723,7 @@
         <w:t xml:space="preserve">0</w:t>
       </w:r>
       <w:r>
-        <w:t xml:space="preserve">. Os valores que ele encontra (Tabela 19), 276,56 mm na pontilhada, 159,94 mm na tracejada e o limite s</w:t>
+        <w:t xml:space="preserve">. Os valores que ele encontra (Tabela 19), 277,43 mm na pontilhada, 167,10 mm na tracejada e o limite s</w:t>
       </w:r>
       <w:r>
         <w:rPr>
@@ -50804,7 +51061,7 @@
                 <w:sz w:val="22"/>
                 <w:szCs w:val="22"/>
               </w:rPr>
-              <w:t xml:space="preserve">276,556</w:t>
+              <w:t xml:space="preserve">277,434</w:t>
             </w:r>
           </w:p>
         </w:tc>
@@ -50824,7 +51081,7 @@
                 <w:sz w:val="22"/>
                 <w:szCs w:val="22"/>
               </w:rPr>
-              <w:t xml:space="preserve">159,944</w:t>
+              <w:t xml:space="preserve">167,098</w:t>
             </w:r>
           </w:p>
         </w:tc>
@@ -50910,7 +51167,7 @@
                 <w:sz w:val="22"/>
                 <w:szCs w:val="22"/>
               </w:rPr>
-              <w:t xml:space="preserve">271,94 a 280,64</w:t>
+              <w:t xml:space="preserve">273,02 a 281,36</w:t>
             </w:r>
           </w:p>
         </w:tc>
@@ -50930,7 +51187,7 @@
                 <w:sz w:val="22"/>
                 <w:szCs w:val="22"/>
               </w:rPr>
-              <w:t xml:space="preserve">143,91 a 173,51</w:t>
+              <w:t xml:space="preserve">152,49 a 179,55</w:t>
             </w:r>
           </w:p>
         </w:tc>
@@ -50953,7 +51210,7 @@
                 <w:sz w:val="22"/>
                 <w:szCs w:val="22"/>
               </w:rPr>
-              <w:t xml:space="preserve">0,00 a 4,86 (na borda da grade)</w:t>
+              <w:t xml:space="preserve">0,00 a 4,72 (na borda da grade)</w:t>
             </w:r>
           </w:p>
         </w:tc>
@@ -51001,7 +51258,7 @@
                 <w:sz w:val="22"/>
                 <w:szCs w:val="22"/>
               </w:rPr>
-              <w:t xml:space="preserve">2,89897</w:t>
+              <w:t xml:space="preserve">2,95496</w:t>
             </w:r>
           </w:p>
         </w:tc>
@@ -51021,7 +51278,7 @@
                 <w:sz w:val="22"/>
                 <w:szCs w:val="22"/>
               </w:rPr>
-              <w:t xml:space="preserve">1,55457</w:t>
+              <w:t xml:space="preserve">1,62444</w:t>
             </w:r>
           </w:p>
         </w:tc>
@@ -51044,7 +51301,7 @@
                 <w:sz w:val="22"/>
                 <w:szCs w:val="22"/>
               </w:rPr>
-              <w:t xml:space="preserve">1,08650</w:t>
+              <w:t xml:space="preserve">1,08614</w:t>
             </w:r>
           </w:p>
         </w:tc>
@@ -51092,7 +51349,7 @@
                 <w:sz w:val="22"/>
                 <w:szCs w:val="22"/>
               </w:rPr>
-              <w:t xml:space="preserve">0,1628</w:t>
+              <w:t xml:space="preserve">0,1614</w:t>
             </w:r>
           </w:p>
         </w:tc>
@@ -51112,7 +51369,7 @@
                 <w:sz w:val="22"/>
                 <w:szCs w:val="22"/>
               </w:rPr>
-              <w:t xml:space="preserve">0,1116</w:t>
+              <w:t xml:space="preserve">0,1111</w:t>
             </w:r>
           </w:p>
         </w:tc>
@@ -51135,7 +51392,7 @@
                 <w:sz w:val="22"/>
                 <w:szCs w:val="22"/>
               </w:rPr>
-              <w:t xml:space="preserve">0,1604</w:t>
+              <w:t xml:space="preserve">0,1497</w:t>
             </w:r>
           </w:p>
         </w:tc>
@@ -51183,7 +51440,7 @@
                 <w:sz w:val="22"/>
                 <w:szCs w:val="22"/>
               </w:rPr>
-              <w:t xml:space="preserve">15,11%</w:t>
+              <w:t xml:space="preserve">14,97%</w:t>
             </w:r>
           </w:p>
         </w:tc>
@@ -51203,7 +51460,7 @@
                 <w:sz w:val="22"/>
                 <w:szCs w:val="22"/>
               </w:rPr>
-              <w:t xml:space="preserve">6,59%</w:t>
+              <w:t xml:space="preserve">6,56%</w:t>
             </w:r>
           </w:p>
         </w:tc>
@@ -51226,7 +51483,7 @@
                 <w:sz w:val="22"/>
                 <w:szCs w:val="22"/>
               </w:rPr>
-              <w:t xml:space="preserve">5,17%</w:t>
+              <w:t xml:space="preserve">4,83%</w:t>
             </w:r>
           </w:p>
         </w:tc>
@@ -51274,7 +51531,7 @@
                 <w:sz w:val="22"/>
                 <w:szCs w:val="22"/>
               </w:rPr>
-              <w:t xml:space="preserve">0,1419</w:t>
+              <w:t xml:space="preserve">0,1407</w:t>
             </w:r>
           </w:p>
         </w:tc>
@@ -51294,7 +51551,7 @@
                 <w:sz w:val="22"/>
                 <w:szCs w:val="22"/>
               </w:rPr>
-              <w:t xml:space="preserve">0,0956</w:t>
+              <w:t xml:space="preserve">0,0953</w:t>
             </w:r>
           </w:p>
         </w:tc>
@@ -51317,7 +51574,7 @@
                 <w:sz w:val="22"/>
                 <w:szCs w:val="22"/>
               </w:rPr>
-              <w:t xml:space="preserve">0,1077</w:t>
+              <w:t xml:space="preserve">0,1002</w:t>
             </w:r>
           </w:p>
         </w:tc>
@@ -51373,7 +51630,7 @@
                 <w:sz w:val="22"/>
                 <w:szCs w:val="22"/>
               </w:rPr>
-              <w:t xml:space="preserve">0,3575, em 162,08°</w:t>
+              <w:t xml:space="preserve">0,3548, em 162,08°</w:t>
             </w:r>
           </w:p>
         </w:tc>
@@ -51393,7 +51650,7 @@
                 <w:sz w:val="22"/>
                 <w:szCs w:val="22"/>
               </w:rPr>
-              <w:t xml:space="preserve">0,2595, em 21,39°</w:t>
+              <w:t xml:space="preserve">0,2559, em 21,39°</w:t>
             </w:r>
           </w:p>
         </w:tc>
@@ -51416,7 +51673,7 @@
                 <w:sz w:val="22"/>
                 <w:szCs w:val="22"/>
               </w:rPr>
-              <w:t xml:space="preserve">0,3644, em 164,09°</w:t>
+              <w:t xml:space="preserve">0,3308, em 164,09°</w:t>
             </w:r>
           </w:p>
         </w:tc>
@@ -51472,7 +51729,7 @@
                 <w:sz w:val="22"/>
                 <w:szCs w:val="22"/>
               </w:rPr>
-              <w:t xml:space="preserve">0,5614</w:t>
+              <w:t xml:space="preserve">0,5690</w:t>
             </w:r>
           </w:p>
         </w:tc>
@@ -51492,7 +51749,7 @@
                 <w:sz w:val="22"/>
                 <w:szCs w:val="22"/>
               </w:rPr>
-              <w:t xml:space="preserve">0,8545</w:t>
+              <w:t xml:space="preserve">0,8560</w:t>
             </w:r>
           </w:p>
         </w:tc>
@@ -51515,7 +51772,7 @@
                 <w:sz w:val="22"/>
                 <w:szCs w:val="22"/>
               </w:rPr>
-              <w:t xml:space="preserve">0,9387</w:t>
+              <w:t xml:space="preserve">0,9466</w:t>
             </w:r>
           </w:p>
         </w:tc>
@@ -51654,7 +51911,7 @@
                 <w:sz w:val="22"/>
                 <w:szCs w:val="22"/>
               </w:rPr>
-              <w:t xml:space="preserve">77,342</w:t>
+              <w:t xml:space="preserve">76,465</w:t>
             </w:r>
           </w:p>
         </w:tc>
@@ -51674,7 +51931,7 @@
                 <w:sz w:val="22"/>
                 <w:szCs w:val="22"/>
               </w:rPr>
-              <w:t xml:space="preserve">193,955</w:t>
+              <w:t xml:space="preserve">186,800</w:t>
             </w:r>
           </w:p>
         </w:tc>
@@ -51760,7 +52017,7 @@
                 <w:sz w:val="22"/>
                 <w:szCs w:val="22"/>
               </w:rPr>
-              <w:t xml:space="preserve">1,25852</w:t>
+              <w:t xml:space="preserve">1,27956</w:t>
             </w:r>
           </w:p>
         </w:tc>
@@ -51780,7 +52037,7 @@
                 <w:sz w:val="22"/>
                 <w:szCs w:val="22"/>
               </w:rPr>
-              <w:t xml:space="preserve">0,50185</w:t>
+              <w:t xml:space="preserve">0,52377</w:t>
             </w:r>
           </w:p>
         </w:tc>
@@ -51803,7 +52060,7 @@
                 <w:sz w:val="22"/>
                 <w:szCs w:val="22"/>
               </w:rPr>
-              <w:t xml:space="preserve">0,27504</w:t>
+              <w:t xml:space="preserve">0,27647</w:t>
             </w:r>
           </w:p>
         </w:tc>
@@ -51870,7 +52127,7 @@
                 <w:sz w:val="22"/>
                 <w:szCs w:val="22"/>
               </w:rPr>
-              <w:t xml:space="preserve">0,4341</w:t>
+              <w:t xml:space="preserve">0,4330</w:t>
             </w:r>
           </w:p>
         </w:tc>
@@ -51892,7 +52149,7 @@
                 <w:sz w:val="22"/>
                 <w:szCs w:val="22"/>
               </w:rPr>
-              <w:t xml:space="preserve">0,3228</w:t>
+              <w:t xml:space="preserve">0,3224</w:t>
             </w:r>
           </w:p>
         </w:tc>
@@ -51917,7 +52174,7 @@
                 <w:sz w:val="22"/>
                 <w:szCs w:val="22"/>
               </w:rPr>
-              <w:t xml:space="preserve">0,2531</w:t>
+              <w:t xml:space="preserve">0,2545</w:t>
             </w:r>
           </w:p>
         </w:tc>
@@ -51958,7 +52215,7 @@
         <w:t xml:space="preserve">0</w:t>
       </w:r>
       <w:r>
-        <w:t xml:space="preserve"> apenas dentro da faixa de identificação, de 8,70 mm na curva pontilhada e 29,60 mm na tracejada; na contínua, a faixa encosta no limite s</w:t>
+        <w:t xml:space="preserve"> apenas dentro da faixa de identificação, de 8,34 mm na curva pontilhada e 27,06 mm na tracejada; na contínua, a faixa encosta no limite s</w:t>
       </w:r>
       <w:r>
         <w:rPr>
@@ -51976,7 +52233,7 @@
         <w:t xml:space="preserve">2</w:t>
       </w:r>
       <w:r>
-        <w:t xml:space="preserve"> de 0,561 (pontilhada), 0,855 (tracejada) e 0,939 (contínua), contra 0,99839 na Tabela 9, e resíduos em três ou quatro zonas de sinal, o que indica diferença sistemática de forma entre o modelo e as curvas. Na curva pontilhada, o modelo não acompanha a queda da razão acima de 100°, com erro máximo de 0,358 divisão em 162,08°. Na contínua, o mínimo da soma dos quadrados fica no limite s</w:t>
+        <w:t xml:space="preserve"> de 0,569 (pontilhada), 0,856 (tracejada) e 0,947 (contínua), contra 0,99839 na Tabela 9, e resíduos em três ou quatro zonas de sinal, o que indica diferença sistemática de forma entre o modelo e as curvas. Na curva pontilhada, o modelo não acompanha a queda da razão acima de 100°, com erro máximo de 0,355 divisão em 162,08°. Na contínua, o mínimo da soma dos quadrados fica no limite s</w:t>
       </w:r>
       <w:r>
         <w:rPr>
@@ -52014,7 +52271,7 @@
         <w:t xml:space="preserve">40</w:t>
       </w:r>
       <w:r>
-        <w:t xml:space="preserve"> = 0,50185 N/mm e F(90°) = 97,34 N. O valor de F(90°) é o mesmo nas três curvas por construção: cada uma recebe seu K</w:t>
+        <w:t xml:space="preserve"> = 0,52377 N/mm e F(90°) = 97,84 N. O valor de F(90°) é o mesmo nas três curvas por construção: cada uma recebe seu K</w:t>
       </w:r>
       <w:r>
         <w:rPr>
@@ -52041,7 +52298,7 @@
         <w:t xml:space="preserve">0</w:t>
       </w:r>
       <w:r>
-        <w:t xml:space="preserve">. Sob a mesma hipótese, uma divisão da ordenada corresponderia a σ = 0,323 na curva tracejada, 0,434 na pontilhada e 0,253 na contínua. Como as três curvas compartilham o mesmo eixo na patente, os valores distintos de σ mostram que o alvo de 40% não pode valer para as três ao mesmo tempo com os s</w:t>
+        <w:t xml:space="preserve">. Sob a mesma hipótese, uma divisão da ordenada corresponderia a σ = 0,322 na curva tracejada, 0,433 na pontilhada e 0,255 na contínua. Como as três curvas compartilham o mesmo eixo na patente, os valores distintos de σ mostram que o alvo de 40% não pode valer para as três ao mesmo tempo com os s</w:t>
       </w:r>
       <w:r>
         <w:rPr>
@@ -52279,7 +52536,7 @@
                 <w:sz w:val="22"/>
                 <w:szCs w:val="22"/>
               </w:rPr>
-              <w:t xml:space="preserve">276,556</w:t>
+              <w:t xml:space="preserve">277,434</w:t>
             </w:r>
           </w:p>
         </w:tc>
@@ -52299,7 +52556,7 @@
                 <w:sz w:val="22"/>
                 <w:szCs w:val="22"/>
               </w:rPr>
-              <w:t xml:space="preserve">159,944</w:t>
+              <w:t xml:space="preserve">167,098</w:t>
             </w:r>
           </w:p>
         </w:tc>
@@ -52385,7 +52642,7 @@
                 <w:sz w:val="22"/>
                 <w:szCs w:val="22"/>
               </w:rPr>
-              <w:t xml:space="preserve">221,841</w:t>
+              <w:t xml:space="preserve">227,040</w:t>
             </w:r>
           </w:p>
         </w:tc>
@@ -52405,7 +52662,7 @@
                 <w:sz w:val="22"/>
                 <w:szCs w:val="22"/>
               </w:rPr>
-              <w:t xml:space="preserve">154,277</w:t>
+              <w:t xml:space="preserve">162,401</w:t>
             </w:r>
           </w:p>
         </w:tc>
@@ -52428,7 +52685,7 @@
                 <w:sz w:val="22"/>
                 <w:szCs w:val="22"/>
               </w:rPr>
-              <w:t xml:space="preserve">88,842</w:t>
+              <w:t xml:space="preserve">100,009</w:t>
             </w:r>
           </w:p>
         </w:tc>
@@ -52476,7 +52733,7 @@
                 <w:sz w:val="22"/>
                 <w:szCs w:val="22"/>
               </w:rPr>
-              <w:t xml:space="preserve">15,11%</w:t>
+              <w:t xml:space="preserve">14,97%</w:t>
             </w:r>
           </w:p>
         </w:tc>
@@ -52496,7 +52753,7 @@
                 <w:sz w:val="22"/>
                 <w:szCs w:val="22"/>
               </w:rPr>
-              <w:t xml:space="preserve">6,59%</w:t>
+              <w:t xml:space="preserve">6,56%</w:t>
             </w:r>
           </w:p>
         </w:tc>
@@ -52519,7 +52776,7 @@
                 <w:sz w:val="22"/>
                 <w:szCs w:val="22"/>
               </w:rPr>
-              <w:t xml:space="preserve">5,17%</w:t>
+              <w:t xml:space="preserve">4,83%</w:t>
             </w:r>
           </w:p>
         </w:tc>
@@ -52567,7 +52824,7 @@
                 <w:sz w:val="22"/>
                 <w:szCs w:val="22"/>
               </w:rPr>
-              <w:t xml:space="preserve">21,62%</w:t>
+              <w:t xml:space="preserve">21,35%</w:t>
             </w:r>
           </w:p>
         </w:tc>
@@ -52587,7 +52844,7 @@
                 <w:sz w:val="22"/>
                 <w:szCs w:val="22"/>
               </w:rPr>
-              <w:t xml:space="preserve">6,60%</w:t>
+              <w:t xml:space="preserve">6,57%</w:t>
             </w:r>
           </w:p>
         </w:tc>
@@ -52610,7 +52867,7 @@
                 <w:sz w:val="22"/>
                 <w:szCs w:val="22"/>
               </w:rPr>
-              <w:t xml:space="preserve">6,57%</w:t>
+              <w:t xml:space="preserve">6,45%</w:t>
             </w:r>
           </w:p>
         </w:tc>
@@ -52673,7 +52930,7 @@
                 <w:sz w:val="22"/>
                 <w:szCs w:val="22"/>
               </w:rPr>
-              <w:t xml:space="preserve">0,1013</w:t>
+              <w:t xml:space="preserve">0,1240</w:t>
             </w:r>
           </w:p>
         </w:tc>
@@ -52693,7 +52950,7 @@
                 <w:sz w:val="22"/>
                 <w:szCs w:val="22"/>
               </w:rPr>
-              <w:t xml:space="preserve">0,8541</w:t>
+              <w:t xml:space="preserve">0,8557</w:t>
             </w:r>
           </w:p>
         </w:tc>
@@ -52716,7 +52973,7 @@
                 <w:sz w:val="22"/>
                 <w:szCs w:val="22"/>
               </w:rPr>
-              <w:t xml:space="preserve">0,9013</w:t>
+              <w:t xml:space="preserve">0,9048</w:t>
             </w:r>
           </w:p>
         </w:tc>
@@ -52764,7 +53021,7 @@
                 <w:sz w:val="22"/>
                 <w:szCs w:val="22"/>
               </w:rPr>
-              <w:t xml:space="preserve">35,55%</w:t>
+              <w:t xml:space="preserve">35,96%</w:t>
             </w:r>
           </w:p>
         </w:tc>
@@ -52784,7 +53041,7 @@
                 <w:sz w:val="22"/>
                 <w:szCs w:val="22"/>
               </w:rPr>
-              <w:t xml:space="preserve">12,90%</w:t>
+              <w:t xml:space="preserve">13,28%</w:t>
             </w:r>
           </w:p>
         </w:tc>
@@ -52807,7 +53064,7 @@
                 <w:sz w:val="22"/>
                 <w:szCs w:val="22"/>
               </w:rPr>
-              <w:t xml:space="preserve">3,43%</w:t>
+              <w:t xml:space="preserve">3,44%</w:t>
             </w:r>
           </w:p>
         </w:tc>
@@ -52874,7 +53131,7 @@
                 <w:sz w:val="22"/>
                 <w:szCs w:val="22"/>
               </w:rPr>
-              <w:t xml:space="preserve">−1,4289</w:t>
+              <w:t xml:space="preserve">−1,4848</w:t>
             </w:r>
           </w:p>
         </w:tc>
@@ -52896,7 +53153,7 @@
                 <w:sz w:val="22"/>
                 <w:szCs w:val="22"/>
               </w:rPr>
-              <w:t xml:space="preserve">0,4429</w:t>
+              <w:t xml:space="preserve">0,4095</w:t>
             </w:r>
           </w:p>
         </w:tc>
@@ -52921,7 +53178,7 @@
                 <w:sz w:val="22"/>
                 <w:szCs w:val="22"/>
               </w:rPr>
-              <w:t xml:space="preserve">0,9731</w:t>
+              <w:t xml:space="preserve">0,9730</w:t>
             </w:r>
           </w:p>
         </w:tc>
@@ -52948,7 +53205,7 @@
           <w:sz w:val="20"/>
           <w:szCs w:val="20"/>
         </w:rPr>
-        <w:t xml:space="preserve">Nota: no ajuste conjunto, c = 1,5051, comum às três curvas; na força constante, c é ajustado por curva.</w:t>
+        <w:t xml:space="preserve">Nota: no ajuste conjunto, c = 1,5794, comum às três curvas; na força constante, c é ajustado por curva.</w:t>
       </w:r>
     </w:p>
     <w:p>
@@ -52962,7 +53219,7 @@
         <w:t xml:space="preserve">0</w:t>
       </w:r>
       <w:r>
-        <w:t xml:space="preserve"> = 221,841 mm na curva pontilhada, 154,277 mm na tracejada e 88,842 mm na contínua; menor s</w:t>
+        <w:t xml:space="preserve"> = 227,040 mm na curva pontilhada, 162,401 mm na tracejada e 100,009 mm na contínua; menor s</w:t>
       </w:r>
       <w:r>
         <w:rPr>
@@ -52971,7 +53228,7 @@
         <w:t xml:space="preserve">0</w:t>
       </w:r>
       <w:r>
-        <w:t xml:space="preserve"> significa maior extensão do elástico em qualquer ângulo. As curvas tracejada e contínua ficam com RMSE/máx de 6,60% e 6,57%, e a pontilhada passa de 15,11% para 21,62%. Com uma só escala, o modelo linear reproduz a ordem das pré-tensões, mas não a forma da curva de menor pré-tensão. A força constante descreve a curva contínua com RMSE/máx de 3,43%, menor que os 5,17% do ajuste em s</w:t>
+        <w:t xml:space="preserve"> significa maior extensão do elástico em qualquer ângulo. As curvas tracejada e contínua ficam com RMSE/máx de 6,57% e 6,45%, e a pontilhada passa de 14,97% para 21,35%. Com uma só escala, o modelo linear reproduz a ordem das pré-tensões, mas não a forma da curva de menor pré-tensão. A força constante descreve a curva contínua com RMSE/máx de 3,44%, menor que os 4,83% do ajuste em s</w:t>
       </w:r>
       <w:r>
         <w:rPr>
@@ -52980,12 +53237,12 @@
         <w:t xml:space="preserve">0</w:t>
       </w:r>
       <w:r>
-        <w:t xml:space="preserve"> = 0, e as outras duas com erros de 35,55% e 12,90%.</w:t>
-      </w:r>
-    </w:p>
-    <w:p>
-      <w:r>
-        <w:t xml:space="preserve">A pré-tensão da curva pontilhada, descrita como quase nula, também diverge do ajuste de forma. Pelo critério da seção 4B.4, a extensão em 180°, essa curva teria 20,37 mm com o s</w:t>
+        <w:t xml:space="preserve"> = 0, e as outras duas com erros de 35,96% e 13,28%.</w:t>
+      </w:r>
+    </w:p>
+    <w:p>
+      <w:r>
+        <w:t xml:space="preserve">A pré-tensão da curva pontilhada, descrita como quase nula, também diverge do ajuste de forma. Pelo critério da seção 4B.4, a extensão em 180°, essa curva teria 19,50 mm com o s</w:t>
       </w:r>
       <w:r>
         <w:rPr>
@@ -52994,7 +53251,7 @@
         <w:t xml:space="preserve">0</w:t>
       </w:r>
       <w:r>
-        <w:t xml:space="preserve"> individual e 75,09 mm com o do ajuste conjunto, contra −3,98 mm com o s</w:t>
+        <w:t xml:space="preserve"> individual e 69,89 mm com o do ajuste conjunto, contra −3,98 mm com o s</w:t>
       </w:r>
       <w:r>
         <w:rPr>
@@ -53415,7 +53672,7 @@
                 <w:sz w:val="22"/>
                 <w:szCs w:val="22"/>
               </w:rPr>
-              <w:t xml:space="preserve">1,45915 N/mm</w:t>
+              <w:t xml:space="preserve">1,46670 N/mm</w:t>
             </w:r>
           </w:p>
         </w:tc>
@@ -54085,7 +54342,7 @@
                 <w:sz w:val="22"/>
                 <w:szCs w:val="22"/>
               </w:rPr>
-              <w:t xml:space="preserve">Não incluídos</w:t>
+              <w:t xml:space="preserve">163,951 g; 47,362 mm</w:t>
             </w:r>
           </w:p>
         </w:tc>
@@ -54132,7 +54389,7 @@
                 <w:sz w:val="22"/>
                 <w:szCs w:val="22"/>
               </w:rPr>
-              <w:t xml:space="preserve">Falta a posição do eixo da articulação no Fusion</w:t>
+              <w:t xml:space="preserve">Incluídos no peso e na inércia; eixos do Fusion admitidos paralelos aos do modelo</w:t>
             </w:r>
           </w:p>
         </w:tc>
@@ -56032,7 +56289,7 @@
         <w:t xml:space="preserve">40</w:t>
       </w:r>
       <w:r>
-        <w:t xml:space="preserve">, a força vai de 148,89 N a 14,21 N. O ajuste de forma levaria a valores bem diferentes: com s</w:t>
+        <w:t xml:space="preserve">, a força vai de 149,67 N a 14,29 N. O ajuste de forma levaria a valores bem diferentes: com s</w:t>
       </w:r>
       <w:r>
         <w:rPr>
@@ -56041,7 +56298,7 @@
         <w:t xml:space="preserve">0</w:t>
       </w:r>
       <w:r>
-        <w:t xml:space="preserve"> = 159,944 mm, a extensão iria de 229,29 a 136,99 mm, com deformação de 143,4%, e a força, com o K</w:t>
+        <w:t xml:space="preserve"> = 167,098 mm, a extensão iria de 222,13 a 129,83 mm, com deformação de 132,9%, e a força, com o K</w:t>
       </w:r>
       <w:r>
         <w:rPr>
@@ -56050,7 +56307,7 @@
         <w:t xml:space="preserve">40</w:t>
       </w:r>
       <w:r>
-        <w:t xml:space="preserve"> correspondente, de 115,07 a 68,75 N. A viabilidade dessas extensões depende do elemento elástico, que a patente não especifica.</w:t>
+        <w:t xml:space="preserve"> correspondente, de 116,35 a 68,00 N. A viabilidade dessas extensões depende do elemento elástico, que a patente não especifica.</w:t>
       </w:r>
     </w:p>
     <w:p>
@@ -56231,7 +56488,7 @@
         <w:t xml:space="preserve">0</w:t>
       </w:r>
       <w:r>
-        <w:t xml:space="preserve"> = 287,190 mm e K = 1,45915 N/mm</w:t>
+        <w:t xml:space="preserve"> = 287,190 mm e K = 1,46670 N/mm</w:t>
       </w:r>
       <w:bookmarkEnd w:id="98"/>
     </w:p>
@@ -56713,7 +56970,7 @@
                 <w:sz w:val="20"/>
                 <w:szCs w:val="20"/>
               </w:rPr>
-              <w:t xml:space="preserve">3,296</w:t>
+              <w:t xml:space="preserve">3,313</w:t>
             </w:r>
           </w:p>
         </w:tc>
@@ -56753,7 +57010,7 @@
                 <w:sz w:val="20"/>
                 <w:szCs w:val="20"/>
               </w:rPr>
-              <w:t xml:space="preserve">3,274</w:t>
+              <w:t xml:space="preserve">3,291</w:t>
             </w:r>
           </w:p>
         </w:tc>
@@ -56904,7 +57161,7 @@
                 <w:sz w:val="20"/>
                 <w:szCs w:val="20"/>
               </w:rPr>
-              <w:t xml:space="preserve">3,822</w:t>
+              <w:t xml:space="preserve">3,841</w:t>
             </w:r>
           </w:p>
         </w:tc>
@@ -56944,7 +57201,7 @@
                 <w:sz w:val="20"/>
                 <w:szCs w:val="20"/>
               </w:rPr>
-              <w:t xml:space="preserve">3,754</w:t>
+              <w:t xml:space="preserve">3,773</w:t>
             </w:r>
           </w:p>
         </w:tc>
@@ -57095,7 +57352,7 @@
                 <w:sz w:val="20"/>
                 <w:szCs w:val="20"/>
               </w:rPr>
-              <w:t xml:space="preserve">4,354</w:t>
+              <w:t xml:space="preserve">4,376</w:t>
             </w:r>
           </w:p>
         </w:tc>
@@ -57135,7 +57392,7 @@
                 <w:sz w:val="20"/>
                 <w:szCs w:val="20"/>
               </w:rPr>
-              <w:t xml:space="preserve">4,220</w:t>
+              <w:t xml:space="preserve">4,242</w:t>
             </w:r>
           </w:p>
         </w:tc>
@@ -57286,7 +57543,7 @@
                 <w:sz w:val="20"/>
                 <w:szCs w:val="20"/>
               </w:rPr>
-              <w:t xml:space="preserve">4,965</w:t>
+              <w:t xml:space="preserve">4,990</w:t>
             </w:r>
           </w:p>
         </w:tc>
@@ -57326,7 +57583,7 @@
                 <w:sz w:val="20"/>
                 <w:szCs w:val="20"/>
               </w:rPr>
-              <w:t xml:space="preserve">4,736</w:t>
+              <w:t xml:space="preserve">4,761</w:t>
             </w:r>
           </w:p>
         </w:tc>
@@ -57485,7 +57742,7 @@
                 <w:sz w:val="20"/>
                 <w:szCs w:val="20"/>
               </w:rPr>
-              <w:t xml:space="preserve">5,580</w:t>
+              <w:t xml:space="preserve">5,609</w:t>
             </w:r>
           </w:p>
         </w:tc>
@@ -57529,7 +57786,7 @@
                 <w:sz w:val="20"/>
                 <w:szCs w:val="20"/>
               </w:rPr>
-              <w:t xml:space="preserve">5,241</w:t>
+              <w:t xml:space="preserve">5,268</w:t>
             </w:r>
           </w:p>
         </w:tc>
@@ -57713,7 +57970,7 @@
         <w:t xml:space="preserve">g</w:t>
       </w:r>
       <w:r>
-        <w:t xml:space="preserve"> da família têm máximo entre 54,4° e 75,6°, que ocorre mais cedo quanto maior o trecho </w:t>
+        <w:t xml:space="preserve"> da família têm máximo entre 54,8° e 76,0°, que ocorre mais cedo quanto maior o trecho </w:t>
       </w:r>
       <w:r>
         <w:rPr>
@@ -57723,7 +57980,7 @@
         <w:t xml:space="preserve">e</w:t>
       </w:r>
       <w:r>
-        <w:t xml:space="preserve">, e mínimo local entre 152,4° e 169,5° nas curvas que permanecem tracionadas; as curvas se cruzam perto de 134°. Qualitativamente, o modelo reproduz a sequência de máximo, vale e subida perto de 180°, mas com o máximo antes do da patente e o cruzamento das curvas mais cedo. A comparação quantitativa depende da digitalização da Figura 17 da patente, da definição de sua ordenada e dos valores de excentricidade, que a patente não informa.</w:t>
+        <w:t xml:space="preserve">, e mínimo local entre 151,9° e 169,1° nas curvas que permanecem tracionadas; as curvas se cruzam perto de 134°. Qualitativamente, o modelo reproduz a sequência de máximo, vale e subida perto de 180°, mas com o máximo antes do da patente e o cruzamento das curvas mais cedo. A comparação quantitativa depende da digitalização da Figura 17 da patente, da definição de sua ordenada e dos valores de excentricidade, que a patente não informa.</w:t>
       </w:r>
     </w:p>
     <w:p>
@@ -57876,7 +58133,7 @@
         <w:t xml:space="preserve">el</w:t>
       </w:r>
       <w:r>
-        <w:t xml:space="preserve"> = 78,8°, contra 90° do peso, e as curvas normalizadas se cruzam em 11,48° (regime II), 44,76°, 83,72° e 177,42°. Abaixo de 11,48°, a forma do elástico fica acima da do peso, que tende a zero com o braço pendente; entre 11,48° e 44,76°, fica abaixo, com diferença de até −0,154 em 19,1°, perto da transição; entre 44,76° e 83,72°, fica ligeiramente acima, com no máximo +0,044 em 64,3°; entre 83,72° e 177,42°, volta a ficar abaixo, com diferença de até −0,274 em 139,5°; e acima de 177,42° fica de novo acima. Entre as faixas de θ</w:t>
+        <w:t xml:space="preserve"> = 78,8°, contra 89,7° do peso, e as curvas normalizadas se cruzam em 11,24° (regime II), 45,59°, 83,60° e 177,05°. Abaixo de 11,24°, a forma do elástico fica acima da do peso, que tende a zero com o braço pendente; entre 11,24° e 45,59°, fica abaixo, com diferença de até −0,159 em 19,1°, perto da transição; entre 45,59° e 83,60°, fica ligeiramente acima, com no máximo +0,042 em 64,6°; entre 83,60° e 177,05°, volta a ficar abaixo, com diferença de até −0,270 em 139,3°; e acima de 177,05° fica de novo acima. Entre as faixas de θ</w:t>
       </w:r>
       <w:r>
         <w:rPr>
@@ -57899,7 +58156,7 @@
         <w:t xml:space="preserve">0</w:t>
       </w:r>
       <w:r>
-        <w:t xml:space="preserve"> do ajuste de forma, 159,944 mm, o pico normalizado ficaria em 95,6°, e as curvas se cruzariam em 9,44° e 92,87°, com a forma do elástico abaixo da do peso entre 9,44° e 92,87° e acima dela fora desse intervalo. A distribuição angular da assistência depende, portanto, de qual identificação de s</w:t>
+        <w:t xml:space="preserve"> do ajuste de forma, 167,098 mm, o pico normalizado ficaria em 95,1°, e as curvas se cruzariam em 9,24° e 92,48°, com a forma do elástico abaixo da do peso entre 9,24° e 92,48° e acima dela fora desse intervalo. A distribuição angular da assistência depende, portanto, de qual identificação de s</w:t>
       </w:r>
       <w:r>
         <w:rPr>
@@ -58050,7 +58307,7 @@
         <w:t xml:space="preserve">40</w:t>
       </w:r>
       <w:r>
-        <w:t xml:space="preserve">, e por isso a Figura 12 e a Tabela 24 descrevem um cenário de projeto, e não o dispositivo comercial. Nesse cenário, o torque do elástico atinge 4,354 N·m em θ</w:t>
+        <w:t xml:space="preserve">, e por isso a Figura 12 e a Tabela 24 descrevem um cenário de projeto, e não o dispositivo comercial. Nesse cenário, o torque do elástico atinge 4,376 N·m em θ</w:t>
       </w:r>
       <w:r>
         <w:rPr>
@@ -58068,7 +58325,7 @@
         <w:t xml:space="preserve">g</w:t>
       </w:r>
       <w:r>
-        <w:t xml:space="preserve"> vai de 0,35 em 30° a 0,43 em 60°, 0,40 em 90° e 0,20 em 150°, com 0,19 em 170°. A força e a extensão do elástico nesse cenário estão na seção 4B.7.</w:t>
+        <w:t xml:space="preserve"> vai de 0,34 em 30° a 0,43 em 60°, 0,40 em 90° e 0,21 em 150°, com 0,20 em 170°. A força e a extensão do elástico nesse cenário estão na seção 4B.7.</w:t>
       </w:r>
     </w:p>
     <w:p>
@@ -58118,7 +58375,7 @@
         <w:t xml:space="preserve">40</w:t>
       </w:r>
       <w:r>
-        <w:t xml:space="preserve"> = 1,45915 N/mm</w:t>
+        <w:t xml:space="preserve"> = 1,46670 N/mm</w:t>
       </w:r>
       <w:bookmarkEnd w:id="102"/>
     </w:p>
@@ -58610,7 +58867,7 @@
                 <w:sz w:val="20"/>
                 <w:szCs w:val="20"/>
               </w:rPr>
-              <w:t xml:space="preserve">147,26</w:t>
+              <w:t xml:space="preserve">148,02</w:t>
             </w:r>
           </w:p>
         </w:tc>
@@ -58630,7 +58887,7 @@
                 <w:sz w:val="20"/>
                 <w:szCs w:val="20"/>
               </w:rPr>
-              <w:t xml:space="preserve">0,887</w:t>
+              <w:t xml:space="preserve">0,892</w:t>
             </w:r>
           </w:p>
         </w:tc>
@@ -58650,7 +58907,7 @@
                 <w:sz w:val="20"/>
                 <w:szCs w:val="20"/>
               </w:rPr>
-              <w:t xml:space="preserve">1,832</w:t>
+              <w:t xml:space="preserve">1,894</w:t>
             </w:r>
           </w:p>
         </w:tc>
@@ -58673,7 +58930,7 @@
                 <w:sz w:val="20"/>
                 <w:szCs w:val="20"/>
               </w:rPr>
-              <w:t xml:space="preserve">0,484</w:t>
+              <w:t xml:space="preserve">0,471</w:t>
             </w:r>
           </w:p>
         </w:tc>
@@ -58821,7 +59078,7 @@
                 <w:sz w:val="20"/>
                 <w:szCs w:val="20"/>
               </w:rPr>
-              <w:t xml:space="preserve">143,47</w:t>
+              <w:t xml:space="preserve">144,21</w:t>
             </w:r>
           </w:p>
         </w:tc>
@@ -58841,7 +59098,7 @@
                 <w:sz w:val="20"/>
                 <w:szCs w:val="20"/>
               </w:rPr>
-              <w:t xml:space="preserve">1,825</w:t>
+              <w:t xml:space="preserve">1,834</w:t>
             </w:r>
           </w:p>
         </w:tc>
@@ -58861,7 +59118,7 @@
                 <w:sz w:val="20"/>
                 <w:szCs w:val="20"/>
               </w:rPr>
-              <w:t xml:space="preserve">5,275</w:t>
+              <w:t xml:space="preserve">5,348</w:t>
             </w:r>
           </w:p>
         </w:tc>
@@ -58884,7 +59141,7 @@
                 <w:sz w:val="20"/>
                 <w:szCs w:val="20"/>
               </w:rPr>
-              <w:t xml:space="preserve">0,346</w:t>
+              <w:t xml:space="preserve">0,343</w:t>
             </w:r>
           </w:p>
         </w:tc>
@@ -59032,7 +59289,7 @@
                 <w:sz w:val="20"/>
                 <w:szCs w:val="20"/>
               </w:rPr>
-              <w:t xml:space="preserve">126,38</w:t>
+              <w:t xml:space="preserve">127,04</w:t>
             </w:r>
           </w:p>
         </w:tc>
@@ -59052,7 +59309,7 @@
                 <w:sz w:val="20"/>
                 <w:szCs w:val="20"/>
               </w:rPr>
-              <w:t xml:space="preserve">3,952</w:t>
+              <w:t xml:space="preserve">3,973</w:t>
             </w:r>
           </w:p>
         </w:tc>
@@ -59072,7 +59329,7 @@
                 <w:sz w:val="20"/>
                 <w:szCs w:val="20"/>
               </w:rPr>
-              <w:t xml:space="preserve">9,136</w:t>
+              <w:t xml:space="preserve">9,210</w:t>
             </w:r>
           </w:p>
         </w:tc>
@@ -59095,7 +59352,7 @@
                 <w:sz w:val="20"/>
                 <w:szCs w:val="20"/>
               </w:rPr>
-              <w:t xml:space="preserve">0,433</w:t>
+              <w:t xml:space="preserve">0,431</w:t>
             </w:r>
           </w:p>
         </w:tc>
@@ -59243,7 +59500,7 @@
                 <w:sz w:val="20"/>
                 <w:szCs w:val="20"/>
               </w:rPr>
-              <w:t xml:space="preserve">97,34</w:t>
+              <w:t xml:space="preserve">97,84</w:t>
             </w:r>
           </w:p>
         </w:tc>
@@ -59263,7 +59520,7 @@
                 <w:sz w:val="20"/>
                 <w:szCs w:val="20"/>
               </w:rPr>
-              <w:t xml:space="preserve">4,220</w:t>
+              <w:t xml:space="preserve">4,242</w:t>
             </w:r>
           </w:p>
         </w:tc>
@@ -59283,7 +59540,7 @@
                 <w:sz w:val="20"/>
                 <w:szCs w:val="20"/>
               </w:rPr>
-              <w:t xml:space="preserve">10,550</w:t>
+              <w:t xml:space="preserve">10,604</w:t>
             </w:r>
           </w:p>
         </w:tc>
@@ -59454,7 +59711,7 @@
                 <w:sz w:val="20"/>
                 <w:szCs w:val="20"/>
               </w:rPr>
-              <w:t xml:space="preserve">62,79</w:t>
+              <w:t xml:space="preserve">63,11</w:t>
             </w:r>
           </w:p>
         </w:tc>
@@ -59474,7 +59731,7 @@
                 <w:sz w:val="20"/>
                 <w:szCs w:val="20"/>
               </w:rPr>
-              <w:t xml:space="preserve">2,830</w:t>
+              <w:t xml:space="preserve">2,845</w:t>
             </w:r>
           </w:p>
         </w:tc>
@@ -59494,7 +59751,7 @@
                 <w:sz w:val="20"/>
                 <w:szCs w:val="20"/>
               </w:rPr>
-              <w:t xml:space="preserve">9,136</w:t>
+              <w:t xml:space="preserve">9,157</w:t>
             </w:r>
           </w:p>
         </w:tc>
@@ -59517,7 +59774,7 @@
                 <w:sz w:val="20"/>
                 <w:szCs w:val="20"/>
               </w:rPr>
-              <w:t xml:space="preserve">0,310</w:t>
+              <w:t xml:space="preserve">0,311</w:t>
             </w:r>
           </w:p>
         </w:tc>
@@ -59665,7 +59922,7 @@
                 <w:sz w:val="20"/>
                 <w:szCs w:val="20"/>
               </w:rPr>
-              <w:t xml:space="preserve">31,81</w:t>
+              <w:t xml:space="preserve">31,97</w:t>
             </w:r>
           </w:p>
         </w:tc>
@@ -59685,7 +59942,7 @@
                 <w:sz w:val="20"/>
                 <w:szCs w:val="20"/>
               </w:rPr>
-              <w:t xml:space="preserve">1,075</w:t>
+              <w:t xml:space="preserve">1,080</w:t>
             </w:r>
           </w:p>
         </w:tc>
@@ -59705,7 +59962,7 @@
                 <w:sz w:val="20"/>
                 <w:szCs w:val="20"/>
               </w:rPr>
-              <w:t xml:space="preserve">5,275</w:t>
+              <w:t xml:space="preserve">5,256</w:t>
             </w:r>
           </w:p>
         </w:tc>
@@ -59728,7 +59985,7 @@
                 <w:sz w:val="20"/>
                 <w:szCs w:val="20"/>
               </w:rPr>
-              <w:t xml:space="preserve">0,204</w:t>
+              <w:t xml:space="preserve">0,205</w:t>
             </w:r>
           </w:p>
         </w:tc>
@@ -59890,7 +60147,7 @@
                 <w:sz w:val="20"/>
                 <w:szCs w:val="20"/>
               </w:rPr>
-              <w:t xml:space="preserve">18,07</w:t>
+              <w:t xml:space="preserve">18,16</w:t>
             </w:r>
           </w:p>
         </w:tc>
@@ -59912,7 +60169,7 @@
                 <w:sz w:val="20"/>
                 <w:szCs w:val="20"/>
               </w:rPr>
-              <w:t xml:space="preserve">0,350</w:t>
+              <w:t xml:space="preserve">0,352</w:t>
             </w:r>
           </w:p>
         </w:tc>
@@ -59934,7 +60191,7 @@
                 <w:sz w:val="20"/>
                 <w:szCs w:val="20"/>
               </w:rPr>
-              <w:t xml:space="preserve">1,832</w:t>
+              <w:t xml:space="preserve">1,789</w:t>
             </w:r>
           </w:p>
         </w:tc>
@@ -59959,7 +60216,7 @@
                 <w:sz w:val="20"/>
                 <w:szCs w:val="20"/>
               </w:rPr>
-              <w:t xml:space="preserve">0,191</w:t>
+              <w:t xml:space="preserve">0,197</w:t>
             </w:r>
           </w:p>
         </w:tc>
@@ -60016,7 +60273,7 @@
           <w:sz w:val="20"/>
           <w:szCs w:val="20"/>
         </w:rPr>
-        <w:t xml:space="preserve"> considera só o membro humano.</w:t>
+        <w:t xml:space="preserve"> considera o membro humano e o braço do exoesqueleto.</w:t>
       </w:r>
     </w:p>
     <w:p>
@@ -60056,7 +60313,7 @@
         <w:t xml:space="preserve">40</w:t>
       </w:r>
       <w:r>
-        <w:t xml:space="preserve"> no cenário de projeto, torque do peso do membro humano e alvo de 40%</w:t>
+        <w:t xml:space="preserve"> no cenário de projeto, torque do peso do membro e do braço do exoesqueleto e alvo de 40%</w:t>
       </w:r>
       <w:bookmarkEnd w:id="103"/>
     </w:p>
@@ -60152,7 +60409,7 @@
         <w:t xml:space="preserve">el</w:t>
       </w:r>
       <w:r>
-        <w:t xml:space="preserve"> &lt; 19,09°, o modelo mantém torque positivo, 0,887 N·m em 10° no cenário de projeto, porque o elemento 78 está a 7,754 mm do eixo. A Figura 16 da patente mostra razão nula abaixo de cerca de 14°, e a patente prefere o elemento 78 sobre o eixo. A divergência foi mantida no modelo, e não corrigida: ela depende da posição real do elemento 78 e de seu raio de contato, que não estão documentados.</w:t>
+        <w:t xml:space="preserve"> &lt; 19,09°, o modelo mantém torque positivo, 0,892 N·m em 10° no cenário de projeto, porque o elemento 78 está a 7,754 mm do eixo. A Figura 16 da patente mostra razão nula abaixo de cerca de 14°, e a patente prefere o elemento 78 sobre o eixo. A divergência foi mantida no modelo, e não corrigida: ela depende da posição real do elemento 78 e de seu raio de contato, que não estão documentados.</w:t>
       </w:r>
     </w:p>
     <w:p>
@@ -60184,7 +60441,7 @@
         <w:t xml:space="preserve">40</w:t>
       </w:r>
       <w:r>
-        <w:t xml:space="preserve"> varia de 1,43382 a 1,49390 N/mm, e o pico de τ, de 4,346 a 4,365 N·m; as razões τ/τ</w:t>
+        <w:t xml:space="preserve"> varia de 1,44125 a 1,50164 N/mm, e o pico de τ, de 4,368 a 4,388 N·m; as razões τ/τ</w:t>
       </w:r>
       <w:r>
         <w:rPr>
@@ -60213,7 +60470,7 @@
         <w:t xml:space="preserve">0</w:t>
       </w:r>
       <w:r>
-        <w:t xml:space="preserve"> adotado, a forma do elástico fica abaixo da do peso entre 83,72° e 177,42°, de modo que, no modelo, a subcompensação recai sobre a faixa acima da horizontal, onde se concentra o risco documentado por </w:t>
+        <w:t xml:space="preserve"> adotado, a forma do elástico fica abaixo da do peso entre 83,60° e 177,05°, de modo que, no modelo, a subcompensação recai sobre a faixa acima da horizontal, onde se concentra o risco documentado por </w:t>
       </w:r>
       <w:r>
         <w:t xml:space="preserve">van der Molen et al. (2017)</w:t>
@@ -62271,7 +62528,7 @@
                 <w:sz w:val="22"/>
                 <w:szCs w:val="22"/>
               </w:rPr>
-              <w:t xml:space="preserve"> identificados; de 0,561 a 0,939 no ajuste de forma, com s</w:t>
+              <w:t xml:space="preserve"> identificados; de 0,569 a 0,947 no ajuste de forma, com s</w:t>
             </w:r>
             <w:r>
               <w:rPr>
@@ -62372,7 +62629,7 @@
                 <w:sz w:val="22"/>
                 <w:szCs w:val="22"/>
               </w:rPr>
-              <w:t xml:space="preserve">, com força de 14 a 149 N</w:t>
+              <w:t xml:space="preserve">, com força de 14 a 150 N</w:t>
             </w:r>
           </w:p>
         </w:tc>
@@ -62535,7 +62792,7 @@
                 <w:sz w:val="22"/>
                 <w:szCs w:val="22"/>
               </w:rPr>
-              <w:t xml:space="preserve">Só o membro humano, pico de 10,550 N·m</w:t>
+              <w:t xml:space="preserve">Membro humano e braço do exoesqueleto, pico de 10,604 N·m</w:t>
             </w:r>
           </w:p>
         </w:tc>
@@ -62578,7 +62835,7 @@
         <w:t xml:space="preserve">0</w:t>
       </w:r>
       <w:r>
-        <w:t xml:space="preserve"> adotado, a forma normalizada do elástico na EP 3 504 033 B1 acompanha a do peso de 45° a 84° e fica abaixo dela entre 84° e 177°, com diferença normalizada de até −0,274 em 139,5° (seção 4B.9). Como a forma desse segundo perfil depende da geometria do CAD, que não reproduz a Figura 16 da patente, a comparação vale para os modelos, e não para os produtos. A comparação é quantitativa quanto aos ângulos e à forma dos perfis, mas não quanto à magnitude: o torque do primeiro dispositivo está em unidade da patente, o do segundo só chega a N·m por hipótese, e as referências de torque gravitacional são diferentes.</w:t>
+        <w:t xml:space="preserve"> adotado, a forma normalizada do elástico na EP 3 504 033 B1 acompanha a do peso de 46° a 84° e fica abaixo dela entre 84° e 177°, com diferença normalizada de até −0,270 em 139,3° (seção 4B.9). Como a forma desse segundo perfil depende da geometria do CAD, que não reproduz a Figura 16 da patente, a comparação vale para os modelos, e não para os produtos. A comparação é quantitativa quanto aos ângulos e à forma dos perfis, mas não quanto à magnitude: o torque do primeiro dispositivo está em unidade da patente, o do segundo só chega a N·m por hipótese, e as referências de torque gravitacional são diferentes.</w:t>
       </w:r>
     </w:p>
     <w:p>
@@ -62791,7 +63048,7 @@
     </w:p>
     <w:p>
       <w:r>
-        <w:t xml:space="preserve">A forma do torque prevista com a geometria do CAD e o peso do membro humano não reproduz as curvas da patente: o fator comum às três curvas difere do previsto por um fator que vai de 0,38 em 20° a 3,03 em 165°, normalizado em 90°. O ajuste de forma, que deixa s</w:t>
+        <w:t xml:space="preserve">A forma do torque prevista com a geometria do CAD e o peso do membro humano não reproduz as curvas da patente: o fator comum às três curvas difere do previsto por um fator que vai de 0,39 em 20° a 2,97 em 165°, normalizado em 90°. O ajuste de forma, que deixa s</w:t>
       </w:r>
       <w:r>
         <w:rPr>
@@ -62823,7 +63080,7 @@
     </w:p>
     <w:p>
       <w:r>
-        <w:t xml:space="preserve">A rigidez não é identificável pela figura. Sob a hipótese de assistência de 40% do torque do peso em 90°, K = 1,459 N/mm, e o elástico trabalha de 148,9 N com o braço pendente a 14,2 N com o braço elevado, com deformação máxima de 35,5% do comprimento de referência. O torque atinge 4,354 N·m em 78,8°, dentro da faixa de 70° a 120° em que a patente prefere a força máxima, lida aqui como força de apoio proporcional ao torque, e a razão τ/τ</w:t>
+        <w:t xml:space="preserve">A rigidez não é identificável pela figura. Sob a hipótese de assistência de 40% do torque do peso em 90°, K = 1,467 N/mm, e o elástico trabalha de 149,7 N com o braço pendente a 14,3 N com o braço elevado, com deformação máxima de 35,5% do comprimento de referência. O torque atinge 4,376 N·m em 78,8°, dentro da faixa de 70° a 120° em que a patente prefere a força máxima, lida aqui como força de apoio proporcional ao torque, e a razão τ/τ</w:t>
       </w:r>
       <w:r>
         <w:rPr>
@@ -62832,7 +63089,7 @@
         <w:t xml:space="preserve">g</w:t>
       </w:r>
       <w:r>
-        <w:t xml:space="preserve"> vale 0,48 em 10°, 0,35 em 30°, 0,43 em 60°, 0,40 em 90° e 0,20 em 150°, com mínimo de 0,18 em 163,9°. Abaixo da transição de regime, em 19,09°, o modelo ainda entrega torque, porque o elemento de encosto do CAD está a 7,754 mm do eixo.</w:t>
+        <w:t xml:space="preserve"> vale 0,47 em 10°, 0,34 em 30°, 0,43 em 60°, 0,40 em 90° e 0,21 em 150°, com mínimo de 0,18 em 163,4°. Abaixo da transição de regime, em 19,09°, o modelo ainda entrega torque, porque o elemento de encosto do CAD está a 7,754 mm do eixo.</w:t>
       </w:r>
     </w:p>
     <w:p>
@@ -62928,7 +63185,7 @@
         <w:t xml:space="preserve">40</w:t>
       </w:r>
       <w:r>
-        <w:t xml:space="preserve">; as grandezas do CAD não puderam ser conferidas; e a composição inercial e o torque gravitacional incluem só o membro humano, sem as peças do exoesqueleto previstas nos itens a e e. O item i foi cumprido pelo espaçamento entre as curvas. Para esse dispositivo, o objetivo geral foi atingido na parte estática, com o confronto com o torque gravitacional feito pela forma normalizada e, em N·m, apenas no cenário de projeto. As etapas dinâmicas não foram executadas, pelas razões da seção 3B.12.</w:t>
+        <w:t xml:space="preserve">; as grandezas do CAD não puderam ser conferidas; e a composição inercial e o torque gravitacional incluem o membro humano e o braço do exoesqueleto, mas não a alavanca, o elemento 78 e a braçadeira, previstos nos itens a e e. O item i foi cumprido pelo espaçamento entre as curvas. Para esse dispositivo, o objetivo geral foi atingido na parte estática, com o confronto com o torque gravitacional feito pela forma normalizada e, em N·m, apenas no cenário de projeto. As etapas dinâmicas não foram executadas, pelas razões da seção 3B.12.</w:t>
       </w:r>
     </w:p>
     <w:p>
@@ -62951,12 +63208,12 @@
         <w:t xml:space="preserve">0</w:t>
       </w:r>
       <w:r>
-        <w:t xml:space="preserve"> determinado de forma mais robusta, por dispor de três curvas, mas sua forma não é reproduzida pelo modelo do CAD, e o torque só chega a N·m por hipótese. Nos dois casos, o pico de assistência fica afastado do pico gravitacional, acima dele no primeiro (97,5° contra 89,4°) e abaixo no segundo (78,8° contra 90°), e a faixa sem torque com o braço baixado é produzida por meios distintos, uma protuberância no primeiro e o contato com o elemento de encosto no segundo. A comparação proposta na seção 2.11 fica, assim, respondida na parte estática quanto aos ângulos e à forma dos perfis, mas não quanto à magnitude.</w:t>
-      </w:r>
-    </w:p>
-    <w:p>
-      <w:r>
-        <w:t xml:space="preserve">Como continuidade para esse dispositivo, recomenda-se incluir o modelo em CAD no repositório e confirmar nele o sinal do ângulo do braço na pose, a posição do eixo da articulação e o valor de </w:t>
+        <w:t xml:space="preserve"> determinado de forma mais robusta, por dispor de três curvas, mas sua forma não é reproduzida pelo modelo do CAD, e o torque só chega a N·m por hipótese. Nos dois casos, o pico de assistência fica afastado do pico gravitacional, acima dele no primeiro (97,5° contra 89,4°) e abaixo no segundo (78,8° contra 89,7°), e a faixa sem torque com o braço baixado é produzida por meios distintos, uma protuberância no primeiro e o contato com o elemento de encosto no segundo. A comparação proposta na seção 2.11 fica, assim, respondida na parte estática quanto aos ângulos e à forma dos perfis, mas não quanto à magnitude.</w:t>
+      </w:r>
+    </w:p>
+    <w:p>
+      <w:r>
+        <w:t xml:space="preserve">Como continuidade para esse dispositivo, recomenda-se incluir o modelo em CAD no repositório e confirmar nele o sinal do ângulo do braço na pose e o valor de </w:t>
       </w:r>
       <w:r>
         <w:rPr>

</xml_diff>